<commit_message>
Add UML diagrams, PDF report, viva slides and submission checklist
- banking_system.py: --diagram now also writes four UML hierarchy diagrams
  (attributes, constants, methods and overrides read from the source) and
  three association diagrams; new test checks the diagrams name real classes
- Report: UML figures, operations split into commands/batch/queries,
  PDF version added, Word version regenerated
- docs/Viva_Presentation.pptx: 11 slides with speaker notes
- docs/Submission_Checklist.md

Co-Authored-By: Claude Opus 5.5 <noreply@anthropic.com>
Claude-Session: https://claude.ai/code/session_01SahYJB3mwF36eBHRbWfj6o
</commit_message>
<xml_diff>
--- a/docs/Design_Report.docx
+++ b/docs/Design_Report.docx
@@ -271,7 +271,7 @@
         <w:t xml:space="preserve">banking_system.py</w:t>
       </w:r>
       <w:r>
-        <w:t xml:space="preserve"> (Python 3.9+, standard library only). It contains the domain model, a seeded demonstration of 13 scenarios, 48 automated tests and a class-diagram generator.</w:t>
+        <w:t xml:space="preserve"> (Python 3.9+, standard library only). It contains the domain model, a seeded demonstration of 13 scenarios, 49 automated tests and generators for the class and UML diagrams.</w:t>
       </w:r>
     </w:p>
     <w:p>
@@ -299,7 +299,7 @@
           <w:sz w:val="18"/>
           <w:szCs w:val="18"/>
         </w:rPr>
-        <w:t xml:space="preserve">python banking_system.py --test       # run the 48 automated tests</w:t>
+        <w:t xml:space="preserve">python banking_system.py --test       # run the 49 automated tests</w:t>
       </w:r>
     </w:p>
     <w:p>
@@ -327,7 +327,7 @@
           <w:sz w:val="18"/>
           <w:szCs w:val="18"/>
         </w:rPr>
-        <w:t xml:space="preserve">python banking_system.py --diagram docs   # regenerate docs/class_diagram.svg from the code</w:t>
+        <w:t xml:space="preserve">python banking_system.py --diagram docs   # regenerate every diagram (SVG) from the code</w:t>
       </w:r>
     </w:p>
     <w:p/>
@@ -633,30 +633,22 @@
                 <w:sz w:val="18"/>
                 <w:szCs w:val="18"/>
               </w:rPr>
-              <w:t xml:space="preserve">Section 4, </w:t>
-            </w:r>
-            <w:r>
-              <w:rPr>
-                <w:rFonts w:ascii="Consolas" w:cs="Consolas" w:eastAsia="Consolas" w:hAnsi="Consolas"/>
-                <w:sz w:val="18"/>
-                <w:szCs w:val="18"/>
-              </w:rPr>
-              <w:t xml:space="preserve">docs/class_diagram.png</w:t>
-            </w:r>
-            <w:r>
-              <w:rPr>
-                <w:sz w:val="18"/>
-                <w:szCs w:val="18"/>
-              </w:rPr>
-              <w:t xml:space="preserve"> / </w:t>
-            </w:r>
-            <w:r>
-              <w:rPr>
-                <w:rFonts w:ascii="Consolas" w:cs="Consolas" w:eastAsia="Consolas" w:hAnsi="Consolas"/>
-                <w:sz w:val="18"/>
-                <w:szCs w:val="18"/>
-              </w:rPr>
-              <w:t xml:space="preserve">.svg</w:t>
+              <w:t xml:space="preserve">Section 4: overview, four UML hierarchy diagrams, three association diagrams (</w:t>
+            </w:r>
+            <w:r>
+              <w:rPr>
+                <w:rFonts w:ascii="Consolas" w:cs="Consolas" w:eastAsia="Consolas" w:hAnsi="Consolas"/>
+                <w:sz w:val="18"/>
+                <w:szCs w:val="18"/>
+              </w:rPr>
+              <w:t xml:space="preserve">docs/*.png</w:t>
+            </w:r>
+            <w:r>
+              <w:rPr>
+                <w:sz w:val="18"/>
+                <w:szCs w:val="18"/>
+              </w:rPr>
+              <w:t xml:space="preserve">)</w:t>
             </w:r>
           </w:p>
         </w:tc>
@@ -5323,11 +5315,27 @@
     </w:p>
     <w:p>
       <w:r>
+        <w:t xml:space="preserve">All diagrams are generated from the live classes by </w:t>
+      </w:r>
+      <w:r>
+        <w:rPr>
+          <w:rFonts w:ascii="Consolas" w:cs="Consolas" w:eastAsia="Consolas" w:hAnsi="Consolas"/>
+          <w:sz w:val="19"/>
+          <w:szCs w:val="19"/>
+        </w:rPr>
+        <w:t xml:space="preserve">python banking_system.py --diagram docs</w:t>
+      </w:r>
+      <w:r>
+        <w:t xml:space="preserve">: the attributes and methods are read from the source code itself, so the diagrams cannot drift from the implementation.</w:t>
+      </w:r>
+    </w:p>
+    <w:p>
+      <w:r>
         <w:rPr>
           <w:b/>
           <w:bCs/>
         </w:rPr>
-        <w:t xml:space="preserve">Figure 1. Inheritance hierarchies and standalone classes</w:t>
+        <w:t xml:space="preserve">Figure 1. Overview: the four inheritance hierarchies and the standalone classes</w:t>
       </w:r>
       <w:r>
         <w:t xml:space="preserve"> (arrow points to the parent class)</w:t>
@@ -5340,7 +5348,7 @@
       <w:r>
         <w:drawing>
           <wp:inline distT="0" distB="0" distL="0" distR="0">
-            <wp:extent cx="5905500" cy="3409950"/>
+            <wp:extent cx="5905500" cy="3124200"/>
             <wp:effectExtent t="0" r="0" b="0" l="0"/>
             <wp:docPr id="1" name="" descr="" title=""/>
             <wp:cNvGraphicFramePr>
@@ -5365,7 +5373,463 @@
                   <pic:spPr bwMode="auto">
                     <a:xfrm>
                       <a:off x="0" y="0"/>
-                      <a:ext cx="5905500" cy="3409950"/>
+                      <a:ext cx="5905500" cy="3124200"/>
+                    </a:xfrm>
+                    <a:prstGeom prst="rect">
+                      <a:avLst/>
+                    </a:prstGeom>
+                  </pic:spPr>
+                </pic:pic>
+              </a:graphicData>
+            </a:graphic>
+          </wp:inline>
+        </w:drawing>
+      </w:r>
+    </w:p>
+    <w:p>
+      <w:r>
+        <w:rPr>
+          <w:b/>
+          <w:bCs/>
+        </w:rPr>
+        <w:t xml:space="preserve">Figures 2 to 5. UML class diagrams, one per hierarchy.</w:t>
+      </w:r>
+      <w:r>
+        <w:t xml:space="preserve"> Each box shows only what that level </w:t>
+      </w:r>
+      <w:r>
+        <w:rPr>
+          <w:i/>
+          <w:iCs/>
+        </w:rPr>
+        <w:t xml:space="preserve">adds</w:t>
+      </w:r>
+      <w:r>
+        <w:t xml:space="preserve">: </w:t>
+      </w:r>
+      <w:r>
+        <w:rPr>
+          <w:rFonts w:ascii="Consolas" w:cs="Consolas" w:eastAsia="Consolas" w:hAnsi="Consolas"/>
+          <w:sz w:val="19"/>
+          <w:szCs w:val="19"/>
+        </w:rPr>
+        <w:t xml:space="preserve">+</w:t>
+      </w:r>
+      <w:r>
+        <w:t xml:space="preserve"> class constants, </w:t>
+      </w:r>
+      <w:r>
+        <w:rPr>
+          <w:rFonts w:ascii="Consolas" w:cs="Consolas" w:eastAsia="Consolas" w:hAnsi="Consolas"/>
+          <w:sz w:val="19"/>
+          <w:szCs w:val="19"/>
+        </w:rPr>
+        <w:t xml:space="preserve">-</w:t>
+      </w:r>
+      <w:r>
+        <w:t xml:space="preserve"> attributes set in that class's own </w:t>
+      </w:r>
+      <w:r>
+        <w:rPr>
+          <w:rFonts w:ascii="Consolas" w:cs="Consolas" w:eastAsia="Consolas" w:hAnsi="Consolas"/>
+          <w:sz w:val="19"/>
+          <w:szCs w:val="19"/>
+        </w:rPr>
+        <w:t xml:space="preserve">__init__</w:t>
+      </w:r>
+      <w:r>
+        <w:t xml:space="preserve">, and methods. Methods marked </w:t>
+      </w:r>
+      <w:r>
+        <w:rPr>
+          <w:rFonts w:ascii="Consolas" w:cs="Consolas" w:eastAsia="Consolas" w:hAnsi="Consolas"/>
+          <w:sz w:val="19"/>
+          <w:szCs w:val="19"/>
+        </w:rPr>
+        <w:t xml:space="preserve">[override]</w:t>
+      </w:r>
+      <w:r>
+        <w:t xml:space="preserve"> (in red) replace or extend the parent's version. This is the visual answer to "why does the shared information belong at this level?" (section 6).</w:t>
+      </w:r>
+    </w:p>
+    <w:p>
+      <w:r>
+        <w:rPr>
+          <w:b/>
+          <w:bCs/>
+        </w:rPr>
+        <w:t xml:space="preserve">Figure 2. Party hierarchy</w:t>
+      </w:r>
+    </w:p>
+    <w:p>
+      <w:pPr>
+        <w:jc w:val="center"/>
+      </w:pPr>
+      <w:r>
+        <w:drawing>
+          <wp:inline distT="0" distB="0" distL="0" distR="0">
+            <wp:extent cx="5905500" cy="5048250"/>
+            <wp:effectExtent t="0" r="0" b="0" l="0"/>
+            <wp:docPr id="1" name="" descr="" title=""/>
+            <wp:cNvGraphicFramePr>
+              <a:graphicFrameLocks xmlns:a="http://schemas.openxmlformats.org/drawingml/2006/main" noChangeAspect="1"/>
+            </wp:cNvGraphicFramePr>
+            <a:graphic xmlns:a="http://schemas.openxmlformats.org/drawingml/2006/main">
+              <a:graphicData uri="http://schemas.openxmlformats.org/drawingml/2006/picture">
+                <pic:pic xmlns:pic="http://schemas.openxmlformats.org/drawingml/2006/picture">
+                  <pic:nvPicPr>
+                    <pic:cNvPr id="0" name="" descr=""/>
+                    <pic:cNvPicPr>
+                      <a:picLocks noChangeAspect="1" noChangeArrowheads="1"/>
+                    </pic:cNvPicPr>
+                  </pic:nvPicPr>
+                  <pic:blipFill>
+                    <a:blip r:embed="rId9" cstate="none"/>
+                    <a:srcRect/>
+                    <a:stretch>
+                      <a:fillRect/>
+                    </a:stretch>
+                  </pic:blipFill>
+                  <pic:spPr bwMode="auto">
+                    <a:xfrm>
+                      <a:off x="0" y="0"/>
+                      <a:ext cx="5905500" cy="5048250"/>
+                    </a:xfrm>
+                    <a:prstGeom prst="rect">
+                      <a:avLst/>
+                    </a:prstGeom>
+                  </pic:spPr>
+                </pic:pic>
+              </a:graphicData>
+            </a:graphic>
+          </wp:inline>
+        </w:drawing>
+      </w:r>
+    </w:p>
+    <w:p>
+      <w:r>
+        <w:rPr>
+          <w:b/>
+          <w:bCs/>
+        </w:rPr>
+        <w:t xml:space="preserve">Figure 3. Arrangement hierarchy</w:t>
+      </w:r>
+    </w:p>
+    <w:p>
+      <w:pPr>
+        <w:jc w:val="center"/>
+      </w:pPr>
+      <w:r>
+        <w:drawing>
+          <wp:inline distT="0" distB="0" distL="0" distR="0">
+            <wp:extent cx="5905500" cy="5924550"/>
+            <wp:effectExtent t="0" r="0" b="0" l="0"/>
+            <wp:docPr id="1" name="" descr="" title=""/>
+            <wp:cNvGraphicFramePr>
+              <a:graphicFrameLocks xmlns:a="http://schemas.openxmlformats.org/drawingml/2006/main" noChangeAspect="1"/>
+            </wp:cNvGraphicFramePr>
+            <a:graphic xmlns:a="http://schemas.openxmlformats.org/drawingml/2006/main">
+              <a:graphicData uri="http://schemas.openxmlformats.org/drawingml/2006/picture">
+                <pic:pic xmlns:pic="http://schemas.openxmlformats.org/drawingml/2006/picture">
+                  <pic:nvPicPr>
+                    <pic:cNvPr id="0" name="" descr=""/>
+                    <pic:cNvPicPr>
+                      <a:picLocks noChangeAspect="1" noChangeArrowheads="1"/>
+                    </pic:cNvPicPr>
+                  </pic:nvPicPr>
+                  <pic:blipFill>
+                    <a:blip r:embed="rId10" cstate="none"/>
+                    <a:srcRect/>
+                    <a:stretch>
+                      <a:fillRect/>
+                    </a:stretch>
+                  </pic:blipFill>
+                  <pic:spPr bwMode="auto">
+                    <a:xfrm>
+                      <a:off x="0" y="0"/>
+                      <a:ext cx="5905500" cy="5924550"/>
+                    </a:xfrm>
+                    <a:prstGeom prst="rect">
+                      <a:avLst/>
+                    </a:prstGeom>
+                  </pic:spPr>
+                </pic:pic>
+              </a:graphicData>
+            </a:graphic>
+          </wp:inline>
+        </w:drawing>
+      </w:r>
+    </w:p>
+    <w:p>
+      <w:r>
+        <w:rPr>
+          <w:b/>
+          <w:bCs/>
+        </w:rPr>
+        <w:t xml:space="preserve">Figure 4. BankTransaction hierarchy</w:t>
+      </w:r>
+    </w:p>
+    <w:p>
+      <w:pPr>
+        <w:jc w:val="center"/>
+      </w:pPr>
+      <w:r>
+        <w:drawing>
+          <wp:inline distT="0" distB="0" distL="0" distR="0">
+            <wp:extent cx="5905500" cy="1533525"/>
+            <wp:effectExtent t="0" r="0" b="0" l="0"/>
+            <wp:docPr id="1" name="" descr="" title=""/>
+            <wp:cNvGraphicFramePr>
+              <a:graphicFrameLocks xmlns:a="http://schemas.openxmlformats.org/drawingml/2006/main" noChangeAspect="1"/>
+            </wp:cNvGraphicFramePr>
+            <a:graphic xmlns:a="http://schemas.openxmlformats.org/drawingml/2006/main">
+              <a:graphicData uri="http://schemas.openxmlformats.org/drawingml/2006/picture">
+                <pic:pic xmlns:pic="http://schemas.openxmlformats.org/drawingml/2006/picture">
+                  <pic:nvPicPr>
+                    <pic:cNvPr id="0" name="" descr=""/>
+                    <pic:cNvPicPr>
+                      <a:picLocks noChangeAspect="1" noChangeArrowheads="1"/>
+                    </pic:cNvPicPr>
+                  </pic:nvPicPr>
+                  <pic:blipFill>
+                    <a:blip r:embed="rId11" cstate="none"/>
+                    <a:srcRect/>
+                    <a:stretch>
+                      <a:fillRect/>
+                    </a:stretch>
+                  </pic:blipFill>
+                  <pic:spPr bwMode="auto">
+                    <a:xfrm>
+                      <a:off x="0" y="0"/>
+                      <a:ext cx="5905500" cy="1533525"/>
+                    </a:xfrm>
+                    <a:prstGeom prst="rect">
+                      <a:avLst/>
+                    </a:prstGeom>
+                  </pic:spPr>
+                </pic:pic>
+              </a:graphicData>
+            </a:graphic>
+          </wp:inline>
+        </w:drawing>
+      </w:r>
+    </w:p>
+    <w:p>
+      <w:r>
+        <w:rPr>
+          <w:b/>
+          <w:bCs/>
+        </w:rPr>
+        <w:t xml:space="preserve">Figure 5. Case hierarchy</w:t>
+      </w:r>
+    </w:p>
+    <w:p>
+      <w:pPr>
+        <w:jc w:val="center"/>
+      </w:pPr>
+      <w:r>
+        <w:drawing>
+          <wp:inline distT="0" distB="0" distL="0" distR="0">
+            <wp:extent cx="5905500" cy="2438400"/>
+            <wp:effectExtent t="0" r="0" b="0" l="0"/>
+            <wp:docPr id="1" name="" descr="" title=""/>
+            <wp:cNvGraphicFramePr>
+              <a:graphicFrameLocks xmlns:a="http://schemas.openxmlformats.org/drawingml/2006/main" noChangeAspect="1"/>
+            </wp:cNvGraphicFramePr>
+            <a:graphic xmlns:a="http://schemas.openxmlformats.org/drawingml/2006/main">
+              <a:graphicData uri="http://schemas.openxmlformats.org/drawingml/2006/picture">
+                <pic:pic xmlns:pic="http://schemas.openxmlformats.org/drawingml/2006/picture">
+                  <pic:nvPicPr>
+                    <pic:cNvPr id="0" name="" descr=""/>
+                    <pic:cNvPicPr>
+                      <a:picLocks noChangeAspect="1" noChangeArrowheads="1"/>
+                    </pic:cNvPicPr>
+                  </pic:nvPicPr>
+                  <pic:blipFill>
+                    <a:blip r:embed="rId12" cstate="none"/>
+                    <a:srcRect/>
+                    <a:stretch>
+                      <a:fillRect/>
+                    </a:stretch>
+                  </pic:blipFill>
+                  <pic:spPr bwMode="auto">
+                    <a:xfrm>
+                      <a:off x="0" y="0"/>
+                      <a:ext cx="5905500" cy="2438400"/>
+                    </a:xfrm>
+                    <a:prstGeom prst="rect">
+                      <a:avLst/>
+                    </a:prstGeom>
+                  </pic:spPr>
+                </pic:pic>
+              </a:graphicData>
+            </a:graphic>
+          </wp:inline>
+        </w:drawing>
+      </w:r>
+    </w:p>
+    <w:p>
+      <w:r>
+        <w:rPr>
+          <w:b/>
+          <w:bCs/>
+        </w:rPr>
+        <w:t xml:space="preserve">Figures 6 to 8. Associations</w:t>
+      </w:r>
+      <w:r>
+        <w:t xml:space="preserve"> (filled diamond = the owner keeps a dated history of these; arrow = reference)</w:t>
+      </w:r>
+    </w:p>
+    <w:p>
+      <w:r>
+        <w:rPr>
+          <w:b/>
+          <w:bCs/>
+        </w:rPr>
+        <w:t xml:space="preserve">Figure 6. Parties, roles and staff</w:t>
+      </w:r>
+    </w:p>
+    <w:p>
+      <w:pPr>
+        <w:jc w:val="center"/>
+      </w:pPr>
+      <w:r>
+        <w:drawing>
+          <wp:inline distT="0" distB="0" distL="0" distR="0">
+            <wp:extent cx="5905500" cy="2095500"/>
+            <wp:effectExtent t="0" r="0" b="0" l="0"/>
+            <wp:docPr id="1" name="" descr="" title=""/>
+            <wp:cNvGraphicFramePr>
+              <a:graphicFrameLocks xmlns:a="http://schemas.openxmlformats.org/drawingml/2006/main" noChangeAspect="1"/>
+            </wp:cNvGraphicFramePr>
+            <a:graphic xmlns:a="http://schemas.openxmlformats.org/drawingml/2006/main">
+              <a:graphicData uri="http://schemas.openxmlformats.org/drawingml/2006/picture">
+                <pic:pic xmlns:pic="http://schemas.openxmlformats.org/drawingml/2006/picture">
+                  <pic:nvPicPr>
+                    <pic:cNvPr id="0" name="" descr=""/>
+                    <pic:cNvPicPr>
+                      <a:picLocks noChangeAspect="1" noChangeArrowheads="1"/>
+                    </pic:cNvPicPr>
+                  </pic:nvPicPr>
+                  <pic:blipFill>
+                    <a:blip r:embed="rId13" cstate="none"/>
+                    <a:srcRect/>
+                    <a:stretch>
+                      <a:fillRect/>
+                    </a:stretch>
+                  </pic:blipFill>
+                  <pic:spPr bwMode="auto">
+                    <a:xfrm>
+                      <a:off x="0" y="0"/>
+                      <a:ext cx="5905500" cy="2095500"/>
+                    </a:xfrm>
+                    <a:prstGeom prst="rect">
+                      <a:avLst/>
+                    </a:prstGeom>
+                  </pic:spPr>
+                </pic:pic>
+              </a:graphicData>
+            </a:graphic>
+          </wp:inline>
+        </w:drawing>
+      </w:r>
+    </w:p>
+    <w:p>
+      <w:r>
+        <w:rPr>
+          <w:b/>
+          <w:bCs/>
+        </w:rPr>
+        <w:t xml:space="preserve">Figure 7. Products, accounts and payments</w:t>
+      </w:r>
+    </w:p>
+    <w:p>
+      <w:pPr>
+        <w:jc w:val="center"/>
+      </w:pPr>
+      <w:r>
+        <w:drawing>
+          <wp:inline distT="0" distB="0" distL="0" distR="0">
+            <wp:extent cx="5905500" cy="2981325"/>
+            <wp:effectExtent t="0" r="0" b="0" l="0"/>
+            <wp:docPr id="1" name="" descr="" title=""/>
+            <wp:cNvGraphicFramePr>
+              <a:graphicFrameLocks xmlns:a="http://schemas.openxmlformats.org/drawingml/2006/main" noChangeAspect="1"/>
+            </wp:cNvGraphicFramePr>
+            <a:graphic xmlns:a="http://schemas.openxmlformats.org/drawingml/2006/main">
+              <a:graphicData uri="http://schemas.openxmlformats.org/drawingml/2006/picture">
+                <pic:pic xmlns:pic="http://schemas.openxmlformats.org/drawingml/2006/picture">
+                  <pic:nvPicPr>
+                    <pic:cNvPr id="0" name="" descr=""/>
+                    <pic:cNvPicPr>
+                      <a:picLocks noChangeAspect="1" noChangeArrowheads="1"/>
+                    </pic:cNvPicPr>
+                  </pic:nvPicPr>
+                  <pic:blipFill>
+                    <a:blip r:embed="rId14" cstate="none"/>
+                    <a:srcRect/>
+                    <a:stretch>
+                      <a:fillRect/>
+                    </a:stretch>
+                  </pic:blipFill>
+                  <pic:spPr bwMode="auto">
+                    <a:xfrm>
+                      <a:off x="0" y="0"/>
+                      <a:ext cx="5905500" cy="2981325"/>
+                    </a:xfrm>
+                    <a:prstGeom prst="rect">
+                      <a:avLst/>
+                    </a:prstGeom>
+                  </pic:spPr>
+                </pic:pic>
+              </a:graphicData>
+            </a:graphic>
+          </wp:inline>
+        </w:drawing>
+      </w:r>
+    </w:p>
+    <w:p>
+      <w:r>
+        <w:rPr>
+          <w:b/>
+          <w:bCs/>
+        </w:rPr>
+        <w:t xml:space="preserve">Figure 8. Lending and cases</w:t>
+      </w:r>
+    </w:p>
+    <w:p>
+      <w:pPr>
+        <w:jc w:val="center"/>
+      </w:pPr>
+      <w:r>
+        <w:drawing>
+          <wp:inline distT="0" distB="0" distL="0" distR="0">
+            <wp:extent cx="5905500" cy="3705225"/>
+            <wp:effectExtent t="0" r="0" b="0" l="0"/>
+            <wp:docPr id="1" name="" descr="" title=""/>
+            <wp:cNvGraphicFramePr>
+              <a:graphicFrameLocks xmlns:a="http://schemas.openxmlformats.org/drawingml/2006/main" noChangeAspect="1"/>
+            </wp:cNvGraphicFramePr>
+            <a:graphic xmlns:a="http://schemas.openxmlformats.org/drawingml/2006/main">
+              <a:graphicData uri="http://schemas.openxmlformats.org/drawingml/2006/picture">
+                <pic:pic xmlns:pic="http://schemas.openxmlformats.org/drawingml/2006/picture">
+                  <pic:nvPicPr>
+                    <pic:cNvPr id="0" name="" descr=""/>
+                    <pic:cNvPicPr>
+                      <a:picLocks noChangeAspect="1" noChangeArrowheads="1"/>
+                    </pic:cNvPicPr>
+                  </pic:nvPicPr>
+                  <pic:blipFill>
+                    <a:blip r:embed="rId15" cstate="none"/>
+                    <a:srcRect/>
+                    <a:stretch>
+                      <a:fillRect/>
+                    </a:stretch>
+                  </pic:blipFill>
+                  <pic:spPr bwMode="auto">
+                    <a:xfrm>
+                      <a:off x="0" y="0"/>
+                      <a:ext cx="5905500" cy="3705225"/>
                     </a:xfrm>
                     <a:prstGeom prst="rect">
                       <a:avLst/>
@@ -9814,7 +10278,528 @@
         <w:t xml:space="preserve">AuditEvent</w:t>
       </w:r>
       <w:r>
-        <w:t xml:space="preserve">.</w:t>
+        <w:t xml:space="preserve">. The brief says trivial operations do not count, so they are classified honestly:</w:t>
+      </w:r>
+    </w:p>
+    <w:tbl>
+      <w:tblPr>
+        <w:tblW w:type="dxa" w:w="9026"/>
+        <w:tblBorders>
+          <w:top w:val="single" w:color="auto" w:sz="4"/>
+          <w:left w:val="single" w:color="auto" w:sz="4"/>
+          <w:bottom w:val="single" w:color="auto" w:sz="4"/>
+          <w:right w:val="single" w:color="auto" w:sz="4"/>
+          <w:insideH w:val="single" w:color="auto" w:sz="4"/>
+          <w:insideV w:val="single" w:color="auto" w:sz="4"/>
+        </w:tblBorders>
+      </w:tblPr>
+      <w:tblGrid>
+        <w:gridCol w:w="4230"/>
+        <w:gridCol w:w="564"/>
+        <w:gridCol w:w="4232"/>
+      </w:tblGrid>
+      <w:tr>
+        <w:trPr>
+          <w:tblHeader/>
+        </w:trPr>
+        <w:tc>
+          <w:tcPr>
+            <w:tcW w:type="dxa" w:w="4230"/>
+            <w:tcBorders>
+              <w:top w:val="single" w:color="9AA9B8" w:sz="4"/>
+              <w:left w:val="single" w:color="9AA9B8" w:sz="4"/>
+              <w:bottom w:val="single" w:color="9AA9B8" w:sz="4"/>
+              <w:right w:val="single" w:color="9AA9B8" w:sz="4"/>
+            </w:tcBorders>
+            <w:shd w:fill="DDE7F0" w:color="auto" w:val="clear"/>
+            <w:tcMar>
+              <w:top w:type="dxa" w:w="50"/>
+              <w:left w:type="dxa" w:w="90"/>
+              <w:bottom w:type="dxa" w:w="50"/>
+              <w:right w:type="dxa" w:w="90"/>
+            </w:tcMar>
+          </w:tcPr>
+          <w:p>
+            <w:r>
+              <w:rPr>
+                <w:b/>
+                <w:bCs/>
+                <w:sz w:val="18"/>
+                <w:szCs w:val="18"/>
+              </w:rPr>
+              <w:t xml:space="preserve">Kind</w:t>
+            </w:r>
+          </w:p>
+        </w:tc>
+        <w:tc>
+          <w:tcPr>
+            <w:tcW w:type="dxa" w:w="564"/>
+            <w:tcBorders>
+              <w:top w:val="single" w:color="9AA9B8" w:sz="4"/>
+              <w:left w:val="single" w:color="9AA9B8" w:sz="4"/>
+              <w:bottom w:val="single" w:color="9AA9B8" w:sz="4"/>
+              <w:right w:val="single" w:color="9AA9B8" w:sz="4"/>
+            </w:tcBorders>
+            <w:shd w:fill="DDE7F0" w:color="auto" w:val="clear"/>
+            <w:tcMar>
+              <w:top w:type="dxa" w:w="50"/>
+              <w:left w:type="dxa" w:w="90"/>
+              <w:bottom w:type="dxa" w:w="50"/>
+              <w:right w:type="dxa" w:w="90"/>
+            </w:tcMar>
+          </w:tcPr>
+          <w:p>
+            <w:r>
+              <w:rPr>
+                <w:b/>
+                <w:bCs/>
+                <w:sz w:val="18"/>
+                <w:szCs w:val="18"/>
+              </w:rPr>
+              <w:t xml:space="preserve">Count</w:t>
+            </w:r>
+          </w:p>
+        </w:tc>
+        <w:tc>
+          <w:tcPr>
+            <w:tcW w:type="dxa" w:w="4232"/>
+            <w:tcBorders>
+              <w:top w:val="single" w:color="9AA9B8" w:sz="4"/>
+              <w:left w:val="single" w:color="9AA9B8" w:sz="4"/>
+              <w:bottom w:val="single" w:color="9AA9B8" w:sz="4"/>
+              <w:right w:val="single" w:color="9AA9B8" w:sz="4"/>
+            </w:tcBorders>
+            <w:shd w:fill="DDE7F0" w:color="auto" w:val="clear"/>
+            <w:tcMar>
+              <w:top w:type="dxa" w:w="50"/>
+              <w:left w:type="dxa" w:w="90"/>
+              <w:bottom w:type="dxa" w:w="50"/>
+              <w:right w:type="dxa" w:w="90"/>
+            </w:tcMar>
+          </w:tcPr>
+          <w:p>
+            <w:r>
+              <w:rPr>
+                <w:b/>
+                <w:bCs/>
+                <w:sz w:val="18"/>
+                <w:szCs w:val="18"/>
+              </w:rPr>
+              <w:t xml:space="preserve">Operations</w:t>
+            </w:r>
+          </w:p>
+        </w:tc>
+      </w:tr>
+      <w:tr>
+        <w:trPr>
+          <w:tblHeader w:val="false"/>
+        </w:trPr>
+        <w:tc>
+          <w:tcPr>
+            <w:tcW w:type="dxa" w:w="4230"/>
+            <w:tcBorders>
+              <w:top w:val="single" w:color="9AA9B8" w:sz="4"/>
+              <w:left w:val="single" w:color="9AA9B8" w:sz="4"/>
+              <w:bottom w:val="single" w:color="9AA9B8" w:sz="4"/>
+              <w:right w:val="single" w:color="9AA9B8" w:sz="4"/>
+            </w:tcBorders>
+            <w:tcMar>
+              <w:top w:type="dxa" w:w="50"/>
+              <w:left w:type="dxa" w:w="90"/>
+              <w:bottom w:type="dxa" w:w="50"/>
+              <w:right w:type="dxa" w:w="90"/>
+            </w:tcMar>
+          </w:tcPr>
+          <w:p>
+            <w:r>
+              <w:rPr>
+                <w:sz w:val="18"/>
+                <w:szCs w:val="18"/>
+              </w:rPr>
+              <w:t xml:space="preserve">Commands (create, update, assign, approve, cancel, transfer, close, retire, archive, status change)</w:t>
+            </w:r>
+          </w:p>
+        </w:tc>
+        <w:tc>
+          <w:tcPr>
+            <w:tcW w:type="dxa" w:w="564"/>
+            <w:tcBorders>
+              <w:top w:val="single" w:color="9AA9B8" w:sz="4"/>
+              <w:left w:val="single" w:color="9AA9B8" w:sz="4"/>
+              <w:bottom w:val="single" w:color="9AA9B8" w:sz="4"/>
+              <w:right w:val="single" w:color="9AA9B8" w:sz="4"/>
+            </w:tcBorders>
+            <w:tcMar>
+              <w:top w:type="dxa" w:w="50"/>
+              <w:left w:type="dxa" w:w="90"/>
+              <w:bottom w:type="dxa" w:w="50"/>
+              <w:right w:type="dxa" w:w="90"/>
+            </w:tcMar>
+          </w:tcPr>
+          <w:p>
+            <w:r>
+              <w:rPr>
+                <w:sz w:val="18"/>
+                <w:szCs w:val="18"/>
+              </w:rPr>
+              <w:t xml:space="preserve">66</w:t>
+            </w:r>
+          </w:p>
+        </w:tc>
+        <w:tc>
+          <w:tcPr>
+            <w:tcW w:type="dxa" w:w="4232"/>
+            <w:tcBorders>
+              <w:top w:val="single" w:color="9AA9B8" w:sz="4"/>
+              <w:left w:val="single" w:color="9AA9B8" w:sz="4"/>
+              <w:bottom w:val="single" w:color="9AA9B8" w:sz="4"/>
+              <w:right w:val="single" w:color="9AA9B8" w:sz="4"/>
+            </w:tcBorders>
+            <w:tcMar>
+              <w:top w:type="dxa" w:w="50"/>
+              <w:left w:type="dxa" w:w="90"/>
+              <w:bottom w:type="dxa" w:w="50"/>
+              <w:right w:type="dxa" w:w="90"/>
+            </w:tcMar>
+          </w:tcPr>
+          <w:p>
+            <w:r>
+              <w:rPr>
+                <w:sz w:val="18"/>
+                <w:szCs w:val="18"/>
+              </w:rPr>
+              <w:t xml:space="preserve">every operation in the table below except those in the next two rows</w:t>
+            </w:r>
+          </w:p>
+        </w:tc>
+      </w:tr>
+      <w:tr>
+        <w:trPr>
+          <w:tblHeader w:val="false"/>
+        </w:trPr>
+        <w:tc>
+          <w:tcPr>
+            <w:tcW w:type="dxa" w:w="4230"/>
+            <w:tcBorders>
+              <w:top w:val="single" w:color="9AA9B8" w:sz="4"/>
+              <w:left w:val="single" w:color="9AA9B8" w:sz="4"/>
+              <w:bottom w:val="single" w:color="9AA9B8" w:sz="4"/>
+              <w:right w:val="single" w:color="9AA9B8" w:sz="4"/>
+            </w:tcBorders>
+            <w:tcMar>
+              <w:top w:type="dxa" w:w="50"/>
+              <w:left w:type="dxa" w:w="90"/>
+              <w:bottom w:type="dxa" w:w="50"/>
+              <w:right w:type="dxa" w:w="90"/>
+            </w:tcMar>
+          </w:tcPr>
+          <w:p>
+            <w:r>
+              <w:rPr>
+                <w:sz w:val="18"/>
+                <w:szCs w:val="18"/>
+              </w:rPr>
+              <w:t xml:space="preserve">Batch processes run by the simulated clock</w:t>
+            </w:r>
+          </w:p>
+        </w:tc>
+        <w:tc>
+          <w:tcPr>
+            <w:tcW w:type="dxa" w:w="564"/>
+            <w:tcBorders>
+              <w:top w:val="single" w:color="9AA9B8" w:sz="4"/>
+              <w:left w:val="single" w:color="9AA9B8" w:sz="4"/>
+              <w:bottom w:val="single" w:color="9AA9B8" w:sz="4"/>
+              <w:right w:val="single" w:color="9AA9B8" w:sz="4"/>
+            </w:tcBorders>
+            <w:tcMar>
+              <w:top w:type="dxa" w:w="50"/>
+              <w:left w:type="dxa" w:w="90"/>
+              <w:bottom w:type="dxa" w:w="50"/>
+              <w:right w:type="dxa" w:w="90"/>
+            </w:tcMar>
+          </w:tcPr>
+          <w:p>
+            <w:r>
+              <w:rPr>
+                <w:sz w:val="18"/>
+                <w:szCs w:val="18"/>
+              </w:rPr>
+              <w:t xml:space="preserve">5</w:t>
+            </w:r>
+          </w:p>
+        </w:tc>
+        <w:tc>
+          <w:tcPr>
+            <w:tcW w:type="dxa" w:w="4232"/>
+            <w:tcBorders>
+              <w:top w:val="single" w:color="9AA9B8" w:sz="4"/>
+              <w:left w:val="single" w:color="9AA9B8" w:sz="4"/>
+              <w:bottom w:val="single" w:color="9AA9B8" w:sz="4"/>
+              <w:right w:val="single" w:color="9AA9B8" w:sz="4"/>
+            </w:tcBorders>
+            <w:tcMar>
+              <w:top w:type="dxa" w:w="50"/>
+              <w:left w:type="dxa" w:w="90"/>
+              <w:bottom w:type="dxa" w:w="50"/>
+              <w:right w:type="dxa" w:w="90"/>
+            </w:tcMar>
+          </w:tcPr>
+          <w:p>
+            <w:r>
+              <w:rPr>
+                <w:rFonts w:ascii="Consolas" w:cs="Consolas" w:eastAsia="Consolas" w:hAnsi="Consolas"/>
+                <w:sz w:val="18"/>
+                <w:szCs w:val="18"/>
+              </w:rPr>
+              <w:t xml:space="preserve">advance_to</w:t>
+            </w:r>
+            <w:r>
+              <w:rPr>
+                <w:sz w:val="18"/>
+                <w:szCs w:val="18"/>
+              </w:rPr>
+              <w:t xml:space="preserve">, </w:t>
+            </w:r>
+            <w:r>
+              <w:rPr>
+                <w:rFonts w:ascii="Consolas" w:cs="Consolas" w:eastAsia="Consolas" w:hAnsi="Consolas"/>
+                <w:sz w:val="18"/>
+                <w:szCs w:val="18"/>
+              </w:rPr>
+              <w:t xml:space="preserve">run_standing_orders</w:t>
+            </w:r>
+            <w:r>
+              <w:rPr>
+                <w:sz w:val="18"/>
+                <w:szCs w:val="18"/>
+              </w:rPr>
+              <w:t xml:space="preserve">, </w:t>
+            </w:r>
+            <w:r>
+              <w:rPr>
+                <w:rFonts w:ascii="Consolas" w:cs="Consolas" w:eastAsia="Consolas" w:hAnsi="Consolas"/>
+                <w:sz w:val="18"/>
+                <w:szCs w:val="18"/>
+              </w:rPr>
+              <w:t xml:space="preserve">run_arrears_check</w:t>
+            </w:r>
+            <w:r>
+              <w:rPr>
+                <w:sz w:val="18"/>
+                <w:szCs w:val="18"/>
+              </w:rPr>
+              <w:t xml:space="preserve">, </w:t>
+            </w:r>
+            <w:r>
+              <w:rPr>
+                <w:rFonts w:ascii="Consolas" w:cs="Consolas" w:eastAsia="Consolas" w:hAnsi="Consolas"/>
+                <w:sz w:val="18"/>
+                <w:szCs w:val="18"/>
+              </w:rPr>
+              <w:t xml:space="preserve">charge_monthly_fees</w:t>
+            </w:r>
+            <w:r>
+              <w:rPr>
+                <w:sz w:val="18"/>
+                <w:szCs w:val="18"/>
+              </w:rPr>
+              <w:t xml:space="preserve">, </w:t>
+            </w:r>
+            <w:r>
+              <w:rPr>
+                <w:rFonts w:ascii="Consolas" w:cs="Consolas" w:eastAsia="Consolas" w:hAnsi="Consolas"/>
+                <w:sz w:val="18"/>
+                <w:szCs w:val="18"/>
+              </w:rPr>
+              <w:t xml:space="preserve">credit_savings_interest</w:t>
+            </w:r>
+          </w:p>
+        </w:tc>
+      </w:tr>
+      <w:tr>
+        <w:trPr>
+          <w:tblHeader w:val="false"/>
+        </w:trPr>
+        <w:tc>
+          <w:tcPr>
+            <w:tcW w:type="dxa" w:w="4230"/>
+            <w:tcBorders>
+              <w:top w:val="single" w:color="9AA9B8" w:sz="4"/>
+              <w:left w:val="single" w:color="9AA9B8" w:sz="4"/>
+              <w:bottom w:val="single" w:color="9AA9B8" w:sz="4"/>
+              <w:right w:val="single" w:color="9AA9B8" w:sz="4"/>
+            </w:tcBorders>
+            <w:tcMar>
+              <w:top w:type="dxa" w:w="50"/>
+              <w:left w:type="dxa" w:w="90"/>
+              <w:bottom w:type="dxa" w:w="50"/>
+              <w:right w:type="dxa" w:w="90"/>
+            </w:tcMar>
+          </w:tcPr>
+          <w:p>
+            <w:r>
+              <w:rPr>
+                <w:sz w:val="18"/>
+                <w:szCs w:val="18"/>
+              </w:rPr>
+              <w:t xml:space="preserve">Historical queries and reports</w:t>
+            </w:r>
+          </w:p>
+        </w:tc>
+        <w:tc>
+          <w:tcPr>
+            <w:tcW w:type="dxa" w:w="564"/>
+            <w:tcBorders>
+              <w:top w:val="single" w:color="9AA9B8" w:sz="4"/>
+              <w:left w:val="single" w:color="9AA9B8" w:sz="4"/>
+              <w:bottom w:val="single" w:color="9AA9B8" w:sz="4"/>
+              <w:right w:val="single" w:color="9AA9B8" w:sz="4"/>
+            </w:tcBorders>
+            <w:tcMar>
+              <w:top w:type="dxa" w:w="50"/>
+              <w:left w:type="dxa" w:w="90"/>
+              <w:bottom w:type="dxa" w:w="50"/>
+              <w:right w:type="dxa" w:w="90"/>
+            </w:tcMar>
+          </w:tcPr>
+          <w:p>
+            <w:r>
+              <w:rPr>
+                <w:sz w:val="18"/>
+                <w:szCs w:val="18"/>
+              </w:rPr>
+              <w:t xml:space="preserve">7</w:t>
+            </w:r>
+          </w:p>
+        </w:tc>
+        <w:tc>
+          <w:tcPr>
+            <w:tcW w:type="dxa" w:w="4232"/>
+            <w:tcBorders>
+              <w:top w:val="single" w:color="9AA9B8" w:sz="4"/>
+              <w:left w:val="single" w:color="9AA9B8" w:sz="4"/>
+              <w:bottom w:val="single" w:color="9AA9B8" w:sz="4"/>
+              <w:right w:val="single" w:color="9AA9B8" w:sz="4"/>
+            </w:tcBorders>
+            <w:tcMar>
+              <w:top w:type="dxa" w:w="50"/>
+              <w:left w:type="dxa" w:w="90"/>
+              <w:bottom w:type="dxa" w:w="50"/>
+              <w:right w:type="dxa" w:w="90"/>
+            </w:tcMar>
+          </w:tcPr>
+          <w:p>
+            <w:r>
+              <w:rPr>
+                <w:rFonts w:ascii="Consolas" w:cs="Consolas" w:eastAsia="Consolas" w:hAnsi="Consolas"/>
+                <w:sz w:val="18"/>
+                <w:szCs w:val="18"/>
+              </w:rPr>
+              <w:t xml:space="preserve">authority_on</w:t>
+            </w:r>
+            <w:r>
+              <w:rPr>
+                <w:sz w:val="18"/>
+                <w:szCs w:val="18"/>
+              </w:rPr>
+              <w:t xml:space="preserve">, </w:t>
+            </w:r>
+            <w:r>
+              <w:rPr>
+                <w:rFonts w:ascii="Consolas" w:cs="Consolas" w:eastAsia="Consolas" w:hAnsi="Consolas"/>
+                <w:sz w:val="18"/>
+                <w:szCs w:val="18"/>
+              </w:rPr>
+              <w:t xml:space="preserve">capacities_of</w:t>
+            </w:r>
+            <w:r>
+              <w:rPr>
+                <w:sz w:val="18"/>
+                <w:szCs w:val="18"/>
+              </w:rPr>
+              <w:t xml:space="preserve">, </w:t>
+            </w:r>
+            <w:r>
+              <w:rPr>
+                <w:rFonts w:ascii="Consolas" w:cs="Consolas" w:eastAsia="Consolas" w:hAnsi="Consolas"/>
+                <w:sz w:val="18"/>
+                <w:szCs w:val="18"/>
+              </w:rPr>
+              <w:t xml:space="preserve">transaction_story</w:t>
+            </w:r>
+            <w:r>
+              <w:rPr>
+                <w:sz w:val="18"/>
+                <w:szCs w:val="18"/>
+              </w:rPr>
+              <w:t xml:space="preserve">, </w:t>
+            </w:r>
+            <w:r>
+              <w:rPr>
+                <w:rFonts w:ascii="Consolas" w:cs="Consolas" w:eastAsia="Consolas" w:hAnsi="Consolas"/>
+                <w:sz w:val="18"/>
+                <w:szCs w:val="18"/>
+              </w:rPr>
+              <w:t xml:space="preserve">daily_report</w:t>
+            </w:r>
+            <w:r>
+              <w:rPr>
+                <w:sz w:val="18"/>
+                <w:szCs w:val="18"/>
+              </w:rPr>
+              <w:t xml:space="preserve">, </w:t>
+            </w:r>
+            <w:r>
+              <w:rPr>
+                <w:rFonts w:ascii="Consolas" w:cs="Consolas" w:eastAsia="Consolas" w:hAnsi="Consolas"/>
+                <w:sz w:val="18"/>
+                <w:szCs w:val="18"/>
+              </w:rPr>
+              <w:t xml:space="preserve">trial_balance</w:t>
+            </w:r>
+            <w:r>
+              <w:rPr>
+                <w:sz w:val="18"/>
+                <w:szCs w:val="18"/>
+              </w:rPr>
+              <w:t xml:space="preserve">, </w:t>
+            </w:r>
+            <w:r>
+              <w:rPr>
+                <w:rFonts w:ascii="Consolas" w:cs="Consolas" w:eastAsia="Consolas" w:hAnsi="Consolas"/>
+                <w:sz w:val="18"/>
+                <w:szCs w:val="18"/>
+              </w:rPr>
+              <w:t xml:space="preserve">relationship_history</w:t>
+            </w:r>
+            <w:r>
+              <w:rPr>
+                <w:sz w:val="18"/>
+                <w:szCs w:val="18"/>
+              </w:rPr>
+              <w:t xml:space="preserve">, </w:t>
+            </w:r>
+            <w:r>
+              <w:rPr>
+                <w:rFonts w:ascii="Consolas" w:cs="Consolas" w:eastAsia="Consolas" w:hAnsi="Consolas"/>
+                <w:sz w:val="18"/>
+                <w:szCs w:val="18"/>
+              </w:rPr>
+              <w:t xml:space="preserve">party_snapshot</w:t>
+            </w:r>
+          </w:p>
+        </w:tc>
+      </w:tr>
+    </w:tbl>
+    <w:p>
+      <w:pPr>
+        <w:spacing w:after="60"/>
+      </w:pPr>
+    </w:p>
+    <w:p>
+      <w:r>
+        <w:t xml:space="preserve">Even counting only the 66 commands, the model is more than twice the brief's minimum of 30.</w:t>
       </w:r>
     </w:p>
     <w:tbl>
@@ -11529,7 +12514,7 @@
         <w:t xml:space="preserve">Automated tests.</w:t>
       </w:r>
       <w:r>
-        <w:t xml:space="preserve"> 48 independent tests (</w:t>
+        <w:t xml:space="preserve"> 49 independent tests (</w:t>
       </w:r>
       <w:r>
         <w:rPr>
@@ -11551,7 +12536,7 @@
         <w:t xml:space="preserve">docs/Code_Review.md</w:t>
       </w:r>
       <w:r>
-        <w:t xml:space="preserve">), and three tests that check the brief's own requirements from the code: at least 30 classes and 30 operations, multi-level inheritance, and that the whole demonstration runs with a zero trial balance.</w:t>
+        <w:t xml:space="preserve">), and four tests that check the brief's own requirements from the code: at least 30 classes and 30 operations, multi-level inheritance, that the diagrams name only real classes, and that the whole demonstration runs with a zero trial balance.</w:t>
       </w:r>
     </w:p>
     <w:p>

</xml_diff>

<commit_message>
Add desktop GUI (banking_gui.py, pure Python Tkinter)
- Operations console: overview with work queue, 20 operation forms,
  14 guided rule checks, customers with role timelines and time machine,
  accounts, transactions, cards, cases, staff, products and branches,
  books and audit, class model read from the code, scenario log
- Every button calls one Bank operation; refusals show the model's error
- GUI classes use inheritance: Page -> MasterDetailPage -> screens
- Docs: README section, report section 11 with screenshots, viva slide,
  checklist and viva notes

Co-Authored-By: Claude Opus 5.5 <noreply@anthropic.com>
Claude-Session: https://claude.ai/code/session_01SahYJB3mwF36eBHRbWfj6o
</commit_message>
<xml_diff>
--- a/docs/Design_Report.docx
+++ b/docs/Design_Report.docx
@@ -1014,6 +1014,71 @@
                 <w:szCs w:val="18"/>
               </w:rPr>
               <w:t xml:space="preserve">Section 10</w:t>
+            </w:r>
+          </w:p>
+        </w:tc>
+      </w:tr>
+      <w:tr>
+        <w:trPr>
+          <w:tblHeader w:val="false"/>
+        </w:trPr>
+        <w:tc>
+          <w:tcPr>
+            <w:tcW w:type="dxa" w:w="4513"/>
+            <w:tcBorders>
+              <w:top w:val="single" w:color="9AA9B8" w:sz="4"/>
+              <w:left w:val="single" w:color="9AA9B8" w:sz="4"/>
+              <w:bottom w:val="single" w:color="9AA9B8" w:sz="4"/>
+              <w:right w:val="single" w:color="9AA9B8" w:sz="4"/>
+            </w:tcBorders>
+            <w:tcMar>
+              <w:top w:type="dxa" w:w="50"/>
+              <w:left w:type="dxa" w:w="90"/>
+              <w:bottom w:type="dxa" w:w="50"/>
+              <w:right w:type="dxa" w:w="90"/>
+            </w:tcMar>
+          </w:tcPr>
+          <w:p>
+            <w:r>
+              <w:rPr>
+                <w:sz w:val="18"/>
+                <w:szCs w:val="18"/>
+              </w:rPr>
+              <w:t xml:space="preserve">(Optional) user interface</w:t>
+            </w:r>
+          </w:p>
+        </w:tc>
+        <w:tc>
+          <w:tcPr>
+            <w:tcW w:type="dxa" w:w="4513"/>
+            <w:tcBorders>
+              <w:top w:val="single" w:color="9AA9B8" w:sz="4"/>
+              <w:left w:val="single" w:color="9AA9B8" w:sz="4"/>
+              <w:bottom w:val="single" w:color="9AA9B8" w:sz="4"/>
+              <w:right w:val="single" w:color="9AA9B8" w:sz="4"/>
+            </w:tcBorders>
+            <w:tcMar>
+              <w:top w:type="dxa" w:w="50"/>
+              <w:left w:type="dxa" w:w="90"/>
+              <w:bottom w:type="dxa" w:w="50"/>
+              <w:right w:type="dxa" w:w="90"/>
+            </w:tcMar>
+          </w:tcPr>
+          <w:p>
+            <w:r>
+              <w:rPr>
+                <w:sz w:val="18"/>
+                <w:szCs w:val="18"/>
+              </w:rPr>
+              <w:t xml:space="preserve">Section 11: desktop GUI in </w:t>
+            </w:r>
+            <w:r>
+              <w:rPr>
+                <w:rFonts w:ascii="Consolas" w:cs="Consolas" w:eastAsia="Consolas" w:hAnsi="Consolas"/>
+                <w:sz w:val="18"/>
+                <w:szCs w:val="18"/>
+              </w:rPr>
+              <w:t xml:space="preserve">banking_gui.py</w:t>
             </w:r>
           </w:p>
         </w:tc>
@@ -20955,6 +21020,1616 @@
       </w:r>
       <w:r>
         <w:t xml:space="preserve"> value class and FX transaction types.</w:t>
+      </w:r>
+    </w:p>
+    <w:p>
+      <w:pPr>
+        <w:pStyle w:val="Heading1"/>
+        <w:pageBreakBefore/>
+      </w:pPr>
+      <w:r>
+        <w:t xml:space="preserve">11. Desktop operations console (optional GUI)</w:t>
+      </w:r>
+    </w:p>
+    <w:p>
+      <w:r>
+        <w:t xml:space="preserve">The brief assesses classes and inheritance, so the interface was built to make the model visible and testable, not to add business logic. </w:t>
+      </w:r>
+      <w:r>
+        <w:rPr>
+          <w:rFonts w:ascii="Consolas" w:cs="Consolas" w:eastAsia="Consolas" w:hAnsi="Consolas"/>
+          <w:sz w:val="19"/>
+          <w:szCs w:val="19"/>
+        </w:rPr>
+        <w:t xml:space="preserve">banking_gui.py</w:t>
+      </w:r>
+      <w:r>
+        <w:t xml:space="preserve"> is a desktop console in pure Python (Tkinter and ttk, from the standard library). It imports </w:t>
+      </w:r>
+      <w:r>
+        <w:rPr>
+          <w:rFonts w:ascii="Consolas" w:cs="Consolas" w:eastAsia="Consolas" w:hAnsi="Consolas"/>
+          <w:sz w:val="19"/>
+          <w:szCs w:val="19"/>
+        </w:rPr>
+        <w:t xml:space="preserve">banking_system.py</w:t>
+      </w:r>
+      <w:r>
+        <w:t xml:space="preserve"> and does not change it.</w:t>
+      </w:r>
+    </w:p>
+    <w:p>
+      <w:r>
+        <w:rPr>
+          <w:b/>
+          <w:bCs/>
+        </w:rPr>
+        <w:t xml:space="preserve">Two rules keep it honest.</w:t>
+      </w:r>
+      <w:r>
+        <w:t xml:space="preserve"> Every button calls exactly one </w:t>
+      </w:r>
+      <w:r>
+        <w:rPr>
+          <w:rFonts w:ascii="Consolas" w:cs="Consolas" w:eastAsia="Consolas" w:hAnsi="Consolas"/>
+          <w:sz w:val="19"/>
+          <w:szCs w:val="19"/>
+        </w:rPr>
+        <w:t xml:space="preserve">Bank</w:t>
+      </w:r>
+      <w:r>
+        <w:t xml:space="preserve"> operation, so every rule, refusal and audit event is the model's own. A refusal is shown with the model's error class (for example </w:t>
+      </w:r>
+      <w:r>
+        <w:rPr>
+          <w:rFonts w:ascii="Consolas" w:cs="Consolas" w:eastAsia="Consolas" w:hAnsi="Consolas"/>
+          <w:sz w:val="19"/>
+          <w:szCs w:val="19"/>
+        </w:rPr>
+        <w:t xml:space="preserve">AuthorityError</w:t>
+      </w:r>
+      <w:r>
+        <w:t xml:space="preserve">) and message, and a refused payment is shown as "refused, kept on record" because the model keeps it as FAILED or DECLINED.</w:t>
+      </w:r>
+    </w:p>
+    <w:p>
+      <w:r>
+        <w:rPr>
+          <w:b/>
+          <w:bCs/>
+        </w:rPr>
+        <w:t xml:space="preserve">It is built with the same OOP ideas it demonstrates.</w:t>
+      </w:r>
+    </w:p>
+    <w:tbl>
+      <w:tblPr>
+        <w:tblW w:type="dxa" w:w="9026"/>
+        <w:tblBorders>
+          <w:top w:val="single" w:color="auto" w:sz="4"/>
+          <w:left w:val="single" w:color="auto" w:sz="4"/>
+          <w:bottom w:val="single" w:color="auto" w:sz="4"/>
+          <w:right w:val="single" w:color="auto" w:sz="4"/>
+          <w:insideH w:val="single" w:color="auto" w:sz="4"/>
+          <w:insideV w:val="single" w:color="auto" w:sz="4"/>
+        </w:tblBorders>
+      </w:tblPr>
+      <w:tblGrid>
+        <w:gridCol w:w="3924"/>
+        <w:gridCol w:w="1177"/>
+        <w:gridCol w:w="3925"/>
+      </w:tblGrid>
+      <w:tr>
+        <w:trPr>
+          <w:tblHeader/>
+        </w:trPr>
+        <w:tc>
+          <w:tcPr>
+            <w:tcW w:type="dxa" w:w="3924"/>
+            <w:tcBorders>
+              <w:top w:val="single" w:color="9AA9B8" w:sz="4"/>
+              <w:left w:val="single" w:color="9AA9B8" w:sz="4"/>
+              <w:bottom w:val="single" w:color="9AA9B8" w:sz="4"/>
+              <w:right w:val="single" w:color="9AA9B8" w:sz="4"/>
+            </w:tcBorders>
+            <w:shd w:fill="DDE7F0" w:color="auto" w:val="clear"/>
+            <w:tcMar>
+              <w:top w:type="dxa" w:w="50"/>
+              <w:left w:type="dxa" w:w="90"/>
+              <w:bottom w:type="dxa" w:w="50"/>
+              <w:right w:type="dxa" w:w="90"/>
+            </w:tcMar>
+          </w:tcPr>
+          <w:p>
+            <w:r>
+              <w:rPr>
+                <w:b/>
+                <w:bCs/>
+                <w:sz w:val="18"/>
+                <w:szCs w:val="18"/>
+              </w:rPr>
+              <w:t xml:space="preserve">Class</w:t>
+            </w:r>
+          </w:p>
+        </w:tc>
+        <w:tc>
+          <w:tcPr>
+            <w:tcW w:type="dxa" w:w="1177"/>
+            <w:tcBorders>
+              <w:top w:val="single" w:color="9AA9B8" w:sz="4"/>
+              <w:left w:val="single" w:color="9AA9B8" w:sz="4"/>
+              <w:bottom w:val="single" w:color="9AA9B8" w:sz="4"/>
+              <w:right w:val="single" w:color="9AA9B8" w:sz="4"/>
+            </w:tcBorders>
+            <w:shd w:fill="DDE7F0" w:color="auto" w:val="clear"/>
+            <w:tcMar>
+              <w:top w:type="dxa" w:w="50"/>
+              <w:left w:type="dxa" w:w="90"/>
+              <w:bottom w:type="dxa" w:w="50"/>
+              <w:right w:type="dxa" w:w="90"/>
+            </w:tcMar>
+          </w:tcPr>
+          <w:p>
+            <w:r>
+              <w:rPr>
+                <w:b/>
+                <w:bCs/>
+                <w:sz w:val="18"/>
+                <w:szCs w:val="18"/>
+              </w:rPr>
+              <w:t xml:space="preserve">Inherits from</w:t>
+            </w:r>
+          </w:p>
+        </w:tc>
+        <w:tc>
+          <w:tcPr>
+            <w:tcW w:type="dxa" w:w="3925"/>
+            <w:tcBorders>
+              <w:top w:val="single" w:color="9AA9B8" w:sz="4"/>
+              <w:left w:val="single" w:color="9AA9B8" w:sz="4"/>
+              <w:bottom w:val="single" w:color="9AA9B8" w:sz="4"/>
+              <w:right w:val="single" w:color="9AA9B8" w:sz="4"/>
+            </w:tcBorders>
+            <w:shd w:fill="DDE7F0" w:color="auto" w:val="clear"/>
+            <w:tcMar>
+              <w:top w:type="dxa" w:w="50"/>
+              <w:left w:type="dxa" w:w="90"/>
+              <w:bottom w:type="dxa" w:w="50"/>
+              <w:right w:type="dxa" w:w="90"/>
+            </w:tcMar>
+          </w:tcPr>
+          <w:p>
+            <w:r>
+              <w:rPr>
+                <w:b/>
+                <w:bCs/>
+                <w:sz w:val="18"/>
+                <w:szCs w:val="18"/>
+              </w:rPr>
+              <w:t xml:space="preserve">Role</w:t>
+            </w:r>
+          </w:p>
+        </w:tc>
+      </w:tr>
+      <w:tr>
+        <w:trPr>
+          <w:tblHeader w:val="false"/>
+        </w:trPr>
+        <w:tc>
+          <w:tcPr>
+            <w:tcW w:type="dxa" w:w="3924"/>
+            <w:tcBorders>
+              <w:top w:val="single" w:color="9AA9B8" w:sz="4"/>
+              <w:left w:val="single" w:color="9AA9B8" w:sz="4"/>
+              <w:bottom w:val="single" w:color="9AA9B8" w:sz="4"/>
+              <w:right w:val="single" w:color="9AA9B8" w:sz="4"/>
+            </w:tcBorders>
+            <w:tcMar>
+              <w:top w:type="dxa" w:w="50"/>
+              <w:left w:type="dxa" w:w="90"/>
+              <w:bottom w:type="dxa" w:w="50"/>
+              <w:right w:type="dxa" w:w="90"/>
+            </w:tcMar>
+          </w:tcPr>
+          <w:p>
+            <w:r>
+              <w:rPr>
+                <w:rFonts w:ascii="Consolas" w:cs="Consolas" w:eastAsia="Consolas" w:hAnsi="Consolas"/>
+                <w:sz w:val="18"/>
+                <w:szCs w:val="18"/>
+              </w:rPr>
+              <w:t xml:space="preserve">BankingApp</w:t>
+            </w:r>
+          </w:p>
+        </w:tc>
+        <w:tc>
+          <w:tcPr>
+            <w:tcW w:type="dxa" w:w="1177"/>
+            <w:tcBorders>
+              <w:top w:val="single" w:color="9AA9B8" w:sz="4"/>
+              <w:left w:val="single" w:color="9AA9B8" w:sz="4"/>
+              <w:bottom w:val="single" w:color="9AA9B8" w:sz="4"/>
+              <w:right w:val="single" w:color="9AA9B8" w:sz="4"/>
+            </w:tcBorders>
+            <w:tcMar>
+              <w:top w:type="dxa" w:w="50"/>
+              <w:left w:type="dxa" w:w="90"/>
+              <w:bottom w:type="dxa" w:w="50"/>
+              <w:right w:type="dxa" w:w="90"/>
+            </w:tcMar>
+          </w:tcPr>
+          <w:p>
+            <w:r>
+              <w:rPr>
+                <w:rFonts w:ascii="Consolas" w:cs="Consolas" w:eastAsia="Consolas" w:hAnsi="Consolas"/>
+                <w:sz w:val="18"/>
+                <w:szCs w:val="18"/>
+              </w:rPr>
+              <w:t xml:space="preserve">tk.Tk</w:t>
+            </w:r>
+          </w:p>
+        </w:tc>
+        <w:tc>
+          <w:tcPr>
+            <w:tcW w:type="dxa" w:w="3925"/>
+            <w:tcBorders>
+              <w:top w:val="single" w:color="9AA9B8" w:sz="4"/>
+              <w:left w:val="single" w:color="9AA9B8" w:sz="4"/>
+              <w:bottom w:val="single" w:color="9AA9B8" w:sz="4"/>
+              <w:right w:val="single" w:color="9AA9B8" w:sz="4"/>
+            </w:tcBorders>
+            <w:tcMar>
+              <w:top w:type="dxa" w:w="50"/>
+              <w:left w:type="dxa" w:w="90"/>
+              <w:bottom w:type="dxa" w:w="50"/>
+              <w:right w:type="dxa" w:w="90"/>
+            </w:tcMar>
+          </w:tcPr>
+          <w:p>
+            <w:r>
+              <w:rPr>
+                <w:sz w:val="18"/>
+                <w:szCs w:val="18"/>
+              </w:rPr>
+              <w:t xml:space="preserve">Window, sidebar, top bar (business date, books status, advance day or month, reset), outcome banner</w:t>
+            </w:r>
+          </w:p>
+        </w:tc>
+      </w:tr>
+      <w:tr>
+        <w:trPr>
+          <w:tblHeader w:val="false"/>
+        </w:trPr>
+        <w:tc>
+          <w:tcPr>
+            <w:tcW w:type="dxa" w:w="3924"/>
+            <w:tcBorders>
+              <w:top w:val="single" w:color="9AA9B8" w:sz="4"/>
+              <w:left w:val="single" w:color="9AA9B8" w:sz="4"/>
+              <w:bottom w:val="single" w:color="9AA9B8" w:sz="4"/>
+              <w:right w:val="single" w:color="9AA9B8" w:sz="4"/>
+            </w:tcBorders>
+            <w:tcMar>
+              <w:top w:type="dxa" w:w="50"/>
+              <w:left w:type="dxa" w:w="90"/>
+              <w:bottom w:type="dxa" w:w="50"/>
+              <w:right w:type="dxa" w:w="90"/>
+            </w:tcMar>
+          </w:tcPr>
+          <w:p>
+            <w:r>
+              <w:rPr>
+                <w:rFonts w:ascii="Consolas" w:cs="Consolas" w:eastAsia="Consolas" w:hAnsi="Consolas"/>
+                <w:sz w:val="18"/>
+                <w:szCs w:val="18"/>
+              </w:rPr>
+              <w:t xml:space="preserve">Page</w:t>
+            </w:r>
+          </w:p>
+        </w:tc>
+        <w:tc>
+          <w:tcPr>
+            <w:tcW w:type="dxa" w:w="1177"/>
+            <w:tcBorders>
+              <w:top w:val="single" w:color="9AA9B8" w:sz="4"/>
+              <w:left w:val="single" w:color="9AA9B8" w:sz="4"/>
+              <w:bottom w:val="single" w:color="9AA9B8" w:sz="4"/>
+              <w:right w:val="single" w:color="9AA9B8" w:sz="4"/>
+            </w:tcBorders>
+            <w:tcMar>
+              <w:top w:type="dxa" w:w="50"/>
+              <w:left w:type="dxa" w:w="90"/>
+              <w:bottom w:type="dxa" w:w="50"/>
+              <w:right w:type="dxa" w:w="90"/>
+            </w:tcMar>
+          </w:tcPr>
+          <w:p>
+            <w:r>
+              <w:rPr>
+                <w:rFonts w:ascii="Consolas" w:cs="Consolas" w:eastAsia="Consolas" w:hAnsi="Consolas"/>
+                <w:sz w:val="18"/>
+                <w:szCs w:val="18"/>
+              </w:rPr>
+              <w:t xml:space="preserve">ttk.Frame</w:t>
+            </w:r>
+          </w:p>
+        </w:tc>
+        <w:tc>
+          <w:tcPr>
+            <w:tcW w:type="dxa" w:w="3925"/>
+            <w:tcBorders>
+              <w:top w:val="single" w:color="9AA9B8" w:sz="4"/>
+              <w:left w:val="single" w:color="9AA9B8" w:sz="4"/>
+              <w:bottom w:val="single" w:color="9AA9B8" w:sz="4"/>
+              <w:right w:val="single" w:color="9AA9B8" w:sz="4"/>
+            </w:tcBorders>
+            <w:tcMar>
+              <w:top w:type="dxa" w:w="50"/>
+              <w:left w:type="dxa" w:w="90"/>
+              <w:bottom w:type="dxa" w:w="50"/>
+              <w:right w:type="dxa" w:w="90"/>
+            </w:tcMar>
+          </w:tcPr>
+          <w:p>
+            <w:r>
+              <w:rPr>
+                <w:sz w:val="18"/>
+                <w:szCs w:val="18"/>
+              </w:rPr>
+              <w:t xml:space="preserve">A screen with a title, </w:t>
+            </w:r>
+            <w:r>
+              <w:rPr>
+                <w:rFonts w:ascii="Consolas" w:cs="Consolas" w:eastAsia="Consolas" w:hAnsi="Consolas"/>
+                <w:sz w:val="18"/>
+                <w:szCs w:val="18"/>
+              </w:rPr>
+              <w:t xml:space="preserve">build()</w:t>
+            </w:r>
+            <w:r>
+              <w:rPr>
+                <w:sz w:val="18"/>
+                <w:szCs w:val="18"/>
+              </w:rPr>
+              <w:t xml:space="preserve"> and </w:t>
+            </w:r>
+            <w:r>
+              <w:rPr>
+                <w:rFonts w:ascii="Consolas" w:cs="Consolas" w:eastAsia="Consolas" w:hAnsi="Consolas"/>
+                <w:sz w:val="18"/>
+                <w:szCs w:val="18"/>
+              </w:rPr>
+              <w:t xml:space="preserve">refresh()</w:t>
+            </w:r>
+          </w:p>
+        </w:tc>
+      </w:tr>
+      <w:tr>
+        <w:trPr>
+          <w:tblHeader w:val="false"/>
+        </w:trPr>
+        <w:tc>
+          <w:tcPr>
+            <w:tcW w:type="dxa" w:w="3924"/>
+            <w:tcBorders>
+              <w:top w:val="single" w:color="9AA9B8" w:sz="4"/>
+              <w:left w:val="single" w:color="9AA9B8" w:sz="4"/>
+              <w:bottom w:val="single" w:color="9AA9B8" w:sz="4"/>
+              <w:right w:val="single" w:color="9AA9B8" w:sz="4"/>
+            </w:tcBorders>
+            <w:tcMar>
+              <w:top w:type="dxa" w:w="50"/>
+              <w:left w:type="dxa" w:w="90"/>
+              <w:bottom w:type="dxa" w:w="50"/>
+              <w:right w:type="dxa" w:w="90"/>
+            </w:tcMar>
+          </w:tcPr>
+          <w:p>
+            <w:r>
+              <w:rPr>
+                <w:rFonts w:ascii="Consolas" w:cs="Consolas" w:eastAsia="Consolas" w:hAnsi="Consolas"/>
+                <w:sz w:val="18"/>
+                <w:szCs w:val="18"/>
+              </w:rPr>
+              <w:t xml:space="preserve">MasterDetailPage</w:t>
+            </w:r>
+          </w:p>
+        </w:tc>
+        <w:tc>
+          <w:tcPr>
+            <w:tcW w:type="dxa" w:w="1177"/>
+            <w:tcBorders>
+              <w:top w:val="single" w:color="9AA9B8" w:sz="4"/>
+              <w:left w:val="single" w:color="9AA9B8" w:sz="4"/>
+              <w:bottom w:val="single" w:color="9AA9B8" w:sz="4"/>
+              <w:right w:val="single" w:color="9AA9B8" w:sz="4"/>
+            </w:tcBorders>
+            <w:tcMar>
+              <w:top w:type="dxa" w:w="50"/>
+              <w:left w:type="dxa" w:w="90"/>
+              <w:bottom w:type="dxa" w:w="50"/>
+              <w:right w:type="dxa" w:w="90"/>
+            </w:tcMar>
+          </w:tcPr>
+          <w:p>
+            <w:r>
+              <w:rPr>
+                <w:rFonts w:ascii="Consolas" w:cs="Consolas" w:eastAsia="Consolas" w:hAnsi="Consolas"/>
+                <w:sz w:val="18"/>
+                <w:szCs w:val="18"/>
+              </w:rPr>
+              <w:t xml:space="preserve">Page</w:t>
+            </w:r>
+          </w:p>
+        </w:tc>
+        <w:tc>
+          <w:tcPr>
+            <w:tcW w:type="dxa" w:w="3925"/>
+            <w:tcBorders>
+              <w:top w:val="single" w:color="9AA9B8" w:sz="4"/>
+              <w:left w:val="single" w:color="9AA9B8" w:sz="4"/>
+              <w:bottom w:val="single" w:color="9AA9B8" w:sz="4"/>
+              <w:right w:val="single" w:color="9AA9B8" w:sz="4"/>
+            </w:tcBorders>
+            <w:tcMar>
+              <w:top w:type="dxa" w:w="50"/>
+              <w:left w:type="dxa" w:w="90"/>
+              <w:bottom w:type="dxa" w:w="50"/>
+              <w:right w:type="dxa" w:w="90"/>
+            </w:tcMar>
+          </w:tcPr>
+          <w:p>
+            <w:r>
+              <w:rPr>
+                <w:sz w:val="18"/>
+                <w:szCs w:val="18"/>
+              </w:rPr>
+              <w:t xml:space="preserve">A list on the left and the selected record's details on the right</w:t>
+            </w:r>
+          </w:p>
+        </w:tc>
+      </w:tr>
+      <w:tr>
+        <w:trPr>
+          <w:tblHeader w:val="false"/>
+        </w:trPr>
+        <w:tc>
+          <w:tcPr>
+            <w:tcW w:type="dxa" w:w="3924"/>
+            <w:tcBorders>
+              <w:top w:val="single" w:color="9AA9B8" w:sz="4"/>
+              <w:left w:val="single" w:color="9AA9B8" w:sz="4"/>
+              <w:bottom w:val="single" w:color="9AA9B8" w:sz="4"/>
+              <w:right w:val="single" w:color="9AA9B8" w:sz="4"/>
+            </w:tcBorders>
+            <w:tcMar>
+              <w:top w:type="dxa" w:w="50"/>
+              <w:left w:type="dxa" w:w="90"/>
+              <w:bottom w:type="dxa" w:w="50"/>
+              <w:right w:type="dxa" w:w="90"/>
+            </w:tcMar>
+          </w:tcPr>
+          <w:p>
+            <w:r>
+              <w:rPr>
+                <w:rFonts w:ascii="Consolas" w:cs="Consolas" w:eastAsia="Consolas" w:hAnsi="Consolas"/>
+                <w:sz w:val="18"/>
+                <w:szCs w:val="18"/>
+              </w:rPr>
+              <w:t xml:space="preserve">CustomersPage</w:t>
+            </w:r>
+            <w:r>
+              <w:rPr>
+                <w:sz w:val="18"/>
+                <w:szCs w:val="18"/>
+              </w:rPr>
+              <w:t xml:space="preserve">, </w:t>
+            </w:r>
+            <w:r>
+              <w:rPr>
+                <w:rFonts w:ascii="Consolas" w:cs="Consolas" w:eastAsia="Consolas" w:hAnsi="Consolas"/>
+                <w:sz w:val="18"/>
+                <w:szCs w:val="18"/>
+              </w:rPr>
+              <w:t xml:space="preserve">AccountsPage</w:t>
+            </w:r>
+            <w:r>
+              <w:rPr>
+                <w:sz w:val="18"/>
+                <w:szCs w:val="18"/>
+              </w:rPr>
+              <w:t xml:space="preserve">, </w:t>
+            </w:r>
+            <w:r>
+              <w:rPr>
+                <w:rFonts w:ascii="Consolas" w:cs="Consolas" w:eastAsia="Consolas" w:hAnsi="Consolas"/>
+                <w:sz w:val="18"/>
+                <w:szCs w:val="18"/>
+              </w:rPr>
+              <w:t xml:space="preserve">TransactionsPage</w:t>
+            </w:r>
+            <w:r>
+              <w:rPr>
+                <w:sz w:val="18"/>
+                <w:szCs w:val="18"/>
+              </w:rPr>
+              <w:t xml:space="preserve">, </w:t>
+            </w:r>
+            <w:r>
+              <w:rPr>
+                <w:rFonts w:ascii="Consolas" w:cs="Consolas" w:eastAsia="Consolas" w:hAnsi="Consolas"/>
+                <w:sz w:val="18"/>
+                <w:szCs w:val="18"/>
+              </w:rPr>
+              <w:t xml:space="preserve">CardsPage</w:t>
+            </w:r>
+            <w:r>
+              <w:rPr>
+                <w:sz w:val="18"/>
+                <w:szCs w:val="18"/>
+              </w:rPr>
+              <w:t xml:space="preserve">, </w:t>
+            </w:r>
+            <w:r>
+              <w:rPr>
+                <w:rFonts w:ascii="Consolas" w:cs="Consolas" w:eastAsia="Consolas" w:hAnsi="Consolas"/>
+                <w:sz w:val="18"/>
+                <w:szCs w:val="18"/>
+              </w:rPr>
+              <w:t xml:space="preserve">CasesPage</w:t>
+            </w:r>
+            <w:r>
+              <w:rPr>
+                <w:sz w:val="18"/>
+                <w:szCs w:val="18"/>
+              </w:rPr>
+              <w:t xml:space="preserve">, </w:t>
+            </w:r>
+            <w:r>
+              <w:rPr>
+                <w:rFonts w:ascii="Consolas" w:cs="Consolas" w:eastAsia="Consolas" w:hAnsi="Consolas"/>
+                <w:sz w:val="18"/>
+                <w:szCs w:val="18"/>
+              </w:rPr>
+              <w:t xml:space="preserve">StaffPage</w:t>
+            </w:r>
+            <w:r>
+              <w:rPr>
+                <w:sz w:val="18"/>
+                <w:szCs w:val="18"/>
+              </w:rPr>
+              <w:t xml:space="preserve">, </w:t>
+            </w:r>
+            <w:r>
+              <w:rPr>
+                <w:rFonts w:ascii="Consolas" w:cs="Consolas" w:eastAsia="Consolas" w:hAnsi="Consolas"/>
+                <w:sz w:val="18"/>
+                <w:szCs w:val="18"/>
+              </w:rPr>
+              <w:t xml:space="preserve">ProductsPage</w:t>
+            </w:r>
+            <w:r>
+              <w:rPr>
+                <w:sz w:val="18"/>
+                <w:szCs w:val="18"/>
+              </w:rPr>
+              <w:t xml:space="preserve">, </w:t>
+            </w:r>
+            <w:r>
+              <w:rPr>
+                <w:rFonts w:ascii="Consolas" w:cs="Consolas" w:eastAsia="Consolas" w:hAnsi="Consolas"/>
+                <w:sz w:val="18"/>
+                <w:szCs w:val="18"/>
+              </w:rPr>
+              <w:t xml:space="preserve">ClassModelPage</w:t>
+            </w:r>
+          </w:p>
+        </w:tc>
+        <w:tc>
+          <w:tcPr>
+            <w:tcW w:type="dxa" w:w="1177"/>
+            <w:tcBorders>
+              <w:top w:val="single" w:color="9AA9B8" w:sz="4"/>
+              <w:left w:val="single" w:color="9AA9B8" w:sz="4"/>
+              <w:bottom w:val="single" w:color="9AA9B8" w:sz="4"/>
+              <w:right w:val="single" w:color="9AA9B8" w:sz="4"/>
+            </w:tcBorders>
+            <w:tcMar>
+              <w:top w:type="dxa" w:w="50"/>
+              <w:left w:type="dxa" w:w="90"/>
+              <w:bottom w:type="dxa" w:w="50"/>
+              <w:right w:type="dxa" w:w="90"/>
+            </w:tcMar>
+          </w:tcPr>
+          <w:p>
+            <w:r>
+              <w:rPr>
+                <w:rFonts w:ascii="Consolas" w:cs="Consolas" w:eastAsia="Consolas" w:hAnsi="Consolas"/>
+                <w:sz w:val="18"/>
+                <w:szCs w:val="18"/>
+              </w:rPr>
+              <w:t xml:space="preserve">MasterDetailPage</w:t>
+            </w:r>
+          </w:p>
+        </w:tc>
+        <w:tc>
+          <w:tcPr>
+            <w:tcW w:type="dxa" w:w="3925"/>
+            <w:tcBorders>
+              <w:top w:val="single" w:color="9AA9B8" w:sz="4"/>
+              <w:left w:val="single" w:color="9AA9B8" w:sz="4"/>
+              <w:bottom w:val="single" w:color="9AA9B8" w:sz="4"/>
+              <w:right w:val="single" w:color="9AA9B8" w:sz="4"/>
+            </w:tcBorders>
+            <w:tcMar>
+              <w:top w:type="dxa" w:w="50"/>
+              <w:left w:type="dxa" w:w="90"/>
+              <w:bottom w:type="dxa" w:w="50"/>
+              <w:right w:type="dxa" w:w="90"/>
+            </w:tcMar>
+          </w:tcPr>
+          <w:p>
+            <w:r>
+              <w:rPr>
+                <w:sz w:val="18"/>
+                <w:szCs w:val="18"/>
+              </w:rPr>
+              <w:t xml:space="preserve">Each declares its columns and implements </w:t>
+            </w:r>
+            <w:r>
+              <w:rPr>
+                <w:rFonts w:ascii="Consolas" w:cs="Consolas" w:eastAsia="Consolas" w:hAnsi="Consolas"/>
+                <w:sz w:val="18"/>
+                <w:szCs w:val="18"/>
+              </w:rPr>
+              <w:t xml:space="preserve">rows()</w:t>
+            </w:r>
+            <w:r>
+              <w:rPr>
+                <w:sz w:val="18"/>
+                <w:szCs w:val="18"/>
+              </w:rPr>
+              <w:t xml:space="preserve"> and </w:t>
+            </w:r>
+            <w:r>
+              <w:rPr>
+                <w:rFonts w:ascii="Consolas" w:cs="Consolas" w:eastAsia="Consolas" w:hAnsi="Consolas"/>
+                <w:sz w:val="18"/>
+                <w:szCs w:val="18"/>
+              </w:rPr>
+              <w:t xml:space="preserve">show()</w:t>
+            </w:r>
+          </w:p>
+        </w:tc>
+      </w:tr>
+      <w:tr>
+        <w:trPr>
+          <w:tblHeader w:val="false"/>
+        </w:trPr>
+        <w:tc>
+          <w:tcPr>
+            <w:tcW w:type="dxa" w:w="3924"/>
+            <w:tcBorders>
+              <w:top w:val="single" w:color="9AA9B8" w:sz="4"/>
+              <w:left w:val="single" w:color="9AA9B8" w:sz="4"/>
+              <w:bottom w:val="single" w:color="9AA9B8" w:sz="4"/>
+              <w:right w:val="single" w:color="9AA9B8" w:sz="4"/>
+            </w:tcBorders>
+            <w:tcMar>
+              <w:top w:type="dxa" w:w="50"/>
+              <w:left w:type="dxa" w:w="90"/>
+              <w:bottom w:type="dxa" w:w="50"/>
+              <w:right w:type="dxa" w:w="90"/>
+            </w:tcMar>
+          </w:tcPr>
+          <w:p>
+            <w:r>
+              <w:rPr>
+                <w:rFonts w:ascii="Consolas" w:cs="Consolas" w:eastAsia="Consolas" w:hAnsi="Consolas"/>
+                <w:sz w:val="18"/>
+                <w:szCs w:val="18"/>
+              </w:rPr>
+              <w:t xml:space="preserve">DashboardPage</w:t>
+            </w:r>
+            <w:r>
+              <w:rPr>
+                <w:sz w:val="18"/>
+                <w:szCs w:val="18"/>
+              </w:rPr>
+              <w:t xml:space="preserve">, </w:t>
+            </w:r>
+            <w:r>
+              <w:rPr>
+                <w:rFonts w:ascii="Consolas" w:cs="Consolas" w:eastAsia="Consolas" w:hAnsi="Consolas"/>
+                <w:sz w:val="18"/>
+                <w:szCs w:val="18"/>
+              </w:rPr>
+              <w:t xml:space="preserve">OperationsPage</w:t>
+            </w:r>
+            <w:r>
+              <w:rPr>
+                <w:sz w:val="18"/>
+                <w:szCs w:val="18"/>
+              </w:rPr>
+              <w:t xml:space="preserve">, </w:t>
+            </w:r>
+            <w:r>
+              <w:rPr>
+                <w:rFonts w:ascii="Consolas" w:cs="Consolas" w:eastAsia="Consolas" w:hAnsi="Consolas"/>
+                <w:sz w:val="18"/>
+                <w:szCs w:val="18"/>
+              </w:rPr>
+              <w:t xml:space="preserve">BooksPage</w:t>
+            </w:r>
+            <w:r>
+              <w:rPr>
+                <w:sz w:val="18"/>
+                <w:szCs w:val="18"/>
+              </w:rPr>
+              <w:t xml:space="preserve">, </w:t>
+            </w:r>
+            <w:r>
+              <w:rPr>
+                <w:rFonts w:ascii="Consolas" w:cs="Consolas" w:eastAsia="Consolas" w:hAnsi="Consolas"/>
+                <w:sz w:val="18"/>
+                <w:szCs w:val="18"/>
+              </w:rPr>
+              <w:t xml:space="preserve">ScenarioLogPage</w:t>
+            </w:r>
+          </w:p>
+        </w:tc>
+        <w:tc>
+          <w:tcPr>
+            <w:tcW w:type="dxa" w:w="1177"/>
+            <w:tcBorders>
+              <w:top w:val="single" w:color="9AA9B8" w:sz="4"/>
+              <w:left w:val="single" w:color="9AA9B8" w:sz="4"/>
+              <w:bottom w:val="single" w:color="9AA9B8" w:sz="4"/>
+              <w:right w:val="single" w:color="9AA9B8" w:sz="4"/>
+            </w:tcBorders>
+            <w:tcMar>
+              <w:top w:type="dxa" w:w="50"/>
+              <w:left w:type="dxa" w:w="90"/>
+              <w:bottom w:type="dxa" w:w="50"/>
+              <w:right w:type="dxa" w:w="90"/>
+            </w:tcMar>
+          </w:tcPr>
+          <w:p>
+            <w:r>
+              <w:rPr>
+                <w:rFonts w:ascii="Consolas" w:cs="Consolas" w:eastAsia="Consolas" w:hAnsi="Consolas"/>
+                <w:sz w:val="18"/>
+                <w:szCs w:val="18"/>
+              </w:rPr>
+              <w:t xml:space="preserve">Page</w:t>
+            </w:r>
+          </w:p>
+        </w:tc>
+        <w:tc>
+          <w:tcPr>
+            <w:tcW w:type="dxa" w:w="3925"/>
+            <w:tcBorders>
+              <w:top w:val="single" w:color="9AA9B8" w:sz="4"/>
+              <w:left w:val="single" w:color="9AA9B8" w:sz="4"/>
+              <w:bottom w:val="single" w:color="9AA9B8" w:sz="4"/>
+              <w:right w:val="single" w:color="9AA9B8" w:sz="4"/>
+            </w:tcBorders>
+            <w:tcMar>
+              <w:top w:type="dxa" w:w="50"/>
+              <w:left w:type="dxa" w:w="90"/>
+              <w:bottom w:type="dxa" w:w="50"/>
+              <w:right w:type="dxa" w:w="90"/>
+            </w:tcMar>
+          </w:tcPr>
+          <w:p>
+            <w:r>
+              <w:rPr>
+                <w:sz w:val="18"/>
+                <w:szCs w:val="18"/>
+              </w:rPr>
+              <w:t xml:space="preserve">Screens with their own layouts</w:t>
+            </w:r>
+          </w:p>
+        </w:tc>
+      </w:tr>
+      <w:tr>
+        <w:trPr>
+          <w:tblHeader w:val="false"/>
+        </w:trPr>
+        <w:tc>
+          <w:tcPr>
+            <w:tcW w:type="dxa" w:w="3924"/>
+            <w:tcBorders>
+              <w:top w:val="single" w:color="9AA9B8" w:sz="4"/>
+              <w:left w:val="single" w:color="9AA9B8" w:sz="4"/>
+              <w:bottom w:val="single" w:color="9AA9B8" w:sz="4"/>
+              <w:right w:val="single" w:color="9AA9B8" w:sz="4"/>
+            </w:tcBorders>
+            <w:tcMar>
+              <w:top w:type="dxa" w:w="50"/>
+              <w:left w:type="dxa" w:w="90"/>
+              <w:bottom w:type="dxa" w:w="50"/>
+              <w:right w:type="dxa" w:w="90"/>
+            </w:tcMar>
+          </w:tcPr>
+          <w:p>
+            <w:r>
+              <w:rPr>
+                <w:rFonts w:ascii="Consolas" w:cs="Consolas" w:eastAsia="Consolas" w:hAnsi="Consolas"/>
+                <w:sz w:val="18"/>
+                <w:szCs w:val="18"/>
+              </w:rPr>
+              <w:t xml:space="preserve">DataTable</w:t>
+            </w:r>
+            <w:r>
+              <w:rPr>
+                <w:sz w:val="18"/>
+                <w:szCs w:val="18"/>
+              </w:rPr>
+              <w:t xml:space="preserve">, </w:t>
+            </w:r>
+            <w:r>
+              <w:rPr>
+                <w:rFonts w:ascii="Consolas" w:cs="Consolas" w:eastAsia="Consolas" w:hAnsi="Consolas"/>
+                <w:sz w:val="18"/>
+                <w:szCs w:val="18"/>
+              </w:rPr>
+              <w:t xml:space="preserve">DetailView</w:t>
+            </w:r>
+            <w:r>
+              <w:rPr>
+                <w:sz w:val="18"/>
+                <w:szCs w:val="18"/>
+              </w:rPr>
+              <w:t xml:space="preserve">, </w:t>
+            </w:r>
+            <w:r>
+              <w:rPr>
+                <w:rFonts w:ascii="Consolas" w:cs="Consolas" w:eastAsia="Consolas" w:hAnsi="Consolas"/>
+                <w:sz w:val="18"/>
+                <w:szCs w:val="18"/>
+              </w:rPr>
+              <w:t xml:space="preserve">ScrollFrame</w:t>
+            </w:r>
+          </w:p>
+        </w:tc>
+        <w:tc>
+          <w:tcPr>
+            <w:tcW w:type="dxa" w:w="1177"/>
+            <w:tcBorders>
+              <w:top w:val="single" w:color="9AA9B8" w:sz="4"/>
+              <w:left w:val="single" w:color="9AA9B8" w:sz="4"/>
+              <w:bottom w:val="single" w:color="9AA9B8" w:sz="4"/>
+              <w:right w:val="single" w:color="9AA9B8" w:sz="4"/>
+            </w:tcBorders>
+            <w:tcMar>
+              <w:top w:type="dxa" w:w="50"/>
+              <w:left w:type="dxa" w:w="90"/>
+              <w:bottom w:type="dxa" w:w="50"/>
+              <w:right w:type="dxa" w:w="90"/>
+            </w:tcMar>
+          </w:tcPr>
+          <w:p>
+            <w:r>
+              <w:rPr>
+                <w:rFonts w:ascii="Consolas" w:cs="Consolas" w:eastAsia="Consolas" w:hAnsi="Consolas"/>
+                <w:sz w:val="18"/>
+                <w:szCs w:val="18"/>
+              </w:rPr>
+              <w:t xml:space="preserve">ttk.Frame</w:t>
+            </w:r>
+          </w:p>
+        </w:tc>
+        <w:tc>
+          <w:tcPr>
+            <w:tcW w:type="dxa" w:w="3925"/>
+            <w:tcBorders>
+              <w:top w:val="single" w:color="9AA9B8" w:sz="4"/>
+              <w:left w:val="single" w:color="9AA9B8" w:sz="4"/>
+              <w:bottom w:val="single" w:color="9AA9B8" w:sz="4"/>
+              <w:right w:val="single" w:color="9AA9B8" w:sz="4"/>
+            </w:tcBorders>
+            <w:tcMar>
+              <w:top w:type="dxa" w:w="50"/>
+              <w:left w:type="dxa" w:w="90"/>
+              <w:bottom w:type="dxa" w:w="50"/>
+              <w:right w:type="dxa" w:w="90"/>
+            </w:tcMar>
+          </w:tcPr>
+          <w:p>
+            <w:r>
+              <w:rPr>
+                <w:sz w:val="18"/>
+                <w:szCs w:val="18"/>
+              </w:rPr>
+              <w:t xml:space="preserve">Reusable table, rich text pane and scrolling area</w:t>
+            </w:r>
+          </w:p>
+        </w:tc>
+      </w:tr>
+      <w:tr>
+        <w:trPr>
+          <w:tblHeader w:val="false"/>
+        </w:trPr>
+        <w:tc>
+          <w:tcPr>
+            <w:tcW w:type="dxa" w:w="3924"/>
+            <w:tcBorders>
+              <w:top w:val="single" w:color="9AA9B8" w:sz="4"/>
+              <w:left w:val="single" w:color="9AA9B8" w:sz="4"/>
+              <w:bottom w:val="single" w:color="9AA9B8" w:sz="4"/>
+              <w:right w:val="single" w:color="9AA9B8" w:sz="4"/>
+            </w:tcBorders>
+            <w:tcMar>
+              <w:top w:type="dxa" w:w="50"/>
+              <w:left w:type="dxa" w:w="90"/>
+              <w:bottom w:type="dxa" w:w="50"/>
+              <w:right w:type="dxa" w:w="90"/>
+            </w:tcMar>
+          </w:tcPr>
+          <w:p>
+            <w:r>
+              <w:rPr>
+                <w:rFonts w:ascii="Consolas" w:cs="Consolas" w:eastAsia="Consolas" w:hAnsi="Consolas"/>
+                <w:sz w:val="18"/>
+                <w:szCs w:val="18"/>
+              </w:rPr>
+              <w:t xml:space="preserve">Panel</w:t>
+            </w:r>
+            <w:r>
+              <w:rPr>
+                <w:sz w:val="18"/>
+                <w:szCs w:val="18"/>
+              </w:rPr>
+              <w:t xml:space="preserve">, </w:t>
+            </w:r>
+            <w:r>
+              <w:rPr>
+                <w:rFonts w:ascii="Consolas" w:cs="Consolas" w:eastAsia="Consolas" w:hAnsi="Consolas"/>
+                <w:sz w:val="18"/>
+                <w:szCs w:val="18"/>
+              </w:rPr>
+              <w:t xml:space="preserve">StatCard</w:t>
+            </w:r>
+          </w:p>
+        </w:tc>
+        <w:tc>
+          <w:tcPr>
+            <w:tcW w:type="dxa" w:w="1177"/>
+            <w:tcBorders>
+              <w:top w:val="single" w:color="9AA9B8" w:sz="4"/>
+              <w:left w:val="single" w:color="9AA9B8" w:sz="4"/>
+              <w:bottom w:val="single" w:color="9AA9B8" w:sz="4"/>
+              <w:right w:val="single" w:color="9AA9B8" w:sz="4"/>
+            </w:tcBorders>
+            <w:tcMar>
+              <w:top w:type="dxa" w:w="50"/>
+              <w:left w:type="dxa" w:w="90"/>
+              <w:bottom w:type="dxa" w:w="50"/>
+              <w:right w:type="dxa" w:w="90"/>
+            </w:tcMar>
+          </w:tcPr>
+          <w:p>
+            <w:r>
+              <w:rPr>
+                <w:rFonts w:ascii="Consolas" w:cs="Consolas" w:eastAsia="Consolas" w:hAnsi="Consolas"/>
+                <w:sz w:val="18"/>
+                <w:szCs w:val="18"/>
+              </w:rPr>
+              <w:t xml:space="preserve">tk.Frame</w:t>
+            </w:r>
+          </w:p>
+        </w:tc>
+        <w:tc>
+          <w:tcPr>
+            <w:tcW w:type="dxa" w:w="3925"/>
+            <w:tcBorders>
+              <w:top w:val="single" w:color="9AA9B8" w:sz="4"/>
+              <w:left w:val="single" w:color="9AA9B8" w:sz="4"/>
+              <w:bottom w:val="single" w:color="9AA9B8" w:sz="4"/>
+              <w:right w:val="single" w:color="9AA9B8" w:sz="4"/>
+            </w:tcBorders>
+            <w:tcMar>
+              <w:top w:type="dxa" w:w="50"/>
+              <w:left w:type="dxa" w:w="90"/>
+              <w:bottom w:type="dxa" w:w="50"/>
+              <w:right w:type="dxa" w:w="90"/>
+            </w:tcMar>
+          </w:tcPr>
+          <w:p>
+            <w:r>
+              <w:rPr>
+                <w:sz w:val="18"/>
+                <w:szCs w:val="18"/>
+              </w:rPr>
+              <w:t xml:space="preserve">Reusable card widgets</w:t>
+            </w:r>
+          </w:p>
+        </w:tc>
+      </w:tr>
+      <w:tr>
+        <w:trPr>
+          <w:tblHeader w:val="false"/>
+        </w:trPr>
+        <w:tc>
+          <w:tcPr>
+            <w:tcW w:type="dxa" w:w="3924"/>
+            <w:tcBorders>
+              <w:top w:val="single" w:color="9AA9B8" w:sz="4"/>
+              <w:left w:val="single" w:color="9AA9B8" w:sz="4"/>
+              <w:bottom w:val="single" w:color="9AA9B8" w:sz="4"/>
+              <w:right w:val="single" w:color="9AA9B8" w:sz="4"/>
+            </w:tcBorders>
+            <w:tcMar>
+              <w:top w:type="dxa" w:w="50"/>
+              <w:left w:type="dxa" w:w="90"/>
+              <w:bottom w:type="dxa" w:w="50"/>
+              <w:right w:type="dxa" w:w="90"/>
+            </w:tcMar>
+          </w:tcPr>
+          <w:p>
+            <w:r>
+              <w:rPr>
+                <w:rFonts w:ascii="Consolas" w:cs="Consolas" w:eastAsia="Consolas" w:hAnsi="Consolas"/>
+                <w:sz w:val="18"/>
+                <w:szCs w:val="18"/>
+              </w:rPr>
+              <w:t xml:space="preserve">TimelineCanvas</w:t>
+            </w:r>
+          </w:p>
+        </w:tc>
+        <w:tc>
+          <w:tcPr>
+            <w:tcW w:type="dxa" w:w="1177"/>
+            <w:tcBorders>
+              <w:top w:val="single" w:color="9AA9B8" w:sz="4"/>
+              <w:left w:val="single" w:color="9AA9B8" w:sz="4"/>
+              <w:bottom w:val="single" w:color="9AA9B8" w:sz="4"/>
+              <w:right w:val="single" w:color="9AA9B8" w:sz="4"/>
+            </w:tcBorders>
+            <w:tcMar>
+              <w:top w:type="dxa" w:w="50"/>
+              <w:left w:type="dxa" w:w="90"/>
+              <w:bottom w:type="dxa" w:w="50"/>
+              <w:right w:type="dxa" w:w="90"/>
+            </w:tcMar>
+          </w:tcPr>
+          <w:p>
+            <w:r>
+              <w:rPr>
+                <w:rFonts w:ascii="Consolas" w:cs="Consolas" w:eastAsia="Consolas" w:hAnsi="Consolas"/>
+                <w:sz w:val="18"/>
+                <w:szCs w:val="18"/>
+              </w:rPr>
+              <w:t xml:space="preserve">tk.Canvas</w:t>
+            </w:r>
+          </w:p>
+        </w:tc>
+        <w:tc>
+          <w:tcPr>
+            <w:tcW w:type="dxa" w:w="3925"/>
+            <w:tcBorders>
+              <w:top w:val="single" w:color="9AA9B8" w:sz="4"/>
+              <w:left w:val="single" w:color="9AA9B8" w:sz="4"/>
+              <w:bottom w:val="single" w:color="9AA9B8" w:sz="4"/>
+              <w:right w:val="single" w:color="9AA9B8" w:sz="4"/>
+            </w:tcBorders>
+            <w:tcMar>
+              <w:top w:type="dxa" w:w="50"/>
+              <w:left w:type="dxa" w:w="90"/>
+              <w:bottom w:type="dxa" w:w="50"/>
+              <w:right w:type="dxa" w:w="90"/>
+            </w:tcMar>
+          </w:tcPr>
+          <w:p>
+            <w:r>
+              <w:rPr>
+                <w:sz w:val="18"/>
+                <w:szCs w:val="18"/>
+              </w:rPr>
+              <w:t xml:space="preserve">Draws validity periods as ribbons on a time axis</w:t>
+            </w:r>
+          </w:p>
+        </w:tc>
+      </w:tr>
+      <w:tr>
+        <w:trPr>
+          <w:tblHeader w:val="false"/>
+        </w:trPr>
+        <w:tc>
+          <w:tcPr>
+            <w:tcW w:type="dxa" w:w="3924"/>
+            <w:tcBorders>
+              <w:top w:val="single" w:color="9AA9B8" w:sz="4"/>
+              <w:left w:val="single" w:color="9AA9B8" w:sz="4"/>
+              <w:bottom w:val="single" w:color="9AA9B8" w:sz="4"/>
+              <w:right w:val="single" w:color="9AA9B8" w:sz="4"/>
+            </w:tcBorders>
+            <w:tcMar>
+              <w:top w:type="dxa" w:w="50"/>
+              <w:left w:type="dxa" w:w="90"/>
+              <w:bottom w:type="dxa" w:w="50"/>
+              <w:right w:type="dxa" w:w="90"/>
+            </w:tcMar>
+          </w:tcPr>
+          <w:p>
+            <w:r>
+              <w:rPr>
+                <w:rFonts w:ascii="Consolas" w:cs="Consolas" w:eastAsia="Consolas" w:hAnsi="Consolas"/>
+                <w:sz w:val="18"/>
+                <w:szCs w:val="18"/>
+              </w:rPr>
+              <w:t xml:space="preserve">BankController</w:t>
+            </w:r>
+            <w:r>
+              <w:rPr>
+                <w:sz w:val="18"/>
+                <w:szCs w:val="18"/>
+              </w:rPr>
+              <w:t xml:space="preserve">, </w:t>
+            </w:r>
+            <w:r>
+              <w:rPr>
+                <w:rFonts w:ascii="Consolas" w:cs="Consolas" w:eastAsia="Consolas" w:hAnsi="Consolas"/>
+                <w:sz w:val="18"/>
+                <w:szCs w:val="18"/>
+              </w:rPr>
+              <w:t xml:space="preserve">Outcome</w:t>
+            </w:r>
+            <w:r>
+              <w:rPr>
+                <w:sz w:val="18"/>
+                <w:szCs w:val="18"/>
+              </w:rPr>
+              <w:t xml:space="preserve">, </w:t>
+            </w:r>
+            <w:r>
+              <w:rPr>
+                <w:rFonts w:ascii="Consolas" w:cs="Consolas" w:eastAsia="Consolas" w:hAnsi="Consolas"/>
+                <w:sz w:val="18"/>
+                <w:szCs w:val="18"/>
+              </w:rPr>
+              <w:t xml:space="preserve">OperationSpec</w:t>
+            </w:r>
+            <w:r>
+              <w:rPr>
+                <w:sz w:val="18"/>
+                <w:szCs w:val="18"/>
+              </w:rPr>
+              <w:t xml:space="preserve">, </w:t>
+            </w:r>
+            <w:r>
+              <w:rPr>
+                <w:rFonts w:ascii="Consolas" w:cs="Consolas" w:eastAsia="Consolas" w:hAnsi="Consolas"/>
+                <w:sz w:val="18"/>
+                <w:szCs w:val="18"/>
+              </w:rPr>
+              <w:t xml:space="preserve">Theme</w:t>
+            </w:r>
+          </w:p>
+        </w:tc>
+        <w:tc>
+          <w:tcPr>
+            <w:tcW w:type="dxa" w:w="1177"/>
+            <w:tcBorders>
+              <w:top w:val="single" w:color="9AA9B8" w:sz="4"/>
+              <w:left w:val="single" w:color="9AA9B8" w:sz="4"/>
+              <w:bottom w:val="single" w:color="9AA9B8" w:sz="4"/>
+              <w:right w:val="single" w:color="9AA9B8" w:sz="4"/>
+            </w:tcBorders>
+            <w:tcMar>
+              <w:top w:type="dxa" w:w="50"/>
+              <w:left w:type="dxa" w:w="90"/>
+              <w:bottom w:type="dxa" w:w="50"/>
+              <w:right w:type="dxa" w:w="90"/>
+            </w:tcMar>
+          </w:tcPr>
+          <w:p>
+            <w:r>
+              <w:rPr>
+                <w:sz w:val="18"/>
+                <w:szCs w:val="18"/>
+              </w:rPr>
+              <w:t xml:space="preserve">-</w:t>
+            </w:r>
+          </w:p>
+        </w:tc>
+        <w:tc>
+          <w:tcPr>
+            <w:tcW w:type="dxa" w:w="3925"/>
+            <w:tcBorders>
+              <w:top w:val="single" w:color="9AA9B8" w:sz="4"/>
+              <w:left w:val="single" w:color="9AA9B8" w:sz="4"/>
+              <w:bottom w:val="single" w:color="9AA9B8" w:sz="4"/>
+              <w:right w:val="single" w:color="9AA9B8" w:sz="4"/>
+            </w:tcBorders>
+            <w:tcMar>
+              <w:top w:type="dxa" w:w="50"/>
+              <w:left w:type="dxa" w:w="90"/>
+              <w:bottom w:type="dxa" w:w="50"/>
+              <w:right w:type="dxa" w:w="90"/>
+            </w:tcMar>
+          </w:tcPr>
+          <w:p>
+            <w:r>
+              <w:rPr>
+                <w:sz w:val="18"/>
+                <w:szCs w:val="18"/>
+              </w:rPr>
+              <w:t xml:space="preserve">The only object that talks to the model; a result in words; a form definition; colours, fonts and styles</w:t>
+            </w:r>
+          </w:p>
+        </w:tc>
+      </w:tr>
+    </w:tbl>
+    <w:p>
+      <w:pPr>
+        <w:spacing w:after="60"/>
+      </w:pPr>
+    </w:p>
+    <w:p>
+      <w:r>
+        <w:rPr>
+          <w:rFonts w:ascii="Consolas" w:cs="Consolas" w:eastAsia="Consolas" w:hAnsi="Consolas"/>
+          <w:sz w:val="19"/>
+          <w:szCs w:val="19"/>
+        </w:rPr>
+        <w:t xml:space="preserve">MasterDetailPage</w:t>
+      </w:r>
+      <w:r>
+        <w:t xml:space="preserve"> is a three-level hierarchy (</w:t>
+      </w:r>
+      <w:r>
+        <w:rPr>
+          <w:rFonts w:ascii="Consolas" w:cs="Consolas" w:eastAsia="Consolas" w:hAnsi="Consolas"/>
+          <w:sz w:val="19"/>
+          <w:szCs w:val="19"/>
+        </w:rPr>
+        <w:t xml:space="preserve">ttk.Frame -&gt; Page -&gt; MasterDetailPage -&gt; CustomersPage</w:t>
+      </w:r>
+      <w:r>
+        <w:t xml:space="preserve">) chosen for the same reason as the model's hierarchies: every list screen shares the same layout and behaviour, and only the columns and the detail rendering differ.</w:t>
+      </w:r>
+    </w:p>
+    <w:p>
+      <w:r>
+        <w:rPr>
+          <w:b/>
+          <w:bCs/>
+        </w:rPr>
+        <w:t xml:space="preserve">Figure 9. Overview:</w:t>
+      </w:r>
+      <w:r>
+        <w:t xml:space="preserve"> balances, work waiting for action (authorise or release from here), recent audit events, and the books status.</w:t>
+      </w:r>
+    </w:p>
+    <w:p>
+      <w:pPr>
+        <w:jc w:val="center"/>
+      </w:pPr>
+      <w:r>
+        <w:drawing>
+          <wp:inline distT="0" distB="0" distL="0" distR="0">
+            <wp:extent cx="5905500" cy="3609975"/>
+            <wp:effectExtent t="0" r="0" b="0" l="0"/>
+            <wp:docPr id="1" name="" descr="" title=""/>
+            <wp:cNvGraphicFramePr>
+              <a:graphicFrameLocks xmlns:a="http://schemas.openxmlformats.org/drawingml/2006/main" noChangeAspect="1"/>
+            </wp:cNvGraphicFramePr>
+            <a:graphic xmlns:a="http://schemas.openxmlformats.org/drawingml/2006/main">
+              <a:graphicData uri="http://schemas.openxmlformats.org/drawingml/2006/picture">
+                <pic:pic xmlns:pic="http://schemas.openxmlformats.org/drawingml/2006/picture">
+                  <pic:nvPicPr>
+                    <pic:cNvPr id="0" name="" descr=""/>
+                    <pic:cNvPicPr>
+                      <a:picLocks noChangeAspect="1" noChangeArrowheads="1"/>
+                    </pic:cNvPicPr>
+                  </pic:nvPicPr>
+                  <pic:blipFill>
+                    <a:blip r:embed="rId16" cstate="none"/>
+                    <a:srcRect/>
+                    <a:stretch>
+                      <a:fillRect/>
+                    </a:stretch>
+                  </pic:blipFill>
+                  <pic:spPr bwMode="auto">
+                    <a:xfrm>
+                      <a:off x="0" y="0"/>
+                      <a:ext cx="5905500" cy="3609975"/>
+                    </a:xfrm>
+                    <a:prstGeom prst="rect">
+                      <a:avLst/>
+                    </a:prstGeom>
+                  </pic:spPr>
+                </pic:pic>
+              </a:graphicData>
+            </a:graphic>
+          </wp:inline>
+        </w:drawing>
+      </w:r>
+    </w:p>
+    <w:p>
+      <w:r>
+        <w:rPr>
+          <w:b/>
+          <w:bCs/>
+        </w:rPr>
+        <w:t xml:space="preserve">Figure 10. Guided rule checks:</w:t>
+      </w:r>
+      <w:r>
+        <w:t xml:space="preserve"> each runs one real operation and shows the model's answer.</w:t>
+      </w:r>
+    </w:p>
+    <w:p>
+      <w:pPr>
+        <w:jc w:val="center"/>
+      </w:pPr>
+      <w:r>
+        <w:drawing>
+          <wp:inline distT="0" distB="0" distL="0" distR="0">
+            <wp:extent cx="5905500" cy="3609975"/>
+            <wp:effectExtent t="0" r="0" b="0" l="0"/>
+            <wp:docPr id="1" name="" descr="" title=""/>
+            <wp:cNvGraphicFramePr>
+              <a:graphicFrameLocks xmlns:a="http://schemas.openxmlformats.org/drawingml/2006/main" noChangeAspect="1"/>
+            </wp:cNvGraphicFramePr>
+            <a:graphic xmlns:a="http://schemas.openxmlformats.org/drawingml/2006/main">
+              <a:graphicData uri="http://schemas.openxmlformats.org/drawingml/2006/picture">
+                <pic:pic xmlns:pic="http://schemas.openxmlformats.org/drawingml/2006/picture">
+                  <pic:nvPicPr>
+                    <pic:cNvPr id="0" name="" descr=""/>
+                    <pic:cNvPicPr>
+                      <a:picLocks noChangeAspect="1" noChangeArrowheads="1"/>
+                    </pic:cNvPicPr>
+                  </pic:nvPicPr>
+                  <pic:blipFill>
+                    <a:blip r:embed="rId17" cstate="none"/>
+                    <a:srcRect/>
+                    <a:stretch>
+                      <a:fillRect/>
+                    </a:stretch>
+                  </pic:blipFill>
+                  <pic:spPr bwMode="auto">
+                    <a:xfrm>
+                      <a:off x="0" y="0"/>
+                      <a:ext cx="5905500" cy="3609975"/>
+                    </a:xfrm>
+                    <a:prstGeom prst="rect">
+                      <a:avLst/>
+                    </a:prstGeom>
+                  </pic:spPr>
+                </pic:pic>
+              </a:graphicData>
+            </a:graphic>
+          </wp:inline>
+        </w:drawing>
+      </w:r>
+    </w:p>
+    <w:p>
+      <w:r>
+        <w:rPr>
+          <w:b/>
+          <w:bCs/>
+        </w:rPr>
+        <w:t xml:space="preserve">Figure 11. A customer with one record and many dated roles:</w:t>
+      </w:r>
+      <w:r>
+        <w:t xml:space="preserve"> capacities, timeline ribbons and the time machine.</w:t>
+      </w:r>
+    </w:p>
+    <w:p>
+      <w:pPr>
+        <w:jc w:val="center"/>
+      </w:pPr>
+      <w:r>
+        <w:drawing>
+          <wp:inline distT="0" distB="0" distL="0" distR="0">
+            <wp:extent cx="5905500" cy="3609975"/>
+            <wp:effectExtent t="0" r="0" b="0" l="0"/>
+            <wp:docPr id="1" name="" descr="" title=""/>
+            <wp:cNvGraphicFramePr>
+              <a:graphicFrameLocks xmlns:a="http://schemas.openxmlformats.org/drawingml/2006/main" noChangeAspect="1"/>
+            </wp:cNvGraphicFramePr>
+            <a:graphic xmlns:a="http://schemas.openxmlformats.org/drawingml/2006/main">
+              <a:graphicData uri="http://schemas.openxmlformats.org/drawingml/2006/picture">
+                <pic:pic xmlns:pic="http://schemas.openxmlformats.org/drawingml/2006/picture">
+                  <pic:nvPicPr>
+                    <pic:cNvPr id="0" name="" descr=""/>
+                    <pic:cNvPicPr>
+                      <a:picLocks noChangeAspect="1" noChangeArrowheads="1"/>
+                    </pic:cNvPicPr>
+                  </pic:nvPicPr>
+                  <pic:blipFill>
+                    <a:blip r:embed="rId18" cstate="none"/>
+                    <a:srcRect/>
+                    <a:stretch>
+                      <a:fillRect/>
+                    </a:stretch>
+                  </pic:blipFill>
+                  <pic:spPr bwMode="auto">
+                    <a:xfrm>
+                      <a:off x="0" y="0"/>
+                      <a:ext cx="5905500" cy="3609975"/>
+                    </a:xfrm>
+                    <a:prstGeom prst="rect">
+                      <a:avLst/>
+                    </a:prstGeom>
+                  </pic:spPr>
+                </pic:pic>
+              </a:graphicData>
+            </a:graphic>
+          </wp:inline>
+        </w:drawing>
+      </w:r>
+    </w:p>
+    <w:p>
+      <w:r>
+        <w:rPr>
+          <w:b/>
+          <w:bCs/>
+        </w:rPr>
+        <w:t xml:space="preserve">Figure 12. Card replacement chain:</w:t>
+      </w:r>
+      <w:r>
+        <w:t xml:space="preserve"> every payment on every card in the chain stays searchable.</w:t>
+      </w:r>
+    </w:p>
+    <w:p>
+      <w:pPr>
+        <w:jc w:val="center"/>
+      </w:pPr>
+      <w:r>
+        <w:drawing>
+          <wp:inline distT="0" distB="0" distL="0" distR="0">
+            <wp:extent cx="5905500" cy="3609975"/>
+            <wp:effectExtent t="0" r="0" b="0" l="0"/>
+            <wp:docPr id="1" name="" descr="" title=""/>
+            <wp:cNvGraphicFramePr>
+              <a:graphicFrameLocks xmlns:a="http://schemas.openxmlformats.org/drawingml/2006/main" noChangeAspect="1"/>
+            </wp:cNvGraphicFramePr>
+            <a:graphic xmlns:a="http://schemas.openxmlformats.org/drawingml/2006/main">
+              <a:graphicData uri="http://schemas.openxmlformats.org/drawingml/2006/picture">
+                <pic:pic xmlns:pic="http://schemas.openxmlformats.org/drawingml/2006/picture">
+                  <pic:nvPicPr>
+                    <pic:cNvPr id="0" name="" descr=""/>
+                    <pic:cNvPicPr>
+                      <a:picLocks noChangeAspect="1" noChangeArrowheads="1"/>
+                    </pic:cNvPicPr>
+                  </pic:nvPicPr>
+                  <pic:blipFill>
+                    <a:blip r:embed="rId19" cstate="none"/>
+                    <a:srcRect/>
+                    <a:stretch>
+                      <a:fillRect/>
+                    </a:stretch>
+                  </pic:blipFill>
+                  <pic:spPr bwMode="auto">
+                    <a:xfrm>
+                      <a:off x="0" y="0"/>
+                      <a:ext cx="5905500" cy="3609975"/>
+                    </a:xfrm>
+                    <a:prstGeom prst="rect">
+                      <a:avLst/>
+                    </a:prstGeom>
+                  </pic:spPr>
+                </pic:pic>
+              </a:graphicData>
+            </a:graphic>
+          </wp:inline>
+        </w:drawing>
+      </w:r>
+    </w:p>
+    <w:p>
+      <w:r>
+        <w:rPr>
+          <w:b/>
+          <w:bCs/>
+        </w:rPr>
+        <w:t xml:space="preserve">Figure 13. Books and audit:</w:t>
+      </w:r>
+      <w:r>
+        <w:t xml:space="preserve"> the trial balance totals zero; the audit log records what changed, who did it and why.</w:t>
+      </w:r>
+    </w:p>
+    <w:p>
+      <w:pPr>
+        <w:jc w:val="center"/>
+      </w:pPr>
+      <w:r>
+        <w:drawing>
+          <wp:inline distT="0" distB="0" distL="0" distR="0">
+            <wp:extent cx="5905500" cy="3609975"/>
+            <wp:effectExtent t="0" r="0" b="0" l="0"/>
+            <wp:docPr id="1" name="" descr="" title=""/>
+            <wp:cNvGraphicFramePr>
+              <a:graphicFrameLocks xmlns:a="http://schemas.openxmlformats.org/drawingml/2006/main" noChangeAspect="1"/>
+            </wp:cNvGraphicFramePr>
+            <a:graphic xmlns:a="http://schemas.openxmlformats.org/drawingml/2006/main">
+              <a:graphicData uri="http://schemas.openxmlformats.org/drawingml/2006/picture">
+                <pic:pic xmlns:pic="http://schemas.openxmlformats.org/drawingml/2006/picture">
+                  <pic:nvPicPr>
+                    <pic:cNvPr id="0" name="" descr=""/>
+                    <pic:cNvPicPr>
+                      <a:picLocks noChangeAspect="1" noChangeArrowheads="1"/>
+                    </pic:cNvPicPr>
+                  </pic:nvPicPr>
+                  <pic:blipFill>
+                    <a:blip r:embed="rId20" cstate="none"/>
+                    <a:srcRect/>
+                    <a:stretch>
+                      <a:fillRect/>
+                    </a:stretch>
+                  </pic:blipFill>
+                  <pic:spPr bwMode="auto">
+                    <a:xfrm>
+                      <a:off x="0" y="0"/>
+                      <a:ext cx="5905500" cy="3609975"/>
+                    </a:xfrm>
+                    <a:prstGeom prst="rect">
+                      <a:avLst/>
+                    </a:prstGeom>
+                  </pic:spPr>
+                </pic:pic>
+              </a:graphicData>
+            </a:graphic>
+          </wp:inline>
+        </w:drawing>
+      </w:r>
+    </w:p>
+    <w:p>
+      <w:r>
+        <w:rPr>
+          <w:b/>
+          <w:bCs/>
+        </w:rPr>
+        <w:t xml:space="preserve">Figure 14. Class model read from the code at runtime,</w:t>
+      </w:r>
+      <w:r>
+        <w:t xml:space="preserve"> with what each level adds and live object counts.</w:t>
+      </w:r>
+    </w:p>
+    <w:p>
+      <w:pPr>
+        <w:jc w:val="center"/>
+      </w:pPr>
+      <w:r>
+        <w:drawing>
+          <wp:inline distT="0" distB="0" distL="0" distR="0">
+            <wp:extent cx="5905500" cy="3609975"/>
+            <wp:effectExtent t="0" r="0" b="0" l="0"/>
+            <wp:docPr id="1" name="" descr="" title=""/>
+            <wp:cNvGraphicFramePr>
+              <a:graphicFrameLocks xmlns:a="http://schemas.openxmlformats.org/drawingml/2006/main" noChangeAspect="1"/>
+            </wp:cNvGraphicFramePr>
+            <a:graphic xmlns:a="http://schemas.openxmlformats.org/drawingml/2006/main">
+              <a:graphicData uri="http://schemas.openxmlformats.org/drawingml/2006/picture">
+                <pic:pic xmlns:pic="http://schemas.openxmlformats.org/drawingml/2006/picture">
+                  <pic:nvPicPr>
+                    <pic:cNvPr id="0" name="" descr=""/>
+                    <pic:cNvPicPr>
+                      <a:picLocks noChangeAspect="1" noChangeArrowheads="1"/>
+                    </pic:cNvPicPr>
+                  </pic:nvPicPr>
+                  <pic:blipFill>
+                    <a:blip r:embed="rId21" cstate="none"/>
+                    <a:srcRect/>
+                    <a:stretch>
+                      <a:fillRect/>
+                    </a:stretch>
+                  </pic:blipFill>
+                  <pic:spPr bwMode="auto">
+                    <a:xfrm>
+                      <a:off x="0" y="0"/>
+                      <a:ext cx="5905500" cy="3609975"/>
+                    </a:xfrm>
+                    <a:prstGeom prst="rect">
+                      <a:avLst/>
+                    </a:prstGeom>
+                  </pic:spPr>
+                </pic:pic>
+              </a:graphicData>
+            </a:graphic>
+          </wp:inline>
+        </w:drawing>
       </w:r>
     </w:p>
     <w:sectPr>

</xml_diff>

<commit_message>
Add the authors: Khizar Rizwan and Bilal Nadeem
Names added to the report cover, the title slide, the README, both
Python file headers and the GUI sign-in screen; report PDF/DOCX, deck
and the sign-in screenshot rebuilt.

Co-Authored-By: Claude Opus 5.5 <noreply@anthropic.com>
Claude-Session: https://claude.ai/code/session_01SahYJB3mwF36eBHRbWfj6o
</commit_message>
<xml_diff>
--- a/docs/Design_Report.docx
+++ b/docs/Design_Report.docx
@@ -133,7 +133,7 @@
                 <w:sz w:val="18"/>
                 <w:szCs w:val="18"/>
               </w:rPr>
-              <w:t xml:space="preserve">______________________________</w:t>
+              <w:t xml:space="preserve">Khizar Rizwan and Bilal Nadeem</w:t>
             </w:r>
           </w:p>
         </w:tc>
@@ -164,7 +164,7 @@
                 <w:sz w:val="18"/>
                 <w:szCs w:val="18"/>
               </w:rPr>
-              <w:t xml:space="preserve">Roll number</w:t>
+              <w:t xml:space="preserve">Roll numbers</w:t>
             </w:r>
           </w:p>
         </w:tc>

</xml_diff>

<commit_message>
Add Project Presentation 1 deck and speech; Bilal Nadeem is the instructor
- docs/Progress_Presentation_1.pptx: 8-slide, 5-minute progress
  checkpoint (progress timeline, research findings, class diagram, UML
  inheritance, flowchart, state machine, next steps); notes are the speech
- docs/Progress_Presentation_1_Speech.md/.docx: timed script, how each
  marking criterion is met, likely questions, rehearsal checklist
- tools/make_progress_deck.js builds the deck
- Course outline shows Bilal Nadeem is the course instructor: author
  lines now read "Khizar Rizwan", with the course and instructor named;
  report, viva deck and sign-in screenshot rebuilt

Co-Authored-By: Claude Opus 5.5 <noreply@anthropic.com>
Claude-Session: https://claude.ai/code/session_01SahYJB3mwF36eBHRbWfj6o
</commit_message>
<xml_diff>
--- a/docs/Design_Report.docx
+++ b/docs/Design_Report.docx
@@ -35,8 +35,8 @@
         </w:tblBorders>
       </w:tblPr>
       <w:tblGrid>
-        <w:gridCol w:w="3716"/>
-        <w:gridCol w:w="5310"/>
+        <w:gridCol w:w="2340"/>
+        <w:gridCol w:w="6686"/>
       </w:tblGrid>
       <w:tr>
         <w:trPr>
@@ -44,7 +44,7 @@
         </w:trPr>
         <w:tc>
           <w:tcPr>
-            <w:tcW w:type="dxa" w:w="3716"/>
+            <w:tcW w:type="dxa" w:w="2340"/>
             <w:tcBorders>
               <w:top w:val="single" w:color="9AA9B8" w:sz="4"/>
               <w:left w:val="single" w:color="9AA9B8" w:sz="4"/>
@@ -63,7 +63,7 @@
         </w:tc>
         <w:tc>
           <w:tcPr>
-            <w:tcW w:type="dxa" w:w="5310"/>
+            <w:tcW w:type="dxa" w:w="6686"/>
             <w:tcBorders>
               <w:top w:val="single" w:color="9AA9B8" w:sz="4"/>
               <w:left w:val="single" w:color="9AA9B8" w:sz="4"/>
@@ -87,7 +87,7 @@
         </w:trPr>
         <w:tc>
           <w:tcPr>
-            <w:tcW w:type="dxa" w:w="3716"/>
+            <w:tcW w:type="dxa" w:w="2340"/>
             <w:tcBorders>
               <w:top w:val="single" w:color="9AA9B8" w:sz="4"/>
               <w:left w:val="single" w:color="9AA9B8" w:sz="4"/>
@@ -113,27 +113,27 @@
         </w:tc>
         <w:tc>
           <w:tcPr>
-            <w:tcW w:type="dxa" w:w="5310"/>
-            <w:tcBorders>
-              <w:top w:val="single" w:color="9AA9B8" w:sz="4"/>
-              <w:left w:val="single" w:color="9AA9B8" w:sz="4"/>
-              <w:bottom w:val="single" w:color="9AA9B8" w:sz="4"/>
-              <w:right w:val="single" w:color="9AA9B8" w:sz="4"/>
-            </w:tcBorders>
-            <w:tcMar>
-              <w:top w:type="dxa" w:w="50"/>
-              <w:left w:type="dxa" w:w="90"/>
-              <w:bottom w:type="dxa" w:w="50"/>
-              <w:right w:type="dxa" w:w="90"/>
-            </w:tcMar>
-          </w:tcPr>
-          <w:p>
-            <w:r>
-              <w:rPr>
-                <w:sz w:val="18"/>
-                <w:szCs w:val="18"/>
-              </w:rPr>
-              <w:t xml:space="preserve">Khizar Rizwan and Bilal Nadeem</w:t>
+            <w:tcW w:type="dxa" w:w="6686"/>
+            <w:tcBorders>
+              <w:top w:val="single" w:color="9AA9B8" w:sz="4"/>
+              <w:left w:val="single" w:color="9AA9B8" w:sz="4"/>
+              <w:bottom w:val="single" w:color="9AA9B8" w:sz="4"/>
+              <w:right w:val="single" w:color="9AA9B8" w:sz="4"/>
+            </w:tcBorders>
+            <w:tcMar>
+              <w:top w:type="dxa" w:w="50"/>
+              <w:left w:type="dxa" w:w="90"/>
+              <w:bottom w:type="dxa" w:w="50"/>
+              <w:right w:type="dxa" w:w="90"/>
+            </w:tcMar>
+          </w:tcPr>
+          <w:p>
+            <w:r>
+              <w:rPr>
+                <w:sz w:val="18"/>
+                <w:szCs w:val="18"/>
+              </w:rPr>
+              <w:t xml:space="preserve">Khizar Rizwan</w:t>
             </w:r>
           </w:p>
         </w:tc>
@@ -144,33 +144,33 @@
         </w:trPr>
         <w:tc>
           <w:tcPr>
-            <w:tcW w:type="dxa" w:w="3716"/>
-            <w:tcBorders>
-              <w:top w:val="single" w:color="9AA9B8" w:sz="4"/>
-              <w:left w:val="single" w:color="9AA9B8" w:sz="4"/>
-              <w:bottom w:val="single" w:color="9AA9B8" w:sz="4"/>
-              <w:right w:val="single" w:color="9AA9B8" w:sz="4"/>
-            </w:tcBorders>
-            <w:tcMar>
-              <w:top w:type="dxa" w:w="50"/>
-              <w:left w:type="dxa" w:w="90"/>
-              <w:bottom w:type="dxa" w:w="50"/>
-              <w:right w:type="dxa" w:w="90"/>
-            </w:tcMar>
-          </w:tcPr>
-          <w:p>
-            <w:r>
-              <w:rPr>
-                <w:sz w:val="18"/>
-                <w:szCs w:val="18"/>
-              </w:rPr>
-              <w:t xml:space="preserve">Roll numbers</w:t>
-            </w:r>
-          </w:p>
-        </w:tc>
-        <w:tc>
-          <w:tcPr>
-            <w:tcW w:type="dxa" w:w="5310"/>
+            <w:tcW w:type="dxa" w:w="2340"/>
+            <w:tcBorders>
+              <w:top w:val="single" w:color="9AA9B8" w:sz="4"/>
+              <w:left w:val="single" w:color="9AA9B8" w:sz="4"/>
+              <w:bottom w:val="single" w:color="9AA9B8" w:sz="4"/>
+              <w:right w:val="single" w:color="9AA9B8" w:sz="4"/>
+            </w:tcBorders>
+            <w:tcMar>
+              <w:top w:type="dxa" w:w="50"/>
+              <w:left w:type="dxa" w:w="90"/>
+              <w:bottom w:type="dxa" w:w="50"/>
+              <w:right w:type="dxa" w:w="90"/>
+            </w:tcMar>
+          </w:tcPr>
+          <w:p>
+            <w:r>
+              <w:rPr>
+                <w:sz w:val="18"/>
+                <w:szCs w:val="18"/>
+              </w:rPr>
+              <w:t xml:space="preserve">Roll number</w:t>
+            </w:r>
+          </w:p>
+        </w:tc>
+        <w:tc>
+          <w:tcPr>
+            <w:tcW w:type="dxa" w:w="6686"/>
             <w:tcBorders>
               <w:top w:val="single" w:color="9AA9B8" w:sz="4"/>
               <w:left w:val="single" w:color="9AA9B8" w:sz="4"/>
@@ -201,7 +201,7 @@
         </w:trPr>
         <w:tc>
           <w:tcPr>
-            <w:tcW w:type="dxa" w:w="3716"/>
+            <w:tcW w:type="dxa" w:w="2340"/>
             <w:tcBorders>
               <w:top w:val="single" w:color="9AA9B8" w:sz="4"/>
               <w:left w:val="single" w:color="9AA9B8" w:sz="4"/>
@@ -227,27 +227,27 @@
         </w:tc>
         <w:tc>
           <w:tcPr>
-            <w:tcW w:type="dxa" w:w="5310"/>
-            <w:tcBorders>
-              <w:top w:val="single" w:color="9AA9B8" w:sz="4"/>
-              <w:left w:val="single" w:color="9AA9B8" w:sz="4"/>
-              <w:bottom w:val="single" w:color="9AA9B8" w:sz="4"/>
-              <w:right w:val="single" w:color="9AA9B8" w:sz="4"/>
-            </w:tcBorders>
-            <w:tcMar>
-              <w:top w:type="dxa" w:w="50"/>
-              <w:left w:type="dxa" w:w="90"/>
-              <w:bottom w:type="dxa" w:w="50"/>
-              <w:right w:type="dxa" w:w="90"/>
-            </w:tcMar>
-          </w:tcPr>
-          <w:p>
-            <w:r>
-              <w:rPr>
-                <w:sz w:val="18"/>
-                <w:szCs w:val="18"/>
-              </w:rPr>
-              <w:t xml:space="preserve">______________________________</w:t>
+            <w:tcW w:type="dxa" w:w="6686"/>
+            <w:tcBorders>
+              <w:top w:val="single" w:color="9AA9B8" w:sz="4"/>
+              <w:left w:val="single" w:color="9AA9B8" w:sz="4"/>
+              <w:bottom w:val="single" w:color="9AA9B8" w:sz="4"/>
+              <w:right w:val="single" w:color="9AA9B8" w:sz="4"/>
+            </w:tcBorders>
+            <w:tcMar>
+              <w:top w:type="dxa" w:w="50"/>
+              <w:left w:type="dxa" w:w="90"/>
+              <w:bottom w:type="dxa" w:w="50"/>
+              <w:right w:type="dxa" w:w="90"/>
+            </w:tcMar>
+          </w:tcPr>
+          <w:p>
+            <w:r>
+              <w:rPr>
+                <w:sz w:val="18"/>
+                <w:szCs w:val="18"/>
+              </w:rPr>
+              <w:t xml:space="preserve">CS2012 Introduction to Object-Oriented Programming, FAST-NUCES Lahore; Bilal Nadeem</w:t>
             </w:r>
           </w:p>
         </w:tc>

</xml_diff>

<commit_message>
Add an optional AI assistant (offline, or Claude)
- banking_assistant.py: Assistant (abstract: conversation, retrieval)
  -> OfflineAssistant (rule-based answers, form preparation)
  -> ClaudeAssistant (Claude writes the answer via the anthropic
  package; falls back to the offline answer). It reads records and
  pre-fills one of six listed forms; it never runs an operation.
  9 tests with a stand-in for Claude; terminal chat mode
- GUI: Assistant screen (conversation, suggestions, "open the filled
  form" into Operations); OperationsPage.prefill
- Smoke test: the assistant explains a refusal, prepares a deposit form,
  the form is run and posts exactly one deposit
- CI runs the assistant tests and lints the new file
- README, report section 11.1 and figure 22, viva notes, checklist,
  progress deck slide 8 and speech; screenshots and documents rebuilt

Co-Authored-By: Claude Opus 5.5 <noreply@anthropic.com>
Claude-Session: https://claude.ai/code/session_01SahYJB3mwF36eBHRbWfj6o
</commit_message>
<xml_diff>
--- a/docs/Design_Report.docx
+++ b/docs/Design_Report.docx
@@ -27498,7 +27498,7 @@
           <w:b/>
           <w:bCs/>
         </w:rPr>
-        <w:t xml:space="preserve">Fourteen console screens in two sections.</w:t>
+        <w:t xml:space="preserve">Fifteen console screens in two sections.</w:t>
       </w:r>
       <w:r>
         <w:t xml:space="preserve"> </w:t>
@@ -27511,7 +27511,7 @@
         <w:t xml:space="preserve">Bank</w:t>
       </w:r>
       <w:r>
-        <w:t xml:space="preserve"> (12 screens) is what staff would use. </w:t>
+        <w:t xml:space="preserve"> (13 screens, including the Assistant described in section 11.1) is what staff would use. </w:t>
       </w:r>
       <w:r>
         <w:rPr>
@@ -30164,6 +30164,91 @@
                 <w:szCs w:val="18"/>
               </w:rPr>
               <w:t xml:space="preserve">Validity periods as ribbons; icon badge; initials</w:t>
+            </w:r>
+          </w:p>
+        </w:tc>
+      </w:tr>
+      <w:tr>
+        <w:trPr>
+          <w:tblHeader w:val="false"/>
+        </w:trPr>
+        <w:tc>
+          <w:tcPr>
+            <w:tcW w:type="dxa" w:w="3924"/>
+            <w:tcBorders>
+              <w:top w:val="single" w:color="9AA9B8" w:sz="4"/>
+              <w:left w:val="single" w:color="9AA9B8" w:sz="4"/>
+              <w:bottom w:val="single" w:color="9AA9B8" w:sz="4"/>
+              <w:right w:val="single" w:color="9AA9B8" w:sz="4"/>
+            </w:tcBorders>
+            <w:tcMar>
+              <w:top w:type="dxa" w:w="50"/>
+              <w:left w:type="dxa" w:w="90"/>
+              <w:bottom w:type="dxa" w:w="50"/>
+              <w:right w:type="dxa" w:w="90"/>
+            </w:tcMar>
+          </w:tcPr>
+          <w:p>
+            <w:r>
+              <w:rPr>
+                <w:rFonts w:ascii="Consolas" w:cs="Consolas" w:eastAsia="Consolas" w:hAnsi="Consolas"/>
+                <w:sz w:val="18"/>
+                <w:szCs w:val="18"/>
+              </w:rPr>
+              <w:t xml:space="preserve">AssistantPage</w:t>
+            </w:r>
+          </w:p>
+        </w:tc>
+        <w:tc>
+          <w:tcPr>
+            <w:tcW w:type="dxa" w:w="1177"/>
+            <w:tcBorders>
+              <w:top w:val="single" w:color="9AA9B8" w:sz="4"/>
+              <w:left w:val="single" w:color="9AA9B8" w:sz="4"/>
+              <w:bottom w:val="single" w:color="9AA9B8" w:sz="4"/>
+              <w:right w:val="single" w:color="9AA9B8" w:sz="4"/>
+            </w:tcBorders>
+            <w:tcMar>
+              <w:top w:type="dxa" w:w="50"/>
+              <w:left w:type="dxa" w:w="90"/>
+              <w:bottom w:type="dxa" w:w="50"/>
+              <w:right w:type="dxa" w:w="90"/>
+            </w:tcMar>
+          </w:tcPr>
+          <w:p>
+            <w:r>
+              <w:rPr>
+                <w:rFonts w:ascii="Consolas" w:cs="Consolas" w:eastAsia="Consolas" w:hAnsi="Consolas"/>
+                <w:sz w:val="18"/>
+                <w:szCs w:val="18"/>
+              </w:rPr>
+              <w:t xml:space="preserve">Page</w:t>
+            </w:r>
+          </w:p>
+        </w:tc>
+        <w:tc>
+          <w:tcPr>
+            <w:tcW w:type="dxa" w:w="3925"/>
+            <w:tcBorders>
+              <w:top w:val="single" w:color="9AA9B8" w:sz="4"/>
+              <w:left w:val="single" w:color="9AA9B8" w:sz="4"/>
+              <w:bottom w:val="single" w:color="9AA9B8" w:sz="4"/>
+              <w:right w:val="single" w:color="9AA9B8" w:sz="4"/>
+            </w:tcBorders>
+            <w:tcMar>
+              <w:top w:type="dxa" w:w="50"/>
+              <w:left w:type="dxa" w:w="90"/>
+              <w:bottom w:type="dxa" w:w="50"/>
+              <w:right w:type="dxa" w:w="90"/>
+            </w:tcMar>
+          </w:tcPr>
+          <w:p>
+            <w:r>
+              <w:rPr>
+                <w:sz w:val="18"/>
+                <w:szCs w:val="18"/>
+              </w:rPr>
+              <w:t xml:space="preserve">The assistant screen: conversation, suggestions, and "open the filled form"</w:t>
             </w:r>
           </w:p>
         </w:tc>
@@ -31123,6 +31208,758 @@
                   </pic:nvPicPr>
                   <pic:blipFill>
                     <a:blip r:embed="rId38" cstate="none"/>
+                    <a:srcRect/>
+                    <a:stretch>
+                      <a:fillRect/>
+                    </a:stretch>
+                  </pic:blipFill>
+                  <pic:spPr bwMode="auto">
+                    <a:xfrm>
+                      <a:off x="0" y="0"/>
+                      <a:ext cx="5905500" cy="3609975"/>
+                    </a:xfrm>
+                    <a:prstGeom prst="rect">
+                      <a:avLst/>
+                    </a:prstGeom>
+                  </pic:spPr>
+                </pic:pic>
+              </a:graphicData>
+            </a:graphic>
+          </wp:inline>
+        </w:drawing>
+      </w:r>
+    </w:p>
+    <w:p>
+      <w:pPr>
+        <w:pStyle w:val="Heading2"/>
+      </w:pPr>
+      <w:r>
+        <w:t xml:space="preserve">11.1 AI assistant (optional automation)</w:t>
+      </w:r>
+    </w:p>
+    <w:p>
+      <w:r>
+        <w:rPr>
+          <w:rFonts w:ascii="Consolas" w:cs="Consolas" w:eastAsia="Consolas" w:hAnsi="Consolas"/>
+          <w:sz w:val="19"/>
+          <w:szCs w:val="19"/>
+        </w:rPr>
+        <w:t xml:space="preserve">banking_assistant.py</w:t>
+      </w:r>
+      <w:r>
+        <w:t xml:space="preserve"> adds an assistant to the console (and to the terminal). A member of staff asks about a record in plain words, or asks for an operation, and the assistant answers from the bank's own records or prepares the form. It is optional: the project runs without it, and without an internet connection.</w:t>
+      </w:r>
+    </w:p>
+    <w:p>
+      <w:r>
+        <w:rPr>
+          <w:b/>
+          <w:bCs/>
+        </w:rPr>
+        <w:t xml:space="preserve">Designed as a hierarchy, for the same reasons as the model.</w:t>
+      </w:r>
+    </w:p>
+    <w:tbl>
+      <w:tblPr>
+        <w:tblW w:type="dxa" w:w="9026"/>
+        <w:tblBorders>
+          <w:top w:val="single" w:color="auto" w:sz="4"/>
+          <w:left w:val="single" w:color="auto" w:sz="4"/>
+          <w:bottom w:val="single" w:color="auto" w:sz="4"/>
+          <w:right w:val="single" w:color="auto" w:sz="4"/>
+          <w:insideH w:val="single" w:color="auto" w:sz="4"/>
+          <w:insideV w:val="single" w:color="auto" w:sz="4"/>
+        </w:tblBorders>
+      </w:tblPr>
+      <w:tblGrid>
+        <w:gridCol w:w="1692"/>
+        <w:gridCol w:w="1692"/>
+        <w:gridCol w:w="5642"/>
+      </w:tblGrid>
+      <w:tr>
+        <w:trPr>
+          <w:tblHeader/>
+        </w:trPr>
+        <w:tc>
+          <w:tcPr>
+            <w:tcW w:type="dxa" w:w="1692"/>
+            <w:tcBorders>
+              <w:top w:val="single" w:color="9AA9B8" w:sz="4"/>
+              <w:left w:val="single" w:color="9AA9B8" w:sz="4"/>
+              <w:bottom w:val="single" w:color="9AA9B8" w:sz="4"/>
+              <w:right w:val="single" w:color="9AA9B8" w:sz="4"/>
+            </w:tcBorders>
+            <w:shd w:fill="DDE7F0" w:color="auto" w:val="clear"/>
+            <w:tcMar>
+              <w:top w:type="dxa" w:w="50"/>
+              <w:left w:type="dxa" w:w="90"/>
+              <w:bottom w:type="dxa" w:w="50"/>
+              <w:right w:type="dxa" w:w="90"/>
+            </w:tcMar>
+          </w:tcPr>
+          <w:p>
+            <w:r>
+              <w:rPr>
+                <w:b/>
+                <w:bCs/>
+                <w:sz w:val="18"/>
+                <w:szCs w:val="18"/>
+              </w:rPr>
+              <w:t xml:space="preserve">Class</w:t>
+            </w:r>
+          </w:p>
+        </w:tc>
+        <w:tc>
+          <w:tcPr>
+            <w:tcW w:type="dxa" w:w="1692"/>
+            <w:tcBorders>
+              <w:top w:val="single" w:color="9AA9B8" w:sz="4"/>
+              <w:left w:val="single" w:color="9AA9B8" w:sz="4"/>
+              <w:bottom w:val="single" w:color="9AA9B8" w:sz="4"/>
+              <w:right w:val="single" w:color="9AA9B8" w:sz="4"/>
+            </w:tcBorders>
+            <w:shd w:fill="DDE7F0" w:color="auto" w:val="clear"/>
+            <w:tcMar>
+              <w:top w:type="dxa" w:w="50"/>
+              <w:left w:type="dxa" w:w="90"/>
+              <w:bottom w:type="dxa" w:w="50"/>
+              <w:right w:type="dxa" w:w="90"/>
+            </w:tcMar>
+          </w:tcPr>
+          <w:p>
+            <w:r>
+              <w:rPr>
+                <w:b/>
+                <w:bCs/>
+                <w:sz w:val="18"/>
+                <w:szCs w:val="18"/>
+              </w:rPr>
+              <w:t xml:space="preserve">Inherits from</w:t>
+            </w:r>
+          </w:p>
+        </w:tc>
+        <w:tc>
+          <w:tcPr>
+            <w:tcW w:type="dxa" w:w="5642"/>
+            <w:tcBorders>
+              <w:top w:val="single" w:color="9AA9B8" w:sz="4"/>
+              <w:left w:val="single" w:color="9AA9B8" w:sz="4"/>
+              <w:bottom w:val="single" w:color="9AA9B8" w:sz="4"/>
+              <w:right w:val="single" w:color="9AA9B8" w:sz="4"/>
+            </w:tcBorders>
+            <w:shd w:fill="DDE7F0" w:color="auto" w:val="clear"/>
+            <w:tcMar>
+              <w:top w:type="dxa" w:w="50"/>
+              <w:left w:type="dxa" w:w="90"/>
+              <w:bottom w:type="dxa" w:w="50"/>
+              <w:right w:type="dxa" w:w="90"/>
+            </w:tcMar>
+          </w:tcPr>
+          <w:p>
+            <w:r>
+              <w:rPr>
+                <w:b/>
+                <w:bCs/>
+                <w:sz w:val="18"/>
+                <w:szCs w:val="18"/>
+              </w:rPr>
+              <w:t xml:space="preserve">What the level adds</w:t>
+            </w:r>
+          </w:p>
+        </w:tc>
+      </w:tr>
+      <w:tr>
+        <w:trPr>
+          <w:tblHeader w:val="false"/>
+        </w:trPr>
+        <w:tc>
+          <w:tcPr>
+            <w:tcW w:type="dxa" w:w="1692"/>
+            <w:tcBorders>
+              <w:top w:val="single" w:color="9AA9B8" w:sz="4"/>
+              <w:left w:val="single" w:color="9AA9B8" w:sz="4"/>
+              <w:bottom w:val="single" w:color="9AA9B8" w:sz="4"/>
+              <w:right w:val="single" w:color="9AA9B8" w:sz="4"/>
+            </w:tcBorders>
+            <w:tcMar>
+              <w:top w:type="dxa" w:w="50"/>
+              <w:left w:type="dxa" w:w="90"/>
+              <w:bottom w:type="dxa" w:w="50"/>
+              <w:right w:type="dxa" w:w="90"/>
+            </w:tcMar>
+          </w:tcPr>
+          <w:p>
+            <w:r>
+              <w:rPr>
+                <w:rFonts w:ascii="Consolas" w:cs="Consolas" w:eastAsia="Consolas" w:hAnsi="Consolas"/>
+                <w:sz w:val="18"/>
+                <w:szCs w:val="18"/>
+              </w:rPr>
+              <w:t xml:space="preserve">Assistant</w:t>
+            </w:r>
+          </w:p>
+        </w:tc>
+        <w:tc>
+          <w:tcPr>
+            <w:tcW w:type="dxa" w:w="1692"/>
+            <w:tcBorders>
+              <w:top w:val="single" w:color="9AA9B8" w:sz="4"/>
+              <w:left w:val="single" w:color="9AA9B8" w:sz="4"/>
+              <w:bottom w:val="single" w:color="9AA9B8" w:sz="4"/>
+              <w:right w:val="single" w:color="9AA9B8" w:sz="4"/>
+            </w:tcBorders>
+            <w:tcMar>
+              <w:top w:type="dxa" w:w="50"/>
+              <w:left w:type="dxa" w:w="90"/>
+              <w:bottom w:type="dxa" w:w="50"/>
+              <w:right w:type="dxa" w:w="90"/>
+            </w:tcMar>
+          </w:tcPr>
+          <w:p>
+            <w:r>
+              <w:rPr>
+                <w:sz w:val="18"/>
+                <w:szCs w:val="18"/>
+              </w:rPr>
+              <w:t xml:space="preserve">(abstract)</w:t>
+            </w:r>
+          </w:p>
+        </w:tc>
+        <w:tc>
+          <w:tcPr>
+            <w:tcW w:type="dxa" w:w="5642"/>
+            <w:tcBorders>
+              <w:top w:val="single" w:color="9AA9B8" w:sz="4"/>
+              <w:left w:val="single" w:color="9AA9B8" w:sz="4"/>
+              <w:bottom w:val="single" w:color="9AA9B8" w:sz="4"/>
+              <w:right w:val="single" w:color="9AA9B8" w:sz="4"/>
+            </w:tcBorders>
+            <w:tcMar>
+              <w:top w:type="dxa" w:w="50"/>
+              <w:left w:type="dxa" w:w="90"/>
+              <w:bottom w:type="dxa" w:w="50"/>
+              <w:right w:type="dxa" w:w="90"/>
+            </w:tcMar>
+          </w:tcPr>
+          <w:p>
+            <w:r>
+              <w:rPr>
+                <w:sz w:val="18"/>
+                <w:szCs w:val="18"/>
+              </w:rPr>
+              <w:t xml:space="preserve">The conversation, kept in order and never overwritten (</w:t>
+            </w:r>
+            <w:r>
+              <w:rPr>
+                <w:rFonts w:ascii="Consolas" w:cs="Consolas" w:eastAsia="Consolas" w:hAnsi="Consolas"/>
+                <w:sz w:val="18"/>
+                <w:szCs w:val="18"/>
+              </w:rPr>
+              <w:t xml:space="preserve">Exchange</w:t>
+            </w:r>
+            <w:r>
+              <w:rPr>
+                <w:sz w:val="18"/>
+                <w:szCs w:val="18"/>
+              </w:rPr>
+              <w:t xml:space="preserve">); retrieval of the records a question names, by reference number or name, described through the model's own methods (</w:t>
+            </w:r>
+            <w:r>
+              <w:rPr>
+                <w:rFonts w:ascii="Consolas" w:cs="Consolas" w:eastAsia="Consolas" w:hAnsi="Consolas"/>
+                <w:sz w:val="18"/>
+                <w:szCs w:val="18"/>
+              </w:rPr>
+              <w:t xml:space="preserve">transaction_story</w:t>
+            </w:r>
+            <w:r>
+              <w:rPr>
+                <w:sz w:val="18"/>
+                <w:szCs w:val="18"/>
+              </w:rPr>
+              <w:t xml:space="preserve">, </w:t>
+            </w:r>
+            <w:r>
+              <w:rPr>
+                <w:rFonts w:ascii="Consolas" w:cs="Consolas" w:eastAsia="Consolas" w:hAnsi="Consolas"/>
+                <w:sz w:val="18"/>
+                <w:szCs w:val="18"/>
+              </w:rPr>
+              <w:t xml:space="preserve">capacities_of</w:t>
+            </w:r>
+            <w:r>
+              <w:rPr>
+                <w:sz w:val="18"/>
+                <w:szCs w:val="18"/>
+              </w:rPr>
+              <w:t xml:space="preserve">, </w:t>
+            </w:r>
+            <w:r>
+              <w:rPr>
+                <w:rFonts w:ascii="Consolas" w:cs="Consolas" w:eastAsia="Consolas" w:hAnsi="Consolas"/>
+                <w:sz w:val="18"/>
+                <w:szCs w:val="18"/>
+              </w:rPr>
+              <w:t xml:space="preserve">lineage</w:t>
+            </w:r>
+            <w:r>
+              <w:rPr>
+                <w:sz w:val="18"/>
+                <w:szCs w:val="18"/>
+              </w:rPr>
+              <w:t xml:space="preserve">...); </w:t>
+            </w:r>
+            <w:r>
+              <w:rPr>
+                <w:rFonts w:ascii="Consolas" w:cs="Consolas" w:eastAsia="Consolas" w:hAnsi="Consolas"/>
+                <w:sz w:val="18"/>
+                <w:szCs w:val="18"/>
+              </w:rPr>
+              <w:t xml:space="preserve">ask()</w:t>
+            </w:r>
+            <w:r>
+              <w:rPr>
+                <w:sz w:val="18"/>
+                <w:szCs w:val="18"/>
+              </w:rPr>
+              <w:t xml:space="preserve"> as a template method</w:t>
+            </w:r>
+          </w:p>
+        </w:tc>
+      </w:tr>
+      <w:tr>
+        <w:trPr>
+          <w:tblHeader w:val="false"/>
+        </w:trPr>
+        <w:tc>
+          <w:tcPr>
+            <w:tcW w:type="dxa" w:w="1692"/>
+            <w:tcBorders>
+              <w:top w:val="single" w:color="9AA9B8" w:sz="4"/>
+              <w:left w:val="single" w:color="9AA9B8" w:sz="4"/>
+              <w:bottom w:val="single" w:color="9AA9B8" w:sz="4"/>
+              <w:right w:val="single" w:color="9AA9B8" w:sz="4"/>
+            </w:tcBorders>
+            <w:tcMar>
+              <w:top w:type="dxa" w:w="50"/>
+              <w:left w:type="dxa" w:w="90"/>
+              <w:bottom w:type="dxa" w:w="50"/>
+              <w:right w:type="dxa" w:w="90"/>
+            </w:tcMar>
+          </w:tcPr>
+          <w:p>
+            <w:r>
+              <w:rPr>
+                <w:rFonts w:ascii="Consolas" w:cs="Consolas" w:eastAsia="Consolas" w:hAnsi="Consolas"/>
+                <w:sz w:val="18"/>
+                <w:szCs w:val="18"/>
+              </w:rPr>
+              <w:t xml:space="preserve">OfflineAssistant</w:t>
+            </w:r>
+          </w:p>
+        </w:tc>
+        <w:tc>
+          <w:tcPr>
+            <w:tcW w:type="dxa" w:w="1692"/>
+            <w:tcBorders>
+              <w:top w:val="single" w:color="9AA9B8" w:sz="4"/>
+              <w:left w:val="single" w:color="9AA9B8" w:sz="4"/>
+              <w:bottom w:val="single" w:color="9AA9B8" w:sz="4"/>
+              <w:right w:val="single" w:color="9AA9B8" w:sz="4"/>
+            </w:tcBorders>
+            <w:tcMar>
+              <w:top w:type="dxa" w:w="50"/>
+              <w:left w:type="dxa" w:w="90"/>
+              <w:bottom w:type="dxa" w:w="50"/>
+              <w:right w:type="dxa" w:w="90"/>
+            </w:tcMar>
+          </w:tcPr>
+          <w:p>
+            <w:r>
+              <w:rPr>
+                <w:rFonts w:ascii="Consolas" w:cs="Consolas" w:eastAsia="Consolas" w:hAnsi="Consolas"/>
+                <w:sz w:val="18"/>
+                <w:szCs w:val="18"/>
+              </w:rPr>
+              <w:t xml:space="preserve">Assistant</w:t>
+            </w:r>
+          </w:p>
+        </w:tc>
+        <w:tc>
+          <w:tcPr>
+            <w:tcW w:type="dxa" w:w="5642"/>
+            <w:tcBorders>
+              <w:top w:val="single" w:color="9AA9B8" w:sz="4"/>
+              <w:left w:val="single" w:color="9AA9B8" w:sz="4"/>
+              <w:bottom w:val="single" w:color="9AA9B8" w:sz="4"/>
+              <w:right w:val="single" w:color="9AA9B8" w:sz="4"/>
+            </w:tcBorders>
+            <w:tcMar>
+              <w:top w:type="dxa" w:w="50"/>
+              <w:left w:type="dxa" w:w="90"/>
+              <w:bottom w:type="dxa" w:w="50"/>
+              <w:right w:type="dxa" w:w="90"/>
+            </w:tcMar>
+          </w:tcPr>
+          <w:p>
+            <w:r>
+              <w:rPr>
+                <w:sz w:val="18"/>
+                <w:szCs w:val="18"/>
+              </w:rPr>
+              <w:t xml:space="preserve">Answers by rule (why a payment was refused, what records show) and turns requests such as "deposit 5,000 into CUR-001" or "report CARD-004 stolen" into a </w:t>
+            </w:r>
+            <w:r>
+              <w:rPr>
+                <w:rFonts w:ascii="Consolas" w:cs="Consolas" w:eastAsia="Consolas" w:hAnsi="Consolas"/>
+                <w:sz w:val="18"/>
+                <w:szCs w:val="18"/>
+              </w:rPr>
+              <w:t xml:space="preserve">FormAction</w:t>
+            </w:r>
+            <w:r>
+              <w:rPr>
+                <w:sz w:val="18"/>
+                <w:szCs w:val="18"/>
+              </w:rPr>
+              <w:t xml:space="preserve">. Needs no package, key or internet</w:t>
+            </w:r>
+          </w:p>
+        </w:tc>
+      </w:tr>
+      <w:tr>
+        <w:trPr>
+          <w:tblHeader w:val="false"/>
+        </w:trPr>
+        <w:tc>
+          <w:tcPr>
+            <w:tcW w:type="dxa" w:w="1692"/>
+            <w:tcBorders>
+              <w:top w:val="single" w:color="9AA9B8" w:sz="4"/>
+              <w:left w:val="single" w:color="9AA9B8" w:sz="4"/>
+              <w:bottom w:val="single" w:color="9AA9B8" w:sz="4"/>
+              <w:right w:val="single" w:color="9AA9B8" w:sz="4"/>
+            </w:tcBorders>
+            <w:tcMar>
+              <w:top w:type="dxa" w:w="50"/>
+              <w:left w:type="dxa" w:w="90"/>
+              <w:bottom w:type="dxa" w:w="50"/>
+              <w:right w:type="dxa" w:w="90"/>
+            </w:tcMar>
+          </w:tcPr>
+          <w:p>
+            <w:r>
+              <w:rPr>
+                <w:rFonts w:ascii="Consolas" w:cs="Consolas" w:eastAsia="Consolas" w:hAnsi="Consolas"/>
+                <w:sz w:val="18"/>
+                <w:szCs w:val="18"/>
+              </w:rPr>
+              <w:t xml:space="preserve">ClaudeAssistant</w:t>
+            </w:r>
+          </w:p>
+        </w:tc>
+        <w:tc>
+          <w:tcPr>
+            <w:tcW w:type="dxa" w:w="1692"/>
+            <w:tcBorders>
+              <w:top w:val="single" w:color="9AA9B8" w:sz="4"/>
+              <w:left w:val="single" w:color="9AA9B8" w:sz="4"/>
+              <w:bottom w:val="single" w:color="9AA9B8" w:sz="4"/>
+              <w:right w:val="single" w:color="9AA9B8" w:sz="4"/>
+            </w:tcBorders>
+            <w:tcMar>
+              <w:top w:type="dxa" w:w="50"/>
+              <w:left w:type="dxa" w:w="90"/>
+              <w:bottom w:type="dxa" w:w="50"/>
+              <w:right w:type="dxa" w:w="90"/>
+            </w:tcMar>
+          </w:tcPr>
+          <w:p>
+            <w:r>
+              <w:rPr>
+                <w:rFonts w:ascii="Consolas" w:cs="Consolas" w:eastAsia="Consolas" w:hAnsi="Consolas"/>
+                <w:sz w:val="18"/>
+                <w:szCs w:val="18"/>
+              </w:rPr>
+              <w:t xml:space="preserve">OfflineAssistant</w:t>
+            </w:r>
+          </w:p>
+        </w:tc>
+        <w:tc>
+          <w:tcPr>
+            <w:tcW w:type="dxa" w:w="5642"/>
+            <w:tcBorders>
+              <w:top w:val="single" w:color="9AA9B8" w:sz="4"/>
+              <w:left w:val="single" w:color="9AA9B8" w:sz="4"/>
+              <w:bottom w:val="single" w:color="9AA9B8" w:sz="4"/>
+              <w:right w:val="single" w:color="9AA9B8" w:sz="4"/>
+            </w:tcBorders>
+            <w:tcMar>
+              <w:top w:type="dxa" w:w="50"/>
+              <w:left w:type="dxa" w:w="90"/>
+              <w:bottom w:type="dxa" w:w="50"/>
+              <w:right w:type="dxa" w:w="90"/>
+            </w:tcMar>
+          </w:tcPr>
+          <w:p>
+            <w:r>
+              <w:rPr>
+                <w:sz w:val="18"/>
+                <w:szCs w:val="18"/>
+              </w:rPr>
+              <w:t xml:space="preserve">Sends the question and only the retrieved facts to Claude (</w:t>
+            </w:r>
+            <w:r>
+              <w:rPr>
+                <w:rFonts w:ascii="Consolas" w:cs="Consolas" w:eastAsia="Consolas" w:hAnsi="Consolas"/>
+                <w:sz w:val="18"/>
+                <w:szCs w:val="18"/>
+              </w:rPr>
+              <w:t xml:space="preserve">claude-opus-5</w:t>
+            </w:r>
+            <w:r>
+              <w:rPr>
+                <w:sz w:val="18"/>
+                <w:szCs w:val="18"/>
+              </w:rPr>
+              <w:t xml:space="preserve">, Anthropic's official </w:t>
+            </w:r>
+            <w:r>
+              <w:rPr>
+                <w:rFonts w:ascii="Consolas" w:cs="Consolas" w:eastAsia="Consolas" w:hAnsi="Consolas"/>
+                <w:sz w:val="18"/>
+                <w:szCs w:val="18"/>
+              </w:rPr>
+              <w:t xml:space="preserve">anthropic</w:t>
+            </w:r>
+            <w:r>
+              <w:rPr>
+                <w:sz w:val="18"/>
+                <w:szCs w:val="18"/>
+              </w:rPr>
+              <w:t xml:space="preserve"> package), which writes the answer, in Urdu or Roman Urdu if asked in them. It </w:t>
+            </w:r>
+            <w:r>
+              <w:rPr>
+                <w:i/>
+                <w:iCs/>
+                <w:sz w:val="18"/>
+                <w:szCs w:val="18"/>
+              </w:rPr>
+              <w:t xml:space="preserve">is</w:t>
+            </w:r>
+            <w:r>
+              <w:rPr>
+                <w:sz w:val="18"/>
+                <w:szCs w:val="18"/>
+              </w:rPr>
+              <w:t xml:space="preserve"> an offline assistant that writes better answers, so it inherits retrieval and form parsing, and falls back to the offline answer when Claude cannot be reached or declines</w:t>
+            </w:r>
+          </w:p>
+        </w:tc>
+      </w:tr>
+    </w:tbl>
+    <w:p>
+      <w:pPr>
+        <w:spacing w:after="60"/>
+      </w:pPr>
+    </w:p>
+    <w:p>
+      <w:r>
+        <w:rPr>
+          <w:rFonts w:ascii="Consolas" w:cs="Consolas" w:eastAsia="Consolas" w:hAnsi="Consolas"/>
+          <w:sz w:val="19"/>
+          <w:szCs w:val="19"/>
+        </w:rPr>
+        <w:t xml:space="preserve">FormAction</w:t>
+      </w:r>
+      <w:r>
+        <w:t xml:space="preserve">, </w:t>
+      </w:r>
+      <w:r>
+        <w:rPr>
+          <w:rFonts w:ascii="Consolas" w:cs="Consolas" w:eastAsia="Consolas" w:hAnsi="Consolas"/>
+          <w:sz w:val="19"/>
+          <w:szCs w:val="19"/>
+        </w:rPr>
+        <w:t xml:space="preserve">Reply</w:t>
+      </w:r>
+      <w:r>
+        <w:t xml:space="preserve"> and </w:t>
+      </w:r>
+      <w:r>
+        <w:rPr>
+          <w:rFonts w:ascii="Consolas" w:cs="Consolas" w:eastAsia="Consolas" w:hAnsi="Consolas"/>
+          <w:sz w:val="19"/>
+          <w:szCs w:val="19"/>
+        </w:rPr>
+        <w:t xml:space="preserve">Exchange</w:t>
+      </w:r>
+      <w:r>
+        <w:t xml:space="preserve"> are standalone value classes. </w:t>
+      </w:r>
+      <w:r>
+        <w:rPr>
+          <w:rFonts w:ascii="Consolas" w:cs="Consolas" w:eastAsia="Consolas" w:hAnsi="Consolas"/>
+          <w:sz w:val="19"/>
+          <w:szCs w:val="19"/>
+        </w:rPr>
+        <w:t xml:space="preserve">ClaudeAssistant</w:t>
+      </w:r>
+      <w:r>
+        <w:t xml:space="preserve"> extends </w:t>
+      </w:r>
+      <w:r>
+        <w:rPr>
+          <w:rFonts w:ascii="Consolas" w:cs="Consolas" w:eastAsia="Consolas" w:hAnsi="Consolas"/>
+          <w:sz w:val="19"/>
+          <w:szCs w:val="19"/>
+        </w:rPr>
+        <w:t xml:space="preserve">OfflineAssistant</w:t>
+      </w:r>
+      <w:r>
+        <w:t xml:space="preserve"> rather than being a sibling because it needs every offline behaviour: the fallback answer, the retrieval and the form parser.</w:t>
+      </w:r>
+    </w:p>
+    <w:p>
+      <w:r>
+        <w:rPr>
+          <w:b/>
+          <w:bCs/>
+        </w:rPr>
+        <w:t xml:space="preserve">Rules that keep the bank's rules in charge.</w:t>
+      </w:r>
+    </w:p>
+    <w:p>
+      <w:r>
+        <w:t xml:space="preserve">- </w:t>
+      </w:r>
+      <w:r>
+        <w:rPr>
+          <w:b/>
+          <w:bCs/>
+        </w:rPr>
+        <w:t xml:space="preserve">Reads and pre-fills only.</w:t>
+      </w:r>
+      <w:r>
+        <w:t xml:space="preserve"> The assistant cannot run an operation. It prepares one of six listed forms (</w:t>
+      </w:r>
+      <w:r>
+        <w:rPr>
+          <w:rFonts w:ascii="Consolas" w:cs="Consolas" w:eastAsia="Consolas" w:hAnsi="Consolas"/>
+          <w:sz w:val="19"/>
+          <w:szCs w:val="19"/>
+        </w:rPr>
+        <w:t xml:space="preserve">FORMS</w:t>
+      </w:r>
+      <w:r>
+        <w:t xml:space="preserve">), and never the "performed by" field. A person checks the form and presses Run, so authority checks, refusals and the audit log apply exactly as for a form filled by hand.</w:t>
+      </w:r>
+    </w:p>
+    <w:p>
+      <w:r>
+        <w:t xml:space="preserve">- </w:t>
+      </w:r>
+      <w:r>
+        <w:rPr>
+          <w:b/>
+          <w:bCs/>
+        </w:rPr>
+        <w:t xml:space="preserve">Validated suggestions.</w:t>
+      </w:r>
+      <w:r>
+        <w:t xml:space="preserve"> A suggestion from Claude that names another operation or field is discarded, never run.</w:t>
+      </w:r>
+    </w:p>
+    <w:p>
+      <w:r>
+        <w:t xml:space="preserve">- </w:t>
+      </w:r>
+      <w:r>
+        <w:rPr>
+          <w:b/>
+          <w:bCs/>
+        </w:rPr>
+        <w:t xml:space="preserve">Minimum data.</w:t>
+      </w:r>
+      <w:r>
+        <w:t xml:space="preserve"> Claude sees only the facts retrieved for the question, not the whole bank.</w:t>
+      </w:r>
+    </w:p>
+    <w:p>
+      <w:r>
+        <w:t xml:space="preserve">- </w:t>
+      </w:r>
+      <w:r>
+        <w:rPr>
+          <w:b/>
+          <w:bCs/>
+        </w:rPr>
+        <w:t xml:space="preserve">No secrets in the code.</w:t>
+      </w:r>
+      <w:r>
+        <w:t xml:space="preserve"> The API key is read from the environment on the user's computer.</w:t>
+      </w:r>
+    </w:p>
+    <w:p>
+      <w:r>
+        <w:rPr>
+          <w:b/>
+          <w:bCs/>
+        </w:rPr>
+        <w:t xml:space="preserve">Tested without the internet.</w:t>
+      </w:r>
+      <w:r>
+        <w:t xml:space="preserve"> Nine unit tests (</w:t>
+      </w:r>
+      <w:r>
+        <w:rPr>
+          <w:rFonts w:ascii="Consolas" w:cs="Consolas" w:eastAsia="Consolas" w:hAnsi="Consolas"/>
+          <w:sz w:val="19"/>
+          <w:szCs w:val="19"/>
+        </w:rPr>
+        <w:t xml:space="preserve">python banking_assistant.py --test</w:t>
+      </w:r>
+      <w:r>
+        <w:t xml:space="preserve">, run on GitHub for every push) cover the refusal explanation, form preparation that posts nothing, the rejected suggestion, the fallback when Claude is unreachable, and the kept conversation. In them Claude is replaced by a stand-in object. The GUI smoke test asks the assistant for a deposit, opens the prepared form, runs it and checks that exactly one PKR 5,000 deposit was posted.</w:t>
+      </w:r>
+    </w:p>
+    <w:p>
+      <w:r>
+        <w:rPr>
+          <w:b/>
+          <w:bCs/>
+        </w:rPr>
+        <w:t xml:space="preserve">Figure 22. The assistant:</w:t>
+      </w:r>
+      <w:r>
+        <w:t xml:space="preserve"> it explains a refused payment from the record, lists the payments waiting, and prepares a deposit form that the user opens, checks and runs.</w:t>
+      </w:r>
+    </w:p>
+    <w:p>
+      <w:pPr>
+        <w:jc w:val="center"/>
+      </w:pPr>
+      <w:r>
+        <w:drawing>
+          <wp:inline distT="0" distB="0" distL="0" distR="0">
+            <wp:extent cx="5905500" cy="3609975"/>
+            <wp:effectExtent t="0" r="0" b="0" l="0"/>
+            <wp:docPr id="1" name="" descr="" title=""/>
+            <wp:cNvGraphicFramePr>
+              <a:graphicFrameLocks xmlns:a="http://schemas.openxmlformats.org/drawingml/2006/main" noChangeAspect="1"/>
+            </wp:cNvGraphicFramePr>
+            <a:graphic xmlns:a="http://schemas.openxmlformats.org/drawingml/2006/main">
+              <a:graphicData uri="http://schemas.openxmlformats.org/drawingml/2006/picture">
+                <pic:pic xmlns:pic="http://schemas.openxmlformats.org/drawingml/2006/picture">
+                  <pic:nvPicPr>
+                    <pic:cNvPr id="0" name="" descr=""/>
+                    <pic:cNvPicPr>
+                      <a:picLocks noChangeAspect="1" noChangeArrowheads="1"/>
+                    </pic:cNvPicPr>
+                  </pic:nvPicPr>
+                  <pic:blipFill>
+                    <a:blip r:embed="rId39" cstate="none"/>
                     <a:srcRect/>
                     <a:stretch>
                       <a:fillRect/>

</xml_diff>

<commit_message>
Step 3: summary at a glance at the front of the design report
Co-Authored-By: Claude Opus 5.5 <noreply@anthropic.com>
Claude-Session: https://claude.ai/code/session_01SahYJB3mwF36eBHRbWfj6o
</commit_message>
<xml_diff>
--- a/docs/Design_Report.docx
+++ b/docs/Design_Report.docx
@@ -1085,7 +1085,7 @@
                 <w:sz w:val="18"/>
                 <w:szCs w:val="18"/>
               </w:rPr>
-              <w:t xml:space="preserve"> (staff console and digital banking)</w:t>
+              <w:t xml:space="preserve"> (staff console and digital banking); 11.1 optional AI assistant</w:t>
             </w:r>
           </w:p>
         </w:tc>
@@ -1095,6 +1095,361 @@
       <w:pPr>
         <w:spacing w:after="60"/>
       </w:pPr>
+    </w:p>
+    <w:p>
+      <w:pPr>
+        <w:pStyle w:val="Heading1"/>
+      </w:pPr>
+      <w:r>
+        <w:t xml:space="preserve">Summary at a glance</w:t>
+      </w:r>
+    </w:p>
+    <w:p>
+      <w:r>
+        <w:t xml:space="preserve">The essentials of each required item, for a quick read. Each section below gives the detail.</w:t>
+      </w:r>
+    </w:p>
+    <w:p>
+      <w:pPr>
+        <w:pStyle w:val="ListParagraph"/>
+        <w:numPr>
+          <w:ilvl w:val="0"/>
+          <w:numId w:val="2"/>
+        </w:numPr>
+      </w:pPr>
+      <w:r>
+        <w:rPr>
+          <w:b/>
+          <w:bCs/>
+        </w:rPr>
+        <w:t xml:space="preserve">Research.</w:t>
+      </w:r>
+      <w:r>
+        <w:t xml:space="preserve"> Eight sources (FATF, State Bank of Pakistan, Basel Committee, ISO 20022, Visa and Mastercard dispute rules, IFRS 9, BIAN, Fowler's </w:t>
+      </w:r>
+      <w:r>
+        <w:rPr>
+          <w:i/>
+          <w:iCs/>
+        </w:rPr>
+        <w:t xml:space="preserve">Analysis Patterns</w:t>
+      </w:r>
+      <w:r>
+        <w:t xml:space="preserve">) and a 27-term glossary. The research changed eight first ideas; for example, customer, director and signatory are </w:t>
+      </w:r>
+      <w:r>
+        <w:rPr>
+          <w:i/>
+          <w:iCs/>
+        </w:rPr>
+        <w:t xml:space="preserve">roles</w:t>
+      </w:r>
+      <w:r>
+        <w:t xml:space="preserve"> of one person, not subclasses.</w:t>
+      </w:r>
+    </w:p>
+    <w:p>
+      <w:pPr>
+        <w:pStyle w:val="ListParagraph"/>
+        <w:numPr>
+          <w:ilvl w:val="0"/>
+          <w:numId w:val="2"/>
+        </w:numPr>
+      </w:pPr>
+      <w:r>
+        <w:rPr>
+          <w:b/>
+          <w:bCs/>
+        </w:rPr>
+        <w:t xml:space="preserve">Assumptions.</w:t>
+      </w:r>
+      <w:r>
+        <w:t xml:space="preserve"> 36 numbered decisions where the brief is silent, for example: a sole trader is a </w:t>
+      </w:r>
+      <w:r>
+        <w:rPr>
+          <w:rFonts w:ascii="Consolas" w:cs="Consolas" w:eastAsia="Consolas" w:hAnsi="Consolas"/>
+          <w:sz w:val="19"/>
+          <w:szCs w:val="19"/>
+        </w:rPr>
+        <w:t xml:space="preserve">Person</w:t>
+      </w:r>
+      <w:r>
+        <w:t xml:space="preserve">; a charity needs two trustees; owners of 25% or more must be verified; payments above a mandate's threshold need a second signatory.</w:t>
+      </w:r>
+    </w:p>
+    <w:p>
+      <w:pPr>
+        <w:pStyle w:val="ListParagraph"/>
+        <w:numPr>
+          <w:ilvl w:val="0"/>
+          <w:numId w:val="2"/>
+        </w:numPr>
+      </w:pPr>
+      <w:r>
+        <w:rPr>
+          <w:b/>
+          <w:bCs/>
+        </w:rPr>
+        <w:t xml:space="preserve">Requirements.</w:t>
+      </w:r>
+      <w:r>
+        <w:t xml:space="preserve"> The model must keep history when anything changes: documents expire, people lose authority, products close, cards are replaced, loans are restructured, branches close. Nothing is overwritten or deleted; changes are new records with dates.</w:t>
+      </w:r>
+    </w:p>
+    <w:p>
+      <w:pPr>
+        <w:pStyle w:val="ListParagraph"/>
+        <w:numPr>
+          <w:ilvl w:val="0"/>
+          <w:numId w:val="2"/>
+        </w:numPr>
+      </w:pPr>
+      <w:r>
+        <w:rPr>
+          <w:b/>
+          <w:bCs/>
+        </w:rPr>
+        <w:t xml:space="preserve">Class model.</w:t>
+      </w:r>
+      <w:r>
+        <w:t xml:space="preserve"> Four hierarchies (</w:t>
+      </w:r>
+      <w:r>
+        <w:rPr>
+          <w:rFonts w:ascii="Consolas" w:cs="Consolas" w:eastAsia="Consolas" w:hAnsi="Consolas"/>
+          <w:sz w:val="19"/>
+          <w:szCs w:val="19"/>
+        </w:rPr>
+        <w:t xml:space="preserve">Party</w:t>
+      </w:r>
+      <w:r>
+        <w:t xml:space="preserve">, </w:t>
+      </w:r>
+      <w:r>
+        <w:rPr>
+          <w:rFonts w:ascii="Consolas" w:cs="Consolas" w:eastAsia="Consolas" w:hAnsi="Consolas"/>
+          <w:sz w:val="19"/>
+          <w:szCs w:val="19"/>
+        </w:rPr>
+        <w:t xml:space="preserve">Arrangement</w:t>
+      </w:r>
+      <w:r>
+        <w:t xml:space="preserve">, </w:t>
+      </w:r>
+      <w:r>
+        <w:rPr>
+          <w:rFonts w:ascii="Consolas" w:cs="Consolas" w:eastAsia="Consolas" w:hAnsi="Consolas"/>
+          <w:sz w:val="19"/>
+          <w:szCs w:val="19"/>
+        </w:rPr>
+        <w:t xml:space="preserve">BankTransaction</w:t>
+      </w:r>
+      <w:r>
+        <w:t xml:space="preserve">, </w:t>
+      </w:r>
+      <w:r>
+        <w:rPr>
+          <w:rFonts w:ascii="Consolas" w:cs="Consolas" w:eastAsia="Consolas" w:hAnsi="Consolas"/>
+          <w:sz w:val="19"/>
+          <w:szCs w:val="19"/>
+        </w:rPr>
+        <w:t xml:space="preserve">Case</w:t>
+      </w:r>
+      <w:r>
+        <w:t xml:space="preserve">) plus standalone classes linked by association (cards, mandates, branches, employees, products). Diagrams: class overview, UML per hierarchy, associations, six flowcharts, four state machines.</w:t>
+      </w:r>
+    </w:p>
+    <w:p>
+      <w:pPr>
+        <w:pStyle w:val="ListParagraph"/>
+        <w:numPr>
+          <w:ilvl w:val="0"/>
+          <w:numId w:val="2"/>
+        </w:numPr>
+      </w:pPr>
+      <w:r>
+        <w:rPr>
+          <w:b/>
+          <w:bCs/>
+        </w:rPr>
+        <w:t xml:space="preserve">Implementation.</w:t>
+      </w:r>
+      <w:r>
+        <w:t xml:space="preserve"> One file, standard library only: 71 business classes (plus 6 supporting), 98 operations (80 change state), 73 automated tests, a double-entry ledger whose trial balance is always zero.</w:t>
+      </w:r>
+    </w:p>
+    <w:p>
+      <w:pPr>
+        <w:pStyle w:val="ListParagraph"/>
+        <w:numPr>
+          <w:ilvl w:val="0"/>
+          <w:numId w:val="2"/>
+        </w:numPr>
+      </w:pPr>
+      <w:r>
+        <w:rPr>
+          <w:b/>
+          <w:bCs/>
+        </w:rPr>
+        <w:t xml:space="preserve">Inheritance.</w:t>
+      </w:r>
+      <w:r>
+        <w:t xml:space="preserve"> Four multi-level hierarchies, for example </w:t>
+      </w:r>
+      <w:r>
+        <w:rPr>
+          <w:rFonts w:ascii="Consolas" w:cs="Consolas" w:eastAsia="Consolas" w:hAnsi="Consolas"/>
+          <w:sz w:val="19"/>
+          <w:szCs w:val="19"/>
+        </w:rPr>
+        <w:t xml:space="preserve">Party › Organization › Company</w:t>
+      </w:r>
+      <w:r>
+        <w:t xml:space="preserve"> and </w:t>
+      </w:r>
+      <w:r>
+        <w:rPr>
+          <w:rFonts w:ascii="Consolas" w:cs="Consolas" w:eastAsia="Consolas" w:hAnsi="Consolas"/>
+          <w:sz w:val="19"/>
+          <w:szCs w:val="19"/>
+        </w:rPr>
+        <w:t xml:space="preserve">BankTransaction › Reversal › Chargeback</w:t>
+      </w:r>
+      <w:r>
+        <w:t xml:space="preserve">. Shared data sits at the highest level every subclass needs, and each subclass changes one behaviour (for example, </w:t>
+      </w:r>
+      <w:r>
+        <w:rPr>
+          <w:rFonts w:ascii="Consolas" w:cs="Consolas" w:eastAsia="Consolas" w:hAnsi="Consolas"/>
+          <w:sz w:val="19"/>
+          <w:szCs w:val="19"/>
+        </w:rPr>
+        <w:t xml:space="preserve">SavingsAccount.check_debit</w:t>
+      </w:r>
+      <w:r>
+        <w:t xml:space="preserve"> adds a monthly withdrawal limit).</w:t>
+      </w:r>
+    </w:p>
+    <w:p>
+      <w:pPr>
+        <w:pStyle w:val="ListParagraph"/>
+        <w:numPr>
+          <w:ilvl w:val="0"/>
+          <w:numId w:val="2"/>
+        </w:numPr>
+      </w:pPr>
+      <w:r>
+        <w:rPr>
+          <w:b/>
+          <w:bCs/>
+        </w:rPr>
+        <w:t xml:space="preserve">Rejected inheritance.</w:t>
+      </w:r>
+      <w:r>
+        <w:t xml:space="preserve"> Fourteen rejected, for example </w:t>
+      </w:r>
+      <w:r>
+        <w:rPr>
+          <w:rFonts w:ascii="Consolas" w:cs="Consolas" w:eastAsia="Consolas" w:hAnsi="Consolas"/>
+          <w:sz w:val="19"/>
+          <w:szCs w:val="19"/>
+        </w:rPr>
+        <w:t xml:space="preserve">Customer(Person)</w:t>
+      </w:r>
+      <w:r>
+        <w:t xml:space="preserve"> (a role, not a kind), </w:t>
+      </w:r>
+      <w:r>
+        <w:rPr>
+          <w:rFonts w:ascii="Consolas" w:cs="Consolas" w:eastAsia="Consolas" w:hAnsi="Consolas"/>
+          <w:sz w:val="19"/>
+          <w:szCs w:val="19"/>
+        </w:rPr>
+        <w:t xml:space="preserve">Card(Account)</w:t>
+      </w:r>
+      <w:r>
+        <w:t xml:space="preserve"> (holds no money), </w:t>
+      </w:r>
+      <w:r>
+        <w:rPr>
+          <w:rFonts w:ascii="Consolas" w:cs="Consolas" w:eastAsia="Consolas" w:hAnsi="Consolas"/>
+          <w:sz w:val="19"/>
+          <w:szCs w:val="19"/>
+        </w:rPr>
+        <w:t xml:space="preserve">SoleTrader(Organization)</w:t>
+      </w:r>
+      <w:r>
+        <w:t xml:space="preserve"> (legally the person) and </w:t>
+      </w:r>
+      <w:r>
+        <w:rPr>
+          <w:rFonts w:ascii="Consolas" w:cs="Consolas" w:eastAsia="Consolas" w:hAnsi="Consolas"/>
+          <w:sz w:val="19"/>
+          <w:szCs w:val="19"/>
+        </w:rPr>
+        <w:t xml:space="preserve">MerchantRefund(Reversal)</w:t>
+      </w:r>
+      <w:r>
+        <w:t xml:space="preserve"> (the purchase stays valid). The design is compared with an account-centric alternative on ten critical cases.</w:t>
+      </w:r>
+    </w:p>
+    <w:p>
+      <w:pPr>
+        <w:pStyle w:val="ListParagraph"/>
+        <w:numPr>
+          <w:ilvl w:val="0"/>
+          <w:numId w:val="2"/>
+        </w:numPr>
+      </w:pPr>
+      <w:r>
+        <w:rPr>
+          <w:b/>
+          <w:bCs/>
+        </w:rPr>
+        <w:t xml:space="preserve">Seeded demonstration.</w:t>
+      </w:r>
+      <w:r>
+        <w:t xml:space="preserve"> One bank, 3 branches, 10 staff, 20 people, a company, a charity, accounts, cards and financing, run on a simulated calendar from January 2026 to August 2027.</w:t>
+      </w:r>
+    </w:p>
+    <w:p>
+      <w:pPr>
+        <w:pStyle w:val="ListParagraph"/>
+        <w:numPr>
+          <w:ilvl w:val="0"/>
+          <w:numId w:val="2"/>
+        </w:numPr>
+      </w:pPr>
+      <w:r>
+        <w:rPr>
+          <w:b/>
+          <w:bCs/>
+        </w:rPr>
+        <w:t xml:space="preserve">Complex scenarios.</w:t>
+      </w:r>
+      <w:r>
+        <w:t xml:space="preserve"> Sixteen, covering every critical case in the brief, for example: onboarding blocked by an expiring document; a transfer held, then released; a card stolen and replaced twice; a loan restructured after paid instalments; a branch closed and its customers moved.</w:t>
+      </w:r>
+    </w:p>
+    <w:p>
+      <w:pPr>
+        <w:pStyle w:val="ListParagraph"/>
+        <w:numPr>
+          <w:ilvl w:val="0"/>
+          <w:numId w:val="2"/>
+        </w:numPr>
+      </w:pPr>
+      <w:r>
+        <w:rPr>
+          <w:b/>
+          <w:bCs/>
+        </w:rPr>
+        <w:t xml:space="preserve">Limitations.</w:t>
+      </w:r>
+      <w:r>
+        <w:t xml:space="preserve"> A single currency, in-memory storage, simplified interest, two-signatory dual control only. Growing larger would need a database, concurrency control, multiple currencies and configurable approval rules; section 10 maps each change to the classes it affects.</w:t>
+      </w:r>
     </w:p>
     <w:p>
       <w:pPr>

</xml_diff>

<commit_message>
Step 6: strict class-count audit (report 5.1); correct RiskCase.close description
Co-Authored-By: Claude Opus 5.5 <noreply@anthropic.com>
Claude-Session: https://claude.ai/code/session_01SahYJB3mwF36eBHRbWfj6o
</commit_message>
<xml_diff>
--- a/docs/Design_Report.docx
+++ b/docs/Design_Report.docx
@@ -21959,6 +21959,831 @@
       </w:r>
       <w:r>
         <w:t xml:space="preserve"> is bypassed, lifecycles are inherited and extended, and every state machine is well formed).</w:t>
+      </w:r>
+    </w:p>
+    <w:p>
+      <w:pPr>
+        <w:pStyle w:val="Heading2"/>
+      </w:pPr>
+      <w:r>
+        <w:t xml:space="preserve">5.1 How the class count holds up under a strict reading</w:t>
+      </w:r>
+    </w:p>
+    <w:p>
+      <w:r>
+        <w:t xml:space="preserve">The brief says artificial classes added only to meet a count do not qualify. So every one of the 71 business classes was sorted by what it actually contains (the six supporting classes are already counted separately):</w:t>
+      </w:r>
+    </w:p>
+    <w:tbl>
+      <w:tblPr>
+        <w:tblW w:type="dxa" w:w="9026"/>
+        <w:tblBorders>
+          <w:top w:val="single" w:color="auto" w:sz="4"/>
+          <w:left w:val="single" w:color="auto" w:sz="4"/>
+          <w:bottom w:val="single" w:color="auto" w:sz="4"/>
+          <w:right w:val="single" w:color="auto" w:sz="4"/>
+          <w:insideH w:val="single" w:color="auto" w:sz="4"/>
+          <w:insideV w:val="single" w:color="auto" w:sz="4"/>
+        </w:tblBorders>
+      </w:tblPr>
+      <w:tblGrid>
+        <w:gridCol w:w="1805"/>
+        <w:gridCol w:w="451"/>
+        <w:gridCol w:w="3384"/>
+        <w:gridCol w:w="3386"/>
+      </w:tblGrid>
+      <w:tr>
+        <w:trPr>
+          <w:tblHeader/>
+        </w:trPr>
+        <w:tc>
+          <w:tcPr>
+            <w:tcW w:type="dxa" w:w="1805"/>
+            <w:tcBorders>
+              <w:top w:val="single" w:color="9AA9B8" w:sz="4"/>
+              <w:left w:val="single" w:color="9AA9B8" w:sz="4"/>
+              <w:bottom w:val="single" w:color="9AA9B8" w:sz="4"/>
+              <w:right w:val="single" w:color="9AA9B8" w:sz="4"/>
+            </w:tcBorders>
+            <w:shd w:fill="DDE7F0" w:color="auto" w:val="clear"/>
+            <w:tcMar>
+              <w:top w:type="dxa" w:w="50"/>
+              <w:left w:type="dxa" w:w="90"/>
+              <w:bottom w:type="dxa" w:w="50"/>
+              <w:right w:type="dxa" w:w="90"/>
+            </w:tcMar>
+          </w:tcPr>
+          <w:p>
+            <w:r>
+              <w:rPr>
+                <w:b/>
+                <w:bCs/>
+                <w:sz w:val="18"/>
+                <w:szCs w:val="18"/>
+              </w:rPr>
+              <w:t xml:space="preserve">Group</w:t>
+            </w:r>
+          </w:p>
+        </w:tc>
+        <w:tc>
+          <w:tcPr>
+            <w:tcW w:type="dxa" w:w="451"/>
+            <w:tcBorders>
+              <w:top w:val="single" w:color="9AA9B8" w:sz="4"/>
+              <w:left w:val="single" w:color="9AA9B8" w:sz="4"/>
+              <w:bottom w:val="single" w:color="9AA9B8" w:sz="4"/>
+              <w:right w:val="single" w:color="9AA9B8" w:sz="4"/>
+            </w:tcBorders>
+            <w:shd w:fill="DDE7F0" w:color="auto" w:val="clear"/>
+            <w:tcMar>
+              <w:top w:type="dxa" w:w="50"/>
+              <w:left w:type="dxa" w:w="90"/>
+              <w:bottom w:type="dxa" w:w="50"/>
+              <w:right w:type="dxa" w:w="90"/>
+            </w:tcMar>
+          </w:tcPr>
+          <w:p>
+            <w:r>
+              <w:rPr>
+                <w:b/>
+                <w:bCs/>
+                <w:sz w:val="18"/>
+                <w:szCs w:val="18"/>
+              </w:rPr>
+              <w:t xml:space="preserve">Count</w:t>
+            </w:r>
+          </w:p>
+        </w:tc>
+        <w:tc>
+          <w:tcPr>
+            <w:tcW w:type="dxa" w:w="3384"/>
+            <w:tcBorders>
+              <w:top w:val="single" w:color="9AA9B8" w:sz="4"/>
+              <w:left w:val="single" w:color="9AA9B8" w:sz="4"/>
+              <w:bottom w:val="single" w:color="9AA9B8" w:sz="4"/>
+              <w:right w:val="single" w:color="9AA9B8" w:sz="4"/>
+            </w:tcBorders>
+            <w:shd w:fill="DDE7F0" w:color="auto" w:val="clear"/>
+            <w:tcMar>
+              <w:top w:type="dxa" w:w="50"/>
+              <w:left w:type="dxa" w:w="90"/>
+              <w:bottom w:type="dxa" w:w="50"/>
+              <w:right w:type="dxa" w:w="90"/>
+            </w:tcMar>
+          </w:tcPr>
+          <w:p>
+            <w:r>
+              <w:rPr>
+                <w:b/>
+                <w:bCs/>
+                <w:sz w:val="18"/>
+                <w:szCs w:val="18"/>
+              </w:rPr>
+              <w:t xml:space="preserve">What qualifies a class</w:t>
+            </w:r>
+          </w:p>
+        </w:tc>
+        <w:tc>
+          <w:tcPr>
+            <w:tcW w:type="dxa" w:w="3386"/>
+            <w:tcBorders>
+              <w:top w:val="single" w:color="9AA9B8" w:sz="4"/>
+              <w:left w:val="single" w:color="9AA9B8" w:sz="4"/>
+              <w:bottom w:val="single" w:color="9AA9B8" w:sz="4"/>
+              <w:right w:val="single" w:color="9AA9B8" w:sz="4"/>
+            </w:tcBorders>
+            <w:shd w:fill="DDE7F0" w:color="auto" w:val="clear"/>
+            <w:tcMar>
+              <w:top w:type="dxa" w:w="50"/>
+              <w:left w:type="dxa" w:w="90"/>
+              <w:bottom w:type="dxa" w:w="50"/>
+              <w:right w:type="dxa" w:w="90"/>
+            </w:tcMar>
+          </w:tcPr>
+          <w:p>
+            <w:r>
+              <w:rPr>
+                <w:b/>
+                <w:bCs/>
+                <w:sz w:val="18"/>
+                <w:szCs w:val="18"/>
+              </w:rPr>
+              <w:t xml:space="preserve">Examples</w:t>
+            </w:r>
+          </w:p>
+        </w:tc>
+      </w:tr>
+      <w:tr>
+        <w:trPr>
+          <w:tblHeader w:val="false"/>
+        </w:trPr>
+        <w:tc>
+          <w:tcPr>
+            <w:tcW w:type="dxa" w:w="1805"/>
+            <w:tcBorders>
+              <w:top w:val="single" w:color="9AA9B8" w:sz="4"/>
+              <w:left w:val="single" w:color="9AA9B8" w:sz="4"/>
+              <w:bottom w:val="single" w:color="9AA9B8" w:sz="4"/>
+              <w:right w:val="single" w:color="9AA9B8" w:sz="4"/>
+            </w:tcBorders>
+            <w:tcMar>
+              <w:top w:type="dxa" w:w="50"/>
+              <w:left w:type="dxa" w:w="90"/>
+              <w:bottom w:type="dxa" w:w="50"/>
+              <w:right w:type="dxa" w:w="90"/>
+            </w:tcMar>
+          </w:tcPr>
+          <w:p>
+            <w:r>
+              <w:rPr>
+                <w:sz w:val="18"/>
+                <w:szCs w:val="18"/>
+              </w:rPr>
+              <w:t xml:space="preserve">Classes with their own behaviour</w:t>
+            </w:r>
+          </w:p>
+        </w:tc>
+        <w:tc>
+          <w:tcPr>
+            <w:tcW w:type="dxa" w:w="451"/>
+            <w:tcBorders>
+              <w:top w:val="single" w:color="9AA9B8" w:sz="4"/>
+              <w:left w:val="single" w:color="9AA9B8" w:sz="4"/>
+              <w:bottom w:val="single" w:color="9AA9B8" w:sz="4"/>
+              <w:right w:val="single" w:color="9AA9B8" w:sz="4"/>
+            </w:tcBorders>
+            <w:tcMar>
+              <w:top w:type="dxa" w:w="50"/>
+              <w:left w:type="dxa" w:w="90"/>
+              <w:bottom w:type="dxa" w:w="50"/>
+              <w:right w:type="dxa" w:w="90"/>
+            </w:tcMar>
+          </w:tcPr>
+          <w:p>
+            <w:r>
+              <w:rPr>
+                <w:sz w:val="18"/>
+                <w:szCs w:val="18"/>
+              </w:rPr>
+              <w:t xml:space="preserve">48</w:t>
+            </w:r>
+          </w:p>
+        </w:tc>
+        <w:tc>
+          <w:tcPr>
+            <w:tcW w:type="dxa" w:w="3384"/>
+            <w:tcBorders>
+              <w:top w:val="single" w:color="9AA9B8" w:sz="4"/>
+              <w:left w:val="single" w:color="9AA9B8" w:sz="4"/>
+              <w:bottom w:val="single" w:color="9AA9B8" w:sz="4"/>
+              <w:right w:val="single" w:color="9AA9B8" w:sz="4"/>
+            </w:tcBorders>
+            <w:tcMar>
+              <w:top w:type="dxa" w:w="50"/>
+              <w:left w:type="dxa" w:w="90"/>
+              <w:bottom w:type="dxa" w:w="50"/>
+              <w:right w:type="dxa" w:w="90"/>
+            </w:tcMar>
+          </w:tcPr>
+          <w:p>
+            <w:r>
+              <w:rPr>
+                <w:sz w:val="18"/>
+                <w:szCs w:val="18"/>
+              </w:rPr>
+              <w:t xml:space="preserve">At least one method, override or rule of its own</w:t>
+            </w:r>
+          </w:p>
+        </w:tc>
+        <w:tc>
+          <w:tcPr>
+            <w:tcW w:type="dxa" w:w="3386"/>
+            <w:tcBorders>
+              <w:top w:val="single" w:color="9AA9B8" w:sz="4"/>
+              <w:left w:val="single" w:color="9AA9B8" w:sz="4"/>
+              <w:bottom w:val="single" w:color="9AA9B8" w:sz="4"/>
+              <w:right w:val="single" w:color="9AA9B8" w:sz="4"/>
+            </w:tcBorders>
+            <w:tcMar>
+              <w:top w:type="dxa" w:w="50"/>
+              <w:left w:type="dxa" w:w="90"/>
+              <w:bottom w:type="dxa" w:w="50"/>
+              <w:right w:type="dxa" w:w="90"/>
+            </w:tcMar>
+          </w:tcPr>
+          <w:p>
+            <w:r>
+              <w:rPr>
+                <w:rFonts w:ascii="Consolas" w:cs="Consolas" w:eastAsia="Consolas" w:hAnsi="Consolas"/>
+                <w:sz w:val="18"/>
+                <w:szCs w:val="18"/>
+              </w:rPr>
+              <w:t xml:space="preserve">Party</w:t>
+            </w:r>
+            <w:r>
+              <w:rPr>
+                <w:sz w:val="18"/>
+                <w:szCs w:val="18"/>
+              </w:rPr>
+              <w:t xml:space="preserve">, </w:t>
+            </w:r>
+            <w:r>
+              <w:rPr>
+                <w:rFonts w:ascii="Consolas" w:cs="Consolas" w:eastAsia="Consolas" w:hAnsi="Consolas"/>
+                <w:sz w:val="18"/>
+                <w:szCs w:val="18"/>
+              </w:rPr>
+              <w:t xml:space="preserve">Organization</w:t>
+            </w:r>
+            <w:r>
+              <w:rPr>
+                <w:sz w:val="18"/>
+                <w:szCs w:val="18"/>
+              </w:rPr>
+              <w:t xml:space="preserve">, </w:t>
+            </w:r>
+            <w:r>
+              <w:rPr>
+                <w:rFonts w:ascii="Consolas" w:cs="Consolas" w:eastAsia="Consolas" w:hAnsi="Consolas"/>
+                <w:sz w:val="18"/>
+                <w:szCs w:val="18"/>
+              </w:rPr>
+              <w:t xml:space="preserve">SavingsAccount</w:t>
+            </w:r>
+            <w:r>
+              <w:rPr>
+                <w:sz w:val="18"/>
+                <w:szCs w:val="18"/>
+              </w:rPr>
+              <w:t xml:space="preserve"> (monthly limit), </w:t>
+            </w:r>
+            <w:r>
+              <w:rPr>
+                <w:rFonts w:ascii="Consolas" w:cs="Consolas" w:eastAsia="Consolas" w:hAnsi="Consolas"/>
+                <w:sz w:val="18"/>
+                <w:szCs w:val="18"/>
+              </w:rPr>
+              <w:t xml:space="preserve">FixedTermDeposit</w:t>
+            </w:r>
+            <w:r>
+              <w:rPr>
+                <w:sz w:val="18"/>
+                <w:szCs w:val="18"/>
+              </w:rPr>
+              <w:t xml:space="preserve"> (no withdrawal before maturity), </w:t>
+            </w:r>
+            <w:r>
+              <w:rPr>
+                <w:rFonts w:ascii="Consolas" w:cs="Consolas" w:eastAsia="Consolas" w:hAnsi="Consolas"/>
+                <w:sz w:val="18"/>
+                <w:szCs w:val="18"/>
+              </w:rPr>
+              <w:t xml:space="preserve">Mandate</w:t>
+            </w:r>
+            <w:r>
+              <w:rPr>
+                <w:sz w:val="18"/>
+                <w:szCs w:val="18"/>
+              </w:rPr>
+              <w:t xml:space="preserve"> (limits, dual control), </w:t>
+            </w:r>
+            <w:r>
+              <w:rPr>
+                <w:rFonts w:ascii="Consolas" w:cs="Consolas" w:eastAsia="Consolas" w:hAnsi="Consolas"/>
+                <w:sz w:val="18"/>
+                <w:szCs w:val="18"/>
+              </w:rPr>
+              <w:t xml:space="preserve">CustomerPayment</w:t>
+            </w:r>
+            <w:r>
+              <w:rPr>
+                <w:sz w:val="18"/>
+                <w:szCs w:val="18"/>
+              </w:rPr>
+              <w:t xml:space="preserve">, </w:t>
+            </w:r>
+            <w:r>
+              <w:rPr>
+                <w:rFonts w:ascii="Consolas" w:cs="Consolas" w:eastAsia="Consolas" w:hAnsi="Consolas"/>
+                <w:sz w:val="18"/>
+                <w:szCs w:val="18"/>
+              </w:rPr>
+              <w:t xml:space="preserve">Reversal</w:t>
+            </w:r>
+            <w:r>
+              <w:rPr>
+                <w:sz w:val="18"/>
+                <w:szCs w:val="18"/>
+              </w:rPr>
+              <w:t xml:space="preserve">, </w:t>
+            </w:r>
+            <w:r>
+              <w:rPr>
+                <w:rFonts w:ascii="Consolas" w:cs="Consolas" w:eastAsia="Consolas" w:hAnsi="Consolas"/>
+                <w:sz w:val="18"/>
+                <w:szCs w:val="18"/>
+              </w:rPr>
+              <w:t xml:space="preserve">RiskCase</w:t>
+            </w:r>
+            <w:r>
+              <w:rPr>
+                <w:sz w:val="18"/>
+                <w:szCs w:val="18"/>
+              </w:rPr>
+              <w:t xml:space="preserve"> (cannot close while a restriction is in force)</w:t>
+            </w:r>
+          </w:p>
+        </w:tc>
+      </w:tr>
+      <w:tr>
+        <w:trPr>
+          <w:tblHeader w:val="false"/>
+        </w:trPr>
+        <w:tc>
+          <w:tcPr>
+            <w:tcW w:type="dxa" w:w="1805"/>
+            <w:tcBorders>
+              <w:top w:val="single" w:color="9AA9B8" w:sz="4"/>
+              <w:left w:val="single" w:color="9AA9B8" w:sz="4"/>
+              <w:bottom w:val="single" w:color="9AA9B8" w:sz="4"/>
+              <w:right w:val="single" w:color="9AA9B8" w:sz="4"/>
+            </w:tcBorders>
+            <w:tcMar>
+              <w:top w:type="dxa" w:w="50"/>
+              <w:left w:type="dxa" w:w="90"/>
+              <w:bottom w:type="dxa" w:w="50"/>
+              <w:right w:type="dxa" w:w="90"/>
+            </w:tcMar>
+          </w:tcPr>
+          <w:p>
+            <w:r>
+              <w:rPr>
+                <w:sz w:val="18"/>
+                <w:szCs w:val="18"/>
+              </w:rPr>
+              <w:t xml:space="preserve">Record classes that keep history</w:t>
+            </w:r>
+          </w:p>
+        </w:tc>
+        <w:tc>
+          <w:tcPr>
+            <w:tcW w:type="dxa" w:w="451"/>
+            <w:tcBorders>
+              <w:top w:val="single" w:color="9AA9B8" w:sz="4"/>
+              <w:left w:val="single" w:color="9AA9B8" w:sz="4"/>
+              <w:bottom w:val="single" w:color="9AA9B8" w:sz="4"/>
+              <w:right w:val="single" w:color="9AA9B8" w:sz="4"/>
+            </w:tcBorders>
+            <w:tcMar>
+              <w:top w:type="dxa" w:w="50"/>
+              <w:left w:type="dxa" w:w="90"/>
+              <w:bottom w:type="dxa" w:w="50"/>
+              <w:right w:type="dxa" w:w="90"/>
+            </w:tcMar>
+          </w:tcPr>
+          <w:p>
+            <w:r>
+              <w:rPr>
+                <w:sz w:val="18"/>
+                <w:szCs w:val="18"/>
+              </w:rPr>
+              <w:t xml:space="preserve">20</w:t>
+            </w:r>
+          </w:p>
+        </w:tc>
+        <w:tc>
+          <w:tcPr>
+            <w:tcW w:type="dxa" w:w="3384"/>
+            <w:tcBorders>
+              <w:top w:val="single" w:color="9AA9B8" w:sz="4"/>
+              <w:left w:val="single" w:color="9AA9B8" w:sz="4"/>
+              <w:bottom w:val="single" w:color="9AA9B8" w:sz="4"/>
+              <w:right w:val="single" w:color="9AA9B8" w:sz="4"/>
+            </w:tcBorders>
+            <w:tcMar>
+              <w:top w:type="dxa" w:w="50"/>
+              <w:left w:type="dxa" w:w="90"/>
+              <w:bottom w:type="dxa" w:w="50"/>
+              <w:right w:type="dxa" w:w="90"/>
+            </w:tcMar>
+          </w:tcPr>
+          <w:p>
+            <w:r>
+              <w:rPr>
+                <w:sz w:val="18"/>
+                <w:szCs w:val="18"/>
+              </w:rPr>
+              <w:t xml:space="preserve">Several fields, each a fact the brief requires to be kept after things change</w:t>
+            </w:r>
+          </w:p>
+        </w:tc>
+        <w:tc>
+          <w:tcPr>
+            <w:tcW w:type="dxa" w:w="3386"/>
+            <w:tcBorders>
+              <w:top w:val="single" w:color="9AA9B8" w:sz="4"/>
+              <w:left w:val="single" w:color="9AA9B8" w:sz="4"/>
+              <w:bottom w:val="single" w:color="9AA9B8" w:sz="4"/>
+              <w:right w:val="single" w:color="9AA9B8" w:sz="4"/>
+            </w:tcBorders>
+            <w:tcMar>
+              <w:top w:type="dxa" w:w="50"/>
+              <w:left w:type="dxa" w:w="90"/>
+              <w:bottom w:type="dxa" w:w="50"/>
+              <w:right w:type="dxa" w:w="90"/>
+            </w:tcMar>
+          </w:tcPr>
+          <w:p>
+            <w:r>
+              <w:rPr>
+                <w:rFonts w:ascii="Consolas" w:cs="Consolas" w:eastAsia="Consolas" w:hAnsi="Consolas"/>
+                <w:sz w:val="18"/>
+                <w:szCs w:val="18"/>
+              </w:rPr>
+              <w:t xml:space="preserve">VerificationCheck</w:t>
+            </w:r>
+            <w:r>
+              <w:rPr>
+                <w:sz w:val="18"/>
+                <w:szCs w:val="18"/>
+              </w:rPr>
+              <w:t xml:space="preserve">, </w:t>
+            </w:r>
+            <w:r>
+              <w:rPr>
+                <w:rFonts w:ascii="Consolas" w:cs="Consolas" w:eastAsia="Consolas" w:hAnsi="Consolas"/>
+                <w:sz w:val="18"/>
+                <w:szCs w:val="18"/>
+              </w:rPr>
+              <w:t xml:space="preserve">Correction</w:t>
+            </w:r>
+            <w:r>
+              <w:rPr>
+                <w:sz w:val="18"/>
+                <w:szCs w:val="18"/>
+              </w:rPr>
+              <w:t xml:space="preserve">, </w:t>
+            </w:r>
+            <w:r>
+              <w:rPr>
+                <w:rFonts w:ascii="Consolas" w:cs="Consolas" w:eastAsia="Consolas" w:hAnsi="Consolas"/>
+                <w:sz w:val="18"/>
+                <w:szCs w:val="18"/>
+              </w:rPr>
+              <w:t xml:space="preserve">OfficerRole</w:t>
+            </w:r>
+            <w:r>
+              <w:rPr>
+                <w:sz w:val="18"/>
+                <w:szCs w:val="18"/>
+              </w:rPr>
+              <w:t xml:space="preserve">, </w:t>
+            </w:r>
+            <w:r>
+              <w:rPr>
+                <w:rFonts w:ascii="Consolas" w:cs="Consolas" w:eastAsia="Consolas" w:hAnsi="Consolas"/>
+                <w:sz w:val="18"/>
+                <w:szCs w:val="18"/>
+              </w:rPr>
+              <w:t xml:space="preserve">BeneficiaryVersion</w:t>
+            </w:r>
+            <w:r>
+              <w:rPr>
+                <w:sz w:val="18"/>
+                <w:szCs w:val="18"/>
+              </w:rPr>
+              <w:t xml:space="preserve">, </w:t>
+            </w:r>
+            <w:r>
+              <w:rPr>
+                <w:rFonts w:ascii="Consolas" w:cs="Consolas" w:eastAsia="Consolas" w:hAnsi="Consolas"/>
+                <w:sz w:val="18"/>
+                <w:szCs w:val="18"/>
+              </w:rPr>
+              <w:t xml:space="preserve">PaymentAuthorisation</w:t>
+            </w:r>
+            <w:r>
+              <w:rPr>
+                <w:sz w:val="18"/>
+                <w:szCs w:val="18"/>
+              </w:rPr>
+              <w:t xml:space="preserve">, </w:t>
+            </w:r>
+            <w:r>
+              <w:rPr>
+                <w:rFonts w:ascii="Consolas" w:cs="Consolas" w:eastAsia="Consolas" w:hAnsi="Consolas"/>
+                <w:sz w:val="18"/>
+                <w:szCs w:val="18"/>
+              </w:rPr>
+              <w:t xml:space="preserve">Approval</w:t>
+            </w:r>
+            <w:r>
+              <w:rPr>
+                <w:sz w:val="18"/>
+                <w:szCs w:val="18"/>
+              </w:rPr>
+              <w:t xml:space="preserve"> (role at the time), </w:t>
+            </w:r>
+            <w:r>
+              <w:rPr>
+                <w:rFonts w:ascii="Consolas" w:cs="Consolas" w:eastAsia="Consolas" w:hAnsi="Consolas"/>
+                <w:sz w:val="18"/>
+                <w:szCs w:val="18"/>
+              </w:rPr>
+              <w:t xml:space="preserve">CaseEvidence</w:t>
+            </w:r>
+            <w:r>
+              <w:rPr>
+                <w:sz w:val="18"/>
+                <w:szCs w:val="18"/>
+              </w:rPr>
+              <w:t xml:space="preserve"> (snapshot), </w:t>
+            </w:r>
+            <w:r>
+              <w:rPr>
+                <w:rFonts w:ascii="Consolas" w:cs="Consolas" w:eastAsia="Consolas" w:hAnsi="Consolas"/>
+                <w:sz w:val="18"/>
+                <w:szCs w:val="18"/>
+              </w:rPr>
+              <w:t xml:space="preserve">PromiseToPay</w:t>
+            </w:r>
+          </w:p>
+        </w:tc>
+      </w:tr>
+      <w:tr>
+        <w:trPr>
+          <w:tblHeader w:val="false"/>
+        </w:trPr>
+        <w:tc>
+          <w:tcPr>
+            <w:tcW w:type="dxa" w:w="1805"/>
+            <w:tcBorders>
+              <w:top w:val="single" w:color="9AA9B8" w:sz="4"/>
+              <w:left w:val="single" w:color="9AA9B8" w:sz="4"/>
+              <w:bottom w:val="single" w:color="9AA9B8" w:sz="4"/>
+              <w:right w:val="single" w:color="9AA9B8" w:sz="4"/>
+            </w:tcBorders>
+            <w:tcMar>
+              <w:top w:type="dxa" w:w="50"/>
+              <w:left w:type="dxa" w:w="90"/>
+              <w:bottom w:type="dxa" w:w="50"/>
+              <w:right w:type="dxa" w:w="90"/>
+            </w:tcMar>
+          </w:tcPr>
+          <w:p>
+            <w:r>
+              <w:rPr>
+                <w:sz w:val="18"/>
+                <w:szCs w:val="18"/>
+              </w:rPr>
+              <w:t xml:space="preserve">Type-only subclasses</w:t>
+            </w:r>
+          </w:p>
+        </w:tc>
+        <w:tc>
+          <w:tcPr>
+            <w:tcW w:type="dxa" w:w="451"/>
+            <w:tcBorders>
+              <w:top w:val="single" w:color="9AA9B8" w:sz="4"/>
+              <w:left w:val="single" w:color="9AA9B8" w:sz="4"/>
+              <w:bottom w:val="single" w:color="9AA9B8" w:sz="4"/>
+              <w:right w:val="single" w:color="9AA9B8" w:sz="4"/>
+            </w:tcBorders>
+            <w:tcMar>
+              <w:top w:type="dxa" w:w="50"/>
+              <w:left w:type="dxa" w:w="90"/>
+              <w:bottom w:type="dxa" w:w="50"/>
+              <w:right w:type="dxa" w:w="90"/>
+            </w:tcMar>
+          </w:tcPr>
+          <w:p>
+            <w:r>
+              <w:rPr>
+                <w:sz w:val="18"/>
+                <w:szCs w:val="18"/>
+              </w:rPr>
+              <w:t xml:space="preserve">3</w:t>
+            </w:r>
+          </w:p>
+        </w:tc>
+        <w:tc>
+          <w:tcPr>
+            <w:tcW w:type="dxa" w:w="3384"/>
+            <w:tcBorders>
+              <w:top w:val="single" w:color="9AA9B8" w:sz="4"/>
+              <w:left w:val="single" w:color="9AA9B8" w:sz="4"/>
+              <w:bottom w:val="single" w:color="9AA9B8" w:sz="4"/>
+              <w:right w:val="single" w:color="9AA9B8" w:sz="4"/>
+            </w:tcBorders>
+            <w:tcMar>
+              <w:top w:type="dxa" w:w="50"/>
+              <w:left w:type="dxa" w:w="90"/>
+              <w:bottom w:type="dxa" w:w="50"/>
+              <w:right w:type="dxa" w:w="90"/>
+            </w:tcMar>
+          </w:tcPr>
+          <w:p>
+            <w:r>
+              <w:rPr>
+                <w:sz w:val="18"/>
+                <w:szCs w:val="18"/>
+              </w:rPr>
+              <w:t xml:space="preserve">Little or no data of their own; kept for a stated reason</w:t>
+            </w:r>
+          </w:p>
+        </w:tc>
+        <w:tc>
+          <w:tcPr>
+            <w:tcW w:type="dxa" w:w="3386"/>
+            <w:tcBorders>
+              <w:top w:val="single" w:color="9AA9B8" w:sz="4"/>
+              <w:left w:val="single" w:color="9AA9B8" w:sz="4"/>
+              <w:bottom w:val="single" w:color="9AA9B8" w:sz="4"/>
+              <w:right w:val="single" w:color="9AA9B8" w:sz="4"/>
+            </w:tcBorders>
+            <w:tcMar>
+              <w:top w:type="dxa" w:w="50"/>
+              <w:left w:type="dxa" w:w="90"/>
+              <w:bottom w:type="dxa" w:w="50"/>
+              <w:right w:type="dxa" w:w="90"/>
+            </w:tcMar>
+          </w:tcPr>
+          <w:p>
+            <w:r>
+              <w:rPr>
+                <w:sz w:val="18"/>
+                <w:szCs w:val="18"/>
+              </w:rPr>
+              <w:t xml:space="preserve">see below</w:t>
+            </w:r>
+          </w:p>
+        </w:tc>
+      </w:tr>
+    </w:tbl>
+    <w:p>
+      <w:pPr>
+        <w:spacing w:after="60"/>
+      </w:pPr>
+    </w:p>
+    <w:p>
+      <w:r>
+        <w:rPr>
+          <w:b/>
+          <w:bCs/>
+        </w:rPr>
+        <w:t xml:space="preserve">The three small subclasses, and why they stay:</w:t>
+      </w:r>
+    </w:p>
+    <w:p>
+      <w:r>
+        <w:t xml:space="preserve">- </w:t>
+      </w:r>
+      <w:r>
+        <w:rPr>
+          <w:b/>
+          <w:bCs/>
+        </w:rPr>
+        <w:t xml:space="preserve">`LoanTransaction`</w:t>
+      </w:r>
+      <w:r>
+        <w:t xml:space="preserve"> (adds only </w:t>
+      </w:r>
+      <w:r>
+        <w:rPr>
+          <w:rFonts w:ascii="Consolas" w:cs="Consolas" w:eastAsia="Consolas" w:hAnsi="Consolas"/>
+          <w:sz w:val="19"/>
+          <w:szCs w:val="19"/>
+        </w:rPr>
+        <w:t xml:space="preserve">agreement</w:t>
+      </w:r>
+      <w:r>
+        <w:t xml:space="preserve">): the abstract parent that groups disbursement, repayment and interest capitalisation, so "every movement on this loan" is one query and the agreement link is declared once.</w:t>
+      </w:r>
+    </w:p>
+    <w:p>
+      <w:r>
+        <w:t xml:space="preserve">- </w:t>
+      </w:r>
+      <w:r>
+        <w:rPr>
+          <w:b/>
+          <w:bCs/>
+        </w:rPr>
+        <w:t xml:space="preserve">`Complaint`</w:t>
+      </w:r>
+      <w:r>
+        <w:t xml:space="preserve"> (adds </w:t>
+      </w:r>
+      <w:r>
+        <w:rPr>
+          <w:rFonts w:ascii="Consolas" w:cs="Consolas" w:eastAsia="Consolas" w:hAnsi="Consolas"/>
+          <w:sz w:val="19"/>
+          <w:szCs w:val="19"/>
+        </w:rPr>
+        <w:t xml:space="preserve">category</w:t>
+      </w:r>
+      <w:r>
+        <w:t xml:space="preserve">): a complaint is a different customer case from a dispute or a service request, with its own reference series (</w:t>
+      </w:r>
+      <w:r>
+        <w:rPr>
+          <w:rFonts w:ascii="Consolas" w:cs="Consolas" w:eastAsia="Consolas" w:hAnsi="Consolas"/>
+          <w:sz w:val="19"/>
+          <w:szCs w:val="19"/>
+        </w:rPr>
+        <w:t xml:space="preserve">CMP-</w:t>
+      </w:r>
+      <w:r>
+        <w:t xml:space="preserve">), and it is counted and reported separately.</w:t>
+      </w:r>
+    </w:p>
+    <w:p>
+      <w:r>
+        <w:t xml:space="preserve">- </w:t>
+      </w:r>
+      <w:r>
+        <w:rPr>
+          <w:b/>
+          <w:bCs/>
+        </w:rPr>
+        <w:t xml:space="preserve">`ComplianceInvestigation`</w:t>
+      </w:r>
+      <w:r>
+        <w:t xml:space="preserve"> (no own fields): a risk case opened by compliance staff rather than by a monitoring rule. Unlike </w:t>
+      </w:r>
+      <w:r>
+        <w:rPr>
+          <w:rFonts w:ascii="Consolas" w:cs="Consolas" w:eastAsia="Consolas" w:hAnsi="Consolas"/>
+          <w:sz w:val="19"/>
+          <w:szCs w:val="19"/>
+        </w:rPr>
+        <w:t xml:space="preserve">FraudAlert</w:t>
+      </w:r>
+      <w:r>
+        <w:t xml:space="preserve">, it has no triggering rule or transaction, which is exactly why it is a sibling and not a subclass. It keeps its own reference series (</w:t>
+      </w:r>
+      <w:r>
+        <w:rPr>
+          <w:rFonts w:ascii="Consolas" w:cs="Consolas" w:eastAsia="Consolas" w:hAnsi="Consolas"/>
+          <w:sz w:val="19"/>
+          <w:szCs w:val="19"/>
+        </w:rPr>
+        <w:t xml:space="preserve">CMPL-</w:t>
+      </w:r>
+      <w:r>
+        <w:t xml:space="preserve">).</w:t>
+      </w:r>
+    </w:p>
+    <w:p>
+      <w:r>
+        <w:rPr>
+          <w:b/>
+          <w:bCs/>
+        </w:rPr>
+        <w:t xml:space="preserve">The strict count:</w:t>
+      </w:r>
+      <w:r>
+        <w:t xml:space="preserve"> even counting only the 48 classes with their own behaviour, the model is well above the brief's minimum of 30. The record classes are what keep history meaningful (the brief's common rule on historical records), so they are counted as meaningful too, but they are not needed to pass the threshold.</w:t>
       </w:r>
     </w:p>
     <w:p>

</xml_diff>

<commit_message>
Step 10: save and load the whole bank as JSON
- Repository (abstract: shared JSON format, save/load template methods)
  -> JsonFileRepository / MemoryRepository; links saved as references,
  dates/Decimals/tuples/frozensets typed, lifecycles saved by name,
  reference counters restored; iterative encoding (no deep recursion)
- 4 tests (77 in total): exact round trip of all 1,366 demo objects,
  history kept, loaded bank carries on, file repository
- CLI --save FILE / --load FILE; GUI Save and Open in the top bar;
  smoke test saves, changes and reopens the bank
- Report 5.2 and limitations, counts (80 classes: 71 business + 9
  supporting; 77 tests) across README, checklist, code review, viva notes,
  decks, flowchart 1 and the progress speech; diagrams and screenshots
  regenerated

Co-Authored-By: Claude Opus 5.5 <noreply@anthropic.com>
Claude-Session: https://claude.ai/code/session_01SahYJB3mwF36eBHRbWfj6o
</commit_message>
<xml_diff>
--- a/docs/Design_Report.docx
+++ b/docs/Design_Report.docx
@@ -299,7 +299,7 @@
           <w:sz w:val="18"/>
           <w:szCs w:val="18"/>
         </w:rPr>
-        <w:t xml:space="preserve">python banking_system.py --test       # run the 73 automated tests</w:t>
+        <w:t xml:space="preserve">python banking_system.py --test       # run the 77 automated tests</w:t>
       </w:r>
     </w:p>
     <w:p>
@@ -720,7 +720,7 @@
                 <w:sz w:val="18"/>
                 <w:szCs w:val="18"/>
               </w:rPr>
-              <w:t xml:space="preserve"> (71 business classes plus 6 supporting, 98 operations, 80 of them state-changing commands)</w:t>
+              <w:t xml:space="preserve"> (71 business classes plus 9 supporting, 98 operations, 80 of them state-changing commands)</w:t>
             </w:r>
           </w:p>
         </w:tc>
@@ -1276,7 +1276,7 @@
         <w:t xml:space="preserve">Implementation.</w:t>
       </w:r>
       <w:r>
-        <w:t xml:space="preserve"> One file, standard library only: 71 business classes (plus 6 supporting), 98 operations (80 change state), 73 automated tests, a double-entry ledger whose trial balance is always zero.</w:t>
+        <w:t xml:space="preserve"> One file, standard library only: 71 business classes (plus 9 supporting), 98 operations (80 change state), 77 automated tests, a double-entry ledger whose trial balance is always zero.</w:t>
       </w:r>
     </w:p>
     <w:p>
@@ -1448,7 +1448,7 @@
         <w:t xml:space="preserve">Limitations.</w:t>
       </w:r>
       <w:r>
-        <w:t xml:space="preserve"> A single currency, in-memory storage, simplified interest, two-signatory dual control only. Growing larger would need a database, concurrency control, multiple currencies and configurable approval rules; section 10 maps each change to the classes it affects.</w:t>
+        <w:t xml:space="preserve"> A single currency, saving only as one whole JSON file, simplified interest, two-signatory dual control only. Growing larger would need a database, concurrency control, multiple currencies and configurable approval rules; section 10 maps each change to the classes it affects.</w:t>
       </w:r>
     </w:p>
     <w:p>
@@ -21949,7 +21949,7 @@
         <w:t xml:space="preserve">Automated tests.</w:t>
       </w:r>
       <w:r>
-        <w:t xml:space="preserve"> 73 independent tests (</w:t>
+        <w:t xml:space="preserve"> 77 independent tests (</w:t>
       </w:r>
       <w:r>
         <w:rPr>
@@ -22867,6 +22867,583 @@
     </w:p>
     <w:p>
       <w:pPr>
+        <w:pStyle w:val="Heading2"/>
+      </w:pPr>
+      <w:r>
+        <w:t xml:space="preserve">5.2 Saving and loading the whole bank (files and JSON)</w:t>
+      </w:r>
+    </w:p>
+    <w:p>
+      <w:r>
+        <w:rPr>
+          <w:rFonts w:ascii="Consolas" w:cs="Consolas" w:eastAsia="Consolas" w:hAnsi="Consolas"/>
+          <w:sz w:val="19"/>
+          <w:szCs w:val="19"/>
+        </w:rPr>
+        <w:t xml:space="preserve">Repository</w:t>
+      </w:r>
+      <w:r>
+        <w:t xml:space="preserve"> (a small supporting hierarchy, not one of the four banking hierarchies) saves the entire bank as JSON text and loads it back exactly: every object and its full history, including status histories, versions and the audit log. A saved bank carries on where it stopped: new reference numbers continue from the saved counters, and the lifecycles still refuse illegal moves.</w:t>
+      </w:r>
+    </w:p>
+    <w:tbl>
+      <w:tblPr>
+        <w:tblW w:type="dxa" w:w="9026"/>
+        <w:tblBorders>
+          <w:top w:val="single" w:color="auto" w:sz="4"/>
+          <w:left w:val="single" w:color="auto" w:sz="4"/>
+          <w:bottom w:val="single" w:color="auto" w:sz="4"/>
+          <w:right w:val="single" w:color="auto" w:sz="4"/>
+          <w:insideH w:val="single" w:color="auto" w:sz="4"/>
+          <w:insideV w:val="single" w:color="auto" w:sz="4"/>
+        </w:tblBorders>
+      </w:tblPr>
+      <w:tblGrid>
+        <w:gridCol w:w="1941"/>
+        <w:gridCol w:w="1261"/>
+        <w:gridCol w:w="5824"/>
+      </w:tblGrid>
+      <w:tr>
+        <w:trPr>
+          <w:tblHeader/>
+        </w:trPr>
+        <w:tc>
+          <w:tcPr>
+            <w:tcW w:type="dxa" w:w="1941"/>
+            <w:tcBorders>
+              <w:top w:val="single" w:color="9AA9B8" w:sz="4"/>
+              <w:left w:val="single" w:color="9AA9B8" w:sz="4"/>
+              <w:bottom w:val="single" w:color="9AA9B8" w:sz="4"/>
+              <w:right w:val="single" w:color="9AA9B8" w:sz="4"/>
+            </w:tcBorders>
+            <w:shd w:fill="DDE7F0" w:color="auto" w:val="clear"/>
+            <w:tcMar>
+              <w:top w:type="dxa" w:w="50"/>
+              <w:left w:type="dxa" w:w="90"/>
+              <w:bottom w:type="dxa" w:w="50"/>
+              <w:right w:type="dxa" w:w="90"/>
+            </w:tcMar>
+          </w:tcPr>
+          <w:p>
+            <w:r>
+              <w:rPr>
+                <w:b/>
+                <w:bCs/>
+                <w:sz w:val="18"/>
+                <w:szCs w:val="18"/>
+              </w:rPr>
+              <w:t xml:space="preserve">Class</w:t>
+            </w:r>
+          </w:p>
+        </w:tc>
+        <w:tc>
+          <w:tcPr>
+            <w:tcW w:type="dxa" w:w="1261"/>
+            <w:tcBorders>
+              <w:top w:val="single" w:color="9AA9B8" w:sz="4"/>
+              <w:left w:val="single" w:color="9AA9B8" w:sz="4"/>
+              <w:bottom w:val="single" w:color="9AA9B8" w:sz="4"/>
+              <w:right w:val="single" w:color="9AA9B8" w:sz="4"/>
+            </w:tcBorders>
+            <w:shd w:fill="DDE7F0" w:color="auto" w:val="clear"/>
+            <w:tcMar>
+              <w:top w:type="dxa" w:w="50"/>
+              <w:left w:type="dxa" w:w="90"/>
+              <w:bottom w:type="dxa" w:w="50"/>
+              <w:right w:type="dxa" w:w="90"/>
+            </w:tcMar>
+          </w:tcPr>
+          <w:p>
+            <w:r>
+              <w:rPr>
+                <w:b/>
+                <w:bCs/>
+                <w:sz w:val="18"/>
+                <w:szCs w:val="18"/>
+              </w:rPr>
+              <w:t xml:space="preserve">Inherits from</w:t>
+            </w:r>
+          </w:p>
+        </w:tc>
+        <w:tc>
+          <w:tcPr>
+            <w:tcW w:type="dxa" w:w="5824"/>
+            <w:tcBorders>
+              <w:top w:val="single" w:color="9AA9B8" w:sz="4"/>
+              <w:left w:val="single" w:color="9AA9B8" w:sz="4"/>
+              <w:bottom w:val="single" w:color="9AA9B8" w:sz="4"/>
+              <w:right w:val="single" w:color="9AA9B8" w:sz="4"/>
+            </w:tcBorders>
+            <w:shd w:fill="DDE7F0" w:color="auto" w:val="clear"/>
+            <w:tcMar>
+              <w:top w:type="dxa" w:w="50"/>
+              <w:left w:type="dxa" w:w="90"/>
+              <w:bottom w:type="dxa" w:w="50"/>
+              <w:right w:type="dxa" w:w="90"/>
+            </w:tcMar>
+          </w:tcPr>
+          <w:p>
+            <w:r>
+              <w:rPr>
+                <w:b/>
+                <w:bCs/>
+                <w:sz w:val="18"/>
+                <w:szCs w:val="18"/>
+              </w:rPr>
+              <w:t xml:space="preserve">What the level adds</w:t>
+            </w:r>
+          </w:p>
+        </w:tc>
+      </w:tr>
+      <w:tr>
+        <w:trPr>
+          <w:tblHeader w:val="false"/>
+        </w:trPr>
+        <w:tc>
+          <w:tcPr>
+            <w:tcW w:type="dxa" w:w="1941"/>
+            <w:tcBorders>
+              <w:top w:val="single" w:color="9AA9B8" w:sz="4"/>
+              <w:left w:val="single" w:color="9AA9B8" w:sz="4"/>
+              <w:bottom w:val="single" w:color="9AA9B8" w:sz="4"/>
+              <w:right w:val="single" w:color="9AA9B8" w:sz="4"/>
+            </w:tcBorders>
+            <w:tcMar>
+              <w:top w:type="dxa" w:w="50"/>
+              <w:left w:type="dxa" w:w="90"/>
+              <w:bottom w:type="dxa" w:w="50"/>
+              <w:right w:type="dxa" w:w="90"/>
+            </w:tcMar>
+          </w:tcPr>
+          <w:p>
+            <w:r>
+              <w:rPr>
+                <w:rFonts w:ascii="Consolas" w:cs="Consolas" w:eastAsia="Consolas" w:hAnsi="Consolas"/>
+                <w:sz w:val="18"/>
+                <w:szCs w:val="18"/>
+              </w:rPr>
+              <w:t xml:space="preserve">Repository</w:t>
+            </w:r>
+          </w:p>
+        </w:tc>
+        <w:tc>
+          <w:tcPr>
+            <w:tcW w:type="dxa" w:w="1261"/>
+            <w:tcBorders>
+              <w:top w:val="single" w:color="9AA9B8" w:sz="4"/>
+              <w:left w:val="single" w:color="9AA9B8" w:sz="4"/>
+              <w:bottom w:val="single" w:color="9AA9B8" w:sz="4"/>
+              <w:right w:val="single" w:color="9AA9B8" w:sz="4"/>
+            </w:tcBorders>
+            <w:tcMar>
+              <w:top w:type="dxa" w:w="50"/>
+              <w:left w:type="dxa" w:w="90"/>
+              <w:bottom w:type="dxa" w:w="50"/>
+              <w:right w:type="dxa" w:w="90"/>
+            </w:tcMar>
+          </w:tcPr>
+          <w:p>
+            <w:r>
+              <w:rPr>
+                <w:sz w:val="18"/>
+                <w:szCs w:val="18"/>
+              </w:rPr>
+              <w:t xml:space="preserve">(abstract)</w:t>
+            </w:r>
+          </w:p>
+        </w:tc>
+        <w:tc>
+          <w:tcPr>
+            <w:tcW w:type="dxa" w:w="5824"/>
+            <w:tcBorders>
+              <w:top w:val="single" w:color="9AA9B8" w:sz="4"/>
+              <w:left w:val="single" w:color="9AA9B8" w:sz="4"/>
+              <w:bottom w:val="single" w:color="9AA9B8" w:sz="4"/>
+              <w:right w:val="single" w:color="9AA9B8" w:sz="4"/>
+            </w:tcBorders>
+            <w:tcMar>
+              <w:top w:type="dxa" w:w="50"/>
+              <w:left w:type="dxa" w:w="90"/>
+              <w:bottom w:type="dxa" w:w="50"/>
+              <w:right w:type="dxa" w:w="90"/>
+            </w:tcMar>
+          </w:tcPr>
+          <w:p>
+            <w:r>
+              <w:rPr>
+                <w:sz w:val="18"/>
+                <w:szCs w:val="18"/>
+              </w:rPr>
+              <w:t xml:space="preserve">The JSON format, shared by every repository: </w:t>
+            </w:r>
+            <w:r>
+              <w:rPr>
+                <w:rFonts w:ascii="Consolas" w:cs="Consolas" w:eastAsia="Consolas" w:hAnsi="Consolas"/>
+                <w:sz w:val="18"/>
+                <w:szCs w:val="18"/>
+              </w:rPr>
+              <w:t xml:space="preserve">save()</w:t>
+            </w:r>
+            <w:r>
+              <w:rPr>
+                <w:sz w:val="18"/>
+                <w:szCs w:val="18"/>
+              </w:rPr>
+              <w:t xml:space="preserve"> and </w:t>
+            </w:r>
+            <w:r>
+              <w:rPr>
+                <w:rFonts w:ascii="Consolas" w:cs="Consolas" w:eastAsia="Consolas" w:hAnsi="Consolas"/>
+                <w:sz w:val="18"/>
+                <w:szCs w:val="18"/>
+              </w:rPr>
+              <w:t xml:space="preserve">load()</w:t>
+            </w:r>
+            <w:r>
+              <w:rPr>
+                <w:sz w:val="18"/>
+                <w:szCs w:val="18"/>
+              </w:rPr>
+              <w:t xml:space="preserve"> as template methods; </w:t>
+            </w:r>
+            <w:r>
+              <w:rPr>
+                <w:rFonts w:ascii="Consolas" w:cs="Consolas" w:eastAsia="Consolas" w:hAnsi="Consolas"/>
+                <w:sz w:val="18"/>
+                <w:szCs w:val="18"/>
+              </w:rPr>
+              <w:t xml:space="preserve">encode()</w:t>
+            </w:r>
+            <w:r>
+              <w:rPr>
+                <w:sz w:val="18"/>
+                <w:szCs w:val="18"/>
+              </w:rPr>
+              <w:t xml:space="preserve"> and </w:t>
+            </w:r>
+            <w:r>
+              <w:rPr>
+                <w:rFonts w:ascii="Consolas" w:cs="Consolas" w:eastAsia="Consolas" w:hAnsi="Consolas"/>
+                <w:sz w:val="18"/>
+                <w:szCs w:val="18"/>
+              </w:rPr>
+              <w:t xml:space="preserve">decode()</w:t>
+            </w:r>
+          </w:p>
+        </w:tc>
+      </w:tr>
+      <w:tr>
+        <w:trPr>
+          <w:tblHeader w:val="false"/>
+        </w:trPr>
+        <w:tc>
+          <w:tcPr>
+            <w:tcW w:type="dxa" w:w="1941"/>
+            <w:tcBorders>
+              <w:top w:val="single" w:color="9AA9B8" w:sz="4"/>
+              <w:left w:val="single" w:color="9AA9B8" w:sz="4"/>
+              <w:bottom w:val="single" w:color="9AA9B8" w:sz="4"/>
+              <w:right w:val="single" w:color="9AA9B8" w:sz="4"/>
+            </w:tcBorders>
+            <w:tcMar>
+              <w:top w:type="dxa" w:w="50"/>
+              <w:left w:type="dxa" w:w="90"/>
+              <w:bottom w:type="dxa" w:w="50"/>
+              <w:right w:type="dxa" w:w="90"/>
+            </w:tcMar>
+          </w:tcPr>
+          <w:p>
+            <w:r>
+              <w:rPr>
+                <w:rFonts w:ascii="Consolas" w:cs="Consolas" w:eastAsia="Consolas" w:hAnsi="Consolas"/>
+                <w:sz w:val="18"/>
+                <w:szCs w:val="18"/>
+              </w:rPr>
+              <w:t xml:space="preserve">JsonFileRepository</w:t>
+            </w:r>
+          </w:p>
+        </w:tc>
+        <w:tc>
+          <w:tcPr>
+            <w:tcW w:type="dxa" w:w="1261"/>
+            <w:tcBorders>
+              <w:top w:val="single" w:color="9AA9B8" w:sz="4"/>
+              <w:left w:val="single" w:color="9AA9B8" w:sz="4"/>
+              <w:bottom w:val="single" w:color="9AA9B8" w:sz="4"/>
+              <w:right w:val="single" w:color="9AA9B8" w:sz="4"/>
+            </w:tcBorders>
+            <w:tcMar>
+              <w:top w:type="dxa" w:w="50"/>
+              <w:left w:type="dxa" w:w="90"/>
+              <w:bottom w:type="dxa" w:w="50"/>
+              <w:right w:type="dxa" w:w="90"/>
+            </w:tcMar>
+          </w:tcPr>
+          <w:p>
+            <w:r>
+              <w:rPr>
+                <w:rFonts w:ascii="Consolas" w:cs="Consolas" w:eastAsia="Consolas" w:hAnsi="Consolas"/>
+                <w:sz w:val="18"/>
+                <w:szCs w:val="18"/>
+              </w:rPr>
+              <w:t xml:space="preserve">Repository</w:t>
+            </w:r>
+          </w:p>
+        </w:tc>
+        <w:tc>
+          <w:tcPr>
+            <w:tcW w:type="dxa" w:w="5824"/>
+            <w:tcBorders>
+              <w:top w:val="single" w:color="9AA9B8" w:sz="4"/>
+              <w:left w:val="single" w:color="9AA9B8" w:sz="4"/>
+              <w:bottom w:val="single" w:color="9AA9B8" w:sz="4"/>
+              <w:right w:val="single" w:color="9AA9B8" w:sz="4"/>
+            </w:tcBorders>
+            <w:tcMar>
+              <w:top w:type="dxa" w:w="50"/>
+              <w:left w:type="dxa" w:w="90"/>
+              <w:bottom w:type="dxa" w:w="50"/>
+              <w:right w:type="dxa" w:w="90"/>
+            </w:tcMar>
+          </w:tcPr>
+          <w:p>
+            <w:r>
+              <w:rPr>
+                <w:sz w:val="18"/>
+                <w:szCs w:val="18"/>
+              </w:rPr>
+              <w:t xml:space="preserve">Keeps the text in a file on disk</w:t>
+            </w:r>
+          </w:p>
+        </w:tc>
+      </w:tr>
+      <w:tr>
+        <w:trPr>
+          <w:tblHeader w:val="false"/>
+        </w:trPr>
+        <w:tc>
+          <w:tcPr>
+            <w:tcW w:type="dxa" w:w="1941"/>
+            <w:tcBorders>
+              <w:top w:val="single" w:color="9AA9B8" w:sz="4"/>
+              <w:left w:val="single" w:color="9AA9B8" w:sz="4"/>
+              <w:bottom w:val="single" w:color="9AA9B8" w:sz="4"/>
+              <w:right w:val="single" w:color="9AA9B8" w:sz="4"/>
+            </w:tcBorders>
+            <w:tcMar>
+              <w:top w:type="dxa" w:w="50"/>
+              <w:left w:type="dxa" w:w="90"/>
+              <w:bottom w:type="dxa" w:w="50"/>
+              <w:right w:type="dxa" w:w="90"/>
+            </w:tcMar>
+          </w:tcPr>
+          <w:p>
+            <w:r>
+              <w:rPr>
+                <w:rFonts w:ascii="Consolas" w:cs="Consolas" w:eastAsia="Consolas" w:hAnsi="Consolas"/>
+                <w:sz w:val="18"/>
+                <w:szCs w:val="18"/>
+              </w:rPr>
+              <w:t xml:space="preserve">MemoryRepository</w:t>
+            </w:r>
+          </w:p>
+        </w:tc>
+        <w:tc>
+          <w:tcPr>
+            <w:tcW w:type="dxa" w:w="1261"/>
+            <w:tcBorders>
+              <w:top w:val="single" w:color="9AA9B8" w:sz="4"/>
+              <w:left w:val="single" w:color="9AA9B8" w:sz="4"/>
+              <w:bottom w:val="single" w:color="9AA9B8" w:sz="4"/>
+              <w:right w:val="single" w:color="9AA9B8" w:sz="4"/>
+            </w:tcBorders>
+            <w:tcMar>
+              <w:top w:type="dxa" w:w="50"/>
+              <w:left w:type="dxa" w:w="90"/>
+              <w:bottom w:type="dxa" w:w="50"/>
+              <w:right w:type="dxa" w:w="90"/>
+            </w:tcMar>
+          </w:tcPr>
+          <w:p>
+            <w:r>
+              <w:rPr>
+                <w:rFonts w:ascii="Consolas" w:cs="Consolas" w:eastAsia="Consolas" w:hAnsi="Consolas"/>
+                <w:sz w:val="18"/>
+                <w:szCs w:val="18"/>
+              </w:rPr>
+              <w:t xml:space="preserve">Repository</w:t>
+            </w:r>
+          </w:p>
+        </w:tc>
+        <w:tc>
+          <w:tcPr>
+            <w:tcW w:type="dxa" w:w="5824"/>
+            <w:tcBorders>
+              <w:top w:val="single" w:color="9AA9B8" w:sz="4"/>
+              <w:left w:val="single" w:color="9AA9B8" w:sz="4"/>
+              <w:bottom w:val="single" w:color="9AA9B8" w:sz="4"/>
+              <w:right w:val="single" w:color="9AA9B8" w:sz="4"/>
+            </w:tcBorders>
+            <w:tcMar>
+              <w:top w:type="dxa" w:w="50"/>
+              <w:left w:type="dxa" w:w="90"/>
+              <w:bottom w:type="dxa" w:w="50"/>
+              <w:right w:type="dxa" w:w="90"/>
+            </w:tcMar>
+          </w:tcPr>
+          <w:p>
+            <w:r>
+              <w:rPr>
+                <w:sz w:val="18"/>
+                <w:szCs w:val="18"/>
+              </w:rPr>
+              <w:t xml:space="preserve">Keeps the text in memory, so the tests need no files</w:t>
+            </w:r>
+          </w:p>
+        </w:tc>
+      </w:tr>
+    </w:tbl>
+    <w:p>
+      <w:pPr>
+        <w:spacing w:after="60"/>
+      </w:pPr>
+    </w:p>
+    <w:p>
+      <w:r>
+        <w:rPr>
+          <w:b/>
+          <w:bCs/>
+        </w:rPr>
+        <w:t xml:space="preserve">How the format works.</w:t>
+      </w:r>
+      <w:r>
+        <w:t xml:space="preserve"> Each object is saved once, as its class name and its fields. A link to another object is saved as </w:t>
+      </w:r>
+      <w:r>
+        <w:rPr>
+          <w:rFonts w:ascii="Consolas" w:cs="Consolas" w:eastAsia="Consolas" w:hAnsi="Consolas"/>
+          <w:sz w:val="19"/>
+          <w:szCs w:val="19"/>
+        </w:rPr>
+        <w:t xml:space="preserve">{"$ref": n}</w:t>
+      </w:r>
+      <w:r>
+        <w:t xml:space="preserve">, so an object shared by several records (an employee who approved many payments, for example) is still one object after loading, and links in both directions are no problem. Dates and Decimal amounts keep their types (</w:t>
+      </w:r>
+      <w:r>
+        <w:rPr>
+          <w:rFonts w:ascii="Consolas" w:cs="Consolas" w:eastAsia="Consolas" w:hAnsi="Consolas"/>
+          <w:sz w:val="19"/>
+          <w:szCs w:val="19"/>
+        </w:rPr>
+        <w:t xml:space="preserve">{"$date": ...}</w:t>
+      </w:r>
+      <w:r>
+        <w:t xml:space="preserve">, </w:t>
+      </w:r>
+      <w:r>
+        <w:rPr>
+          <w:rFonts w:ascii="Consolas" w:cs="Consolas" w:eastAsia="Consolas" w:hAnsi="Consolas"/>
+          <w:sz w:val="19"/>
+          <w:szCs w:val="19"/>
+        </w:rPr>
+        <w:t xml:space="preserve">{"$dec": ...}</w:t>
+      </w:r>
+      <w:r>
+        <w:t xml:space="preserve">). A lifecycle is saved by its name (for example </w:t>
+      </w:r>
+      <w:r>
+        <w:rPr>
+          <w:rFonts w:ascii="Consolas" w:cs="Consolas" w:eastAsia="Consolas" w:hAnsi="Consolas"/>
+          <w:sz w:val="19"/>
+          <w:szCs w:val="19"/>
+        </w:rPr>
+        <w:t xml:space="preserve">TransferPayment.LIFECYCLE</w:t>
+      </w:r>
+      <w:r>
+        <w:t xml:space="preserve">), because it is part of the class, not data. Encoding is iterative, not recursive, so long chains of linked records cannot exceed Python's recursion limit.</w:t>
+      </w:r>
+    </w:p>
+    <w:p>
+      <w:r>
+        <w:rPr>
+          <w:b/>
+          <w:bCs/>
+        </w:rPr>
+        <w:t xml:space="preserve">Why a hierarchy.</w:t>
+      </w:r>
+      <w:r>
+        <w:t xml:space="preserve"> What changes between repositories is only </w:t>
+      </w:r>
+      <w:r>
+        <w:rPr>
+          <w:i/>
+          <w:iCs/>
+        </w:rPr>
+        <w:t xml:space="preserve">where</w:t>
+      </w:r>
+      <w:r>
+        <w:t xml:space="preserve"> the text is kept; the format must be identical, or a bank saved by one could not be read by another. So the format lives once in the parent, and each subclass implements two small methods (</w:t>
+      </w:r>
+      <w:r>
+        <w:rPr>
+          <w:rFonts w:ascii="Consolas" w:cs="Consolas" w:eastAsia="Consolas" w:hAnsi="Consolas"/>
+          <w:sz w:val="19"/>
+          <w:szCs w:val="19"/>
+        </w:rPr>
+        <w:t xml:space="preserve">_write</w:t>
+      </w:r>
+      <w:r>
+        <w:t xml:space="preserve">, </w:t>
+      </w:r>
+      <w:r>
+        <w:rPr>
+          <w:rFonts w:ascii="Consolas" w:cs="Consolas" w:eastAsia="Consolas" w:hAnsi="Consolas"/>
+          <w:sz w:val="19"/>
+          <w:szCs w:val="19"/>
+        </w:rPr>
+        <w:t xml:space="preserve">_read</w:t>
+      </w:r>
+      <w:r>
+        <w:t xml:space="preserve">). A database repository would be a third subclass.</w:t>
+      </w:r>
+    </w:p>
+    <w:p>
+      <w:r>
+        <w:rPr>
+          <w:b/>
+          <w:bCs/>
+        </w:rPr>
+        <w:t xml:space="preserve">Proof.</w:t>
+      </w:r>
+      <w:r>
+        <w:t xml:space="preserve"> Four tests: saving a loaded bank gives byte-for-byte the same JSON (all 1,366 objects of the demo bank); the loaded bank keeps its balances and answers history questions (Bilal's mandate on 11 April 2026); it carries on (a new deposit posts under a new reference, and a destroyed card still cannot become active); and the file repository reads what it wrote and refuses a missing file. From the command line: </w:t>
+      </w:r>
+      <w:r>
+        <w:rPr>
+          <w:rFonts w:ascii="Consolas" w:cs="Consolas" w:eastAsia="Consolas" w:hAnsi="Consolas"/>
+          <w:sz w:val="19"/>
+          <w:szCs w:val="19"/>
+        </w:rPr>
+        <w:t xml:space="preserve">python banking_system.py --save bank.json</w:t>
+      </w:r>
+      <w:r>
+        <w:t xml:space="preserve"> and </w:t>
+      </w:r>
+      <w:r>
+        <w:rPr>
+          <w:rFonts w:ascii="Consolas" w:cs="Consolas" w:eastAsia="Consolas" w:hAnsi="Consolas"/>
+          <w:sz w:val="19"/>
+          <w:szCs w:val="19"/>
+        </w:rPr>
+        <w:t xml:space="preserve">--load bank.json</w:t>
+      </w:r>
+      <w:r>
+        <w:t xml:space="preserve">. In the GUI: Save and Open in the top bar.</w:t>
+      </w:r>
+    </w:p>
+    <w:p>
+      <w:pPr>
         <w:pStyle w:val="Heading1"/>
         <w:pageBreakBefore/>
       </w:pPr>
@@ -28546,7 +29123,18 @@
         <w:t xml:space="preserve">Chargeback</w:t>
       </w:r>
       <w:r>
-        <w:t xml:space="preserve">. Savings interest is a simple month-end calculation (no daily accrual, tax withholding or Islamic profit-sharing weights). A fixed review threshold rather than risk scoring. A small chart of accounts. In-memory storage only, with reference numbers held in a module-level counter. No concurrency or rollback across several objects. Simplified loan maths (equal principal, monthly interest on the outstanding balance, no penalty charges). Dual control supports exactly two signatories rather than configurable rules such as "any two of A, B, C". Two credit authority levels only. There is no authentication: the GUI's sign-in chooses a person without a password, each operation is told who is acting, and the model then checks that person's authority.</w:t>
+        <w:t xml:space="preserve">. Savings interest is a simple month-end calculation (no daily accrual, tax withholding or Islamic profit-sharing weights). A fixed review threshold rather than risk scoring. A small chart of accounts. The bank is saved and loaded as one whole JSON file (</w:t>
+      </w:r>
+      <w:r>
+        <w:rPr>
+          <w:rFonts w:ascii="Consolas" w:cs="Consolas" w:eastAsia="Consolas" w:hAnsi="Consolas"/>
+          <w:sz w:val="19"/>
+          <w:szCs w:val="19"/>
+        </w:rPr>
+        <w:t xml:space="preserve">Repository</w:t>
+      </w:r>
+      <w:r>
+        <w:t xml:space="preserve">, section 5.2): there is no database, so no partial updates, no concurrent users, and reference numbers come from a module-level counter that the file restores. No rollback across several objects. Simplified loan maths (equal principal, monthly interest on the outstanding balance, no penalty charges). Dual control supports exactly two signatories rather than configurable rules such as "any two of A, B, C". Two credit authority levels only. There is no authentication: the GUI's sign-in chooses a person without a password, each operation is told who is acting, and the model then checks that person's authority.</w:t>
       </w:r>
     </w:p>
     <w:p>

</xml_diff>